<commit_message>
with programmable readout timeout and fixed bug for event FULL_SIZE
Added programmable EVENT_TIMEOUT via register 6 and fixed field length of FULL_SIZE in DigiInterface/ROCFifoController
</commit_message>
<xml_diff>
--- a/commands_for_ROC_FW_timingconstrained.docx
+++ b/commands_for_ROC_FW_timingconstrained.docx
@@ -64,10 +64,16 @@
     </w:p>
     <w:p>
       <w:r>
-        <w:t>This document reports on features of the ROC Firmware released on 03/</w:t>
-      </w:r>
-      <w:r>
-        <w:t>28</w:t>
+        <w:t>This document reports on features of the ROC Firmware released on 0</w:t>
+      </w:r>
+      <w:r>
+        <w:t>5</w:t>
+      </w:r>
+      <w:r>
+        <w:t>/</w:t>
+      </w:r>
+      <w:r>
+        <w:t>04</w:t>
       </w:r>
       <w:r>
         <w:t>/2025 to “</w:t>
@@ -124,7 +130,19 @@
           <w:rPr>
             <w:rStyle w:val="Hyperlink"/>
           </w:rPr>
-          <w:t>new feature</w:t>
+          <w:t>ne</w:t>
+        </w:r>
+        <w:r>
+          <w:rPr>
+            <w:rStyle w:val="Hyperlink"/>
+          </w:rPr>
+          <w:t>w</w:t>
+        </w:r>
+        <w:r>
+          <w:rPr>
+            <w:rStyle w:val="Hyperlink"/>
+          </w:rPr>
+          <w:t xml:space="preserve"> feature</w:t>
         </w:r>
         <w:r>
           <w:rPr>
@@ -142,6 +160,23 @@
       <w:r>
         <w:t xml:space="preserve"> first available in this ROC_FW release</w:t>
       </w:r>
+    </w:p>
+    <w:p>
+      <w:pPr>
+        <w:pStyle w:val="ListParagraph"/>
+        <w:numPr>
+          <w:ilvl w:val="1"/>
+          <w:numId w:val="23"/>
+        </w:numPr>
+      </w:pPr>
+      <w:hyperlink w:anchor="timeout" w:history="1">
+        <w:r>
+          <w:rPr>
+            <w:rStyle w:val="Hyperlink"/>
+          </w:rPr>
+          <w:t>Programmable readout timeout</w:t>
+        </w:r>
+      </w:hyperlink>
     </w:p>
     <w:p>
       <w:pPr>
@@ -219,7 +254,19 @@
           <w:rPr>
             <w:rStyle w:val="Hyperlink"/>
           </w:rPr>
-          <w:t xml:space="preserve">SPI read/write </w:t>
+          <w:t>S</w:t>
+        </w:r>
+        <w:r>
+          <w:rPr>
+            <w:rStyle w:val="Hyperlink"/>
+          </w:rPr>
+          <w:t>P</w:t>
+        </w:r>
+        <w:r>
+          <w:rPr>
+            <w:rStyle w:val="Hyperlink"/>
+          </w:rPr>
+          <w:t xml:space="preserve">I read/write </w:t>
         </w:r>
         <w:r>
           <w:rPr>
@@ -435,13 +482,6 @@
         </w:rPr>
       </w:pPr>
       <w:bookmarkStart w:id="0" w:name="new"/>
-      <w:r>
-        <w:rPr>
-          <w:b/>
-          <w:bCs/>
-        </w:rPr>
-        <w:br w:type="page"/>
-      </w:r>
     </w:p>
     <w:p>
       <w:pPr>
@@ -457,24 +497,7 @@
             <w:b/>
             <w:bCs/>
           </w:rPr>
-          <w:t>New</w:t>
-        </w:r>
-        <w:r>
-          <w:rPr>
-            <w:rStyle w:val="Hyperlink"/>
-            <w:b/>
-            <w:bCs/>
-          </w:rPr>
-          <w:t xml:space="preserve"> features</w:t>
-        </w:r>
-        <w:bookmarkEnd w:id="0"/>
-        <w:r>
-          <w:rPr>
-            <w:rStyle w:val="Hyperlink"/>
-            <w:b/>
-            <w:bCs/>
-          </w:rPr>
-          <w:t>:</w:t>
+          <w:t>New features:</w:t>
         </w:r>
       </w:hyperlink>
     </w:p>
@@ -487,17 +510,196 @@
       </w:pPr>
     </w:p>
     <w:p>
-      <w:pPr>
+      <w:bookmarkStart w:id="1" w:name="timeout"/>
+      <w:r>
+        <w:rPr>
+          <w:b/>
+          <w:bCs/>
+        </w:rPr>
+        <w:t>Programmable readout timeou</w:t>
+      </w:r>
+      <w:r>
+        <w:rPr>
+          <w:b/>
+          <w:bCs/>
+        </w:rPr>
+        <w:t>t</w:t>
+      </w:r>
+      <w:bookmarkEnd w:id="1"/>
+      <w:r>
+        <w:rPr>
+          <w:b/>
+          <w:bCs/>
+        </w:rPr>
+        <w:t>:</w:t>
+      </w:r>
+      <w:r>
+        <w:t xml:space="preserve"> </w:t>
+      </w:r>
+      <w:r>
+        <w:t xml:space="preserve">the readout timeout is the </w:t>
+      </w:r>
+      <w:r>
         <w:rPr>
           <w:u w:val="single"/>
         </w:rPr>
-      </w:pPr>
-      <w:bookmarkStart w:id="1" w:name="ddr_dump"/>
-      <w:r>
-        <w:rPr>
-          <w:b/>
-          <w:bCs/>
-        </w:rPr>
+        <w:t xml:space="preserve">maximum time allowed </w:t>
+      </w:r>
+      <w:r>
+        <w:rPr>
+          <w:u w:val="single"/>
+        </w:rPr>
+        <w:t xml:space="preserve">to service a </w:t>
+      </w:r>
+      <w:r>
+        <w:rPr>
+          <w:u w:val="single"/>
+        </w:rPr>
+        <w:t>Data Request (DREQ)</w:t>
+      </w:r>
+      <w:r>
+        <w:t xml:space="preserve"> from the DTC</w:t>
+      </w:r>
+      <w:r>
+        <w:t xml:space="preserve">, </w:t>
+      </w:r>
+      <w:proofErr w:type="spellStart"/>
+      <w:r>
+        <w:t>ie</w:t>
+      </w:r>
+      <w:proofErr w:type="spellEnd"/>
+      <w:r>
+        <w:t xml:space="preserve"> the time from the DREQ being received</w:t>
+      </w:r>
+      <w:r>
+        <w:t xml:space="preserve"> and the data </w:t>
+      </w:r>
+      <w:r>
+        <w:t>being fully read from</w:t>
+      </w:r>
+      <w:r>
+        <w:t xml:space="preserve"> the D</w:t>
+      </w:r>
+      <w:r>
+        <w:t>DR and dumped in one of the two EVT_FIFOs</w:t>
+      </w:r>
+      <w:r>
+        <w:t xml:space="preserve"> to be </w:t>
+      </w:r>
+      <w:r>
+        <w:t>sent back to the DTC</w:t>
+      </w:r>
+      <w:r>
+        <w:t xml:space="preserve">. </w:t>
+      </w:r>
+    </w:p>
+    <w:p>
+      <w:r>
+        <w:t>For an event with a large number of hits, this time can be very long as it requires the DIGI data to arrive at the RO</w:t>
+      </w:r>
+      <w:r>
+        <w:t>C and</w:t>
+      </w:r>
+      <w:r>
+        <w:t xml:space="preserve"> be completely flushed from all of the 4 lanes, even if the data saved for the event is only the first 8kB received. Only then the event is written to DDR, recorded in the DREQ_FIFO</w:t>
+      </w:r>
+      <w:r>
+        <w:t>,</w:t>
+      </w:r>
+      <w:r>
+        <w:t xml:space="preserve"> </w:t>
+      </w:r>
+      <w:r>
+        <w:t xml:space="preserve">and finally </w:t>
+      </w:r>
+      <w:r>
+        <w:t xml:space="preserve">read back from DDR into one of the two EVT_FIFOs. </w:t>
+      </w:r>
+    </w:p>
+    <w:p/>
+    <w:p>
+      <w:r>
+        <w:t>T</w:t>
+      </w:r>
+      <w:r>
+        <w:t>his readout timeout, EVENT_TIMEOUT[19:0], is in units of 12.5 ns (or 80 MHz clock ticks) and</w:t>
+      </w:r>
+      <w:r>
+        <w:t xml:space="preserve"> </w:t>
+      </w:r>
+      <w:r>
+        <w:t>is</w:t>
+      </w:r>
+      <w:r>
+        <w:t xml:space="preserve"> </w:t>
+      </w:r>
+      <w:r>
+        <w:t xml:space="preserve">set by a DCS write to address=60 (for </w:t>
+      </w:r>
+      <w:r>
+        <w:t>EVENT_TIMEOUT[1</w:t>
+      </w:r>
+      <w:r>
+        <w:t>5</w:t>
+      </w:r>
+      <w:r>
+        <w:t>:0]</w:t>
+      </w:r>
+      <w:r>
+        <w:t>) and address=61</w:t>
+      </w:r>
+      <w:r>
+        <w:t xml:space="preserve"> (for EVENT_TIMEOUT[1</w:t>
+      </w:r>
+      <w:r>
+        <w:t>9</w:t>
+      </w:r>
+      <w:r>
+        <w:t>:0])</w:t>
+      </w:r>
+      <w:r>
+        <w:t xml:space="preserve">. Its default value at power up is 0xFFFF, or </w:t>
+      </w:r>
+      <w:r>
+        <w:t>820us.</w:t>
+      </w:r>
+    </w:p>
+    <w:p>
+      <w:r>
+        <w:t xml:space="preserve">It can be read via a DCS read of address=60 </w:t>
+      </w:r>
+      <w:r>
+        <w:t>(for EVENT_TIMEOUT[15:0]) and address=61 (for EVENT_TIMEOUT[19:0]).</w:t>
+      </w:r>
+    </w:p>
+    <w:p/>
+    <w:p>
+      <w:r>
+        <w:t>NB: In previous version of the ROC firmware this timeout was hardwired to a value of 0x3FFF or 205us.</w:t>
+      </w:r>
+    </w:p>
+    <w:p>
+      <w:pPr>
+        <w:rPr>
+          <w:b/>
+          <w:bCs/>
+        </w:rPr>
+      </w:pPr>
+      <w:r>
+        <w:rPr>
+          <w:b/>
+          <w:bCs/>
+        </w:rPr>
+        <w:br w:type="page"/>
+      </w:r>
+      <w:bookmarkStart w:id="2" w:name="ddr_dump"/>
+      <w:bookmarkEnd w:id="0"/>
+      <w:r>
+        <w:rPr>
+          <w:b/>
+          <w:bCs/>
+        </w:rPr>
+        <w:lastRenderedPageBreak/>
         <w:t>DDR Dump</w:t>
       </w:r>
       <w:r>
@@ -506,20 +708,56 @@
         </w:rPr>
         <w:t>:</w:t>
       </w:r>
-      <w:bookmarkEnd w:id="1"/>
-      <w:r>
-        <w:t xml:space="preserve">  Ability to access DDR memory content at a programmable MEM_OFFSET[19:0] address</w:t>
-      </w:r>
-      <w:r>
-        <w:t xml:space="preserve"> (where MEM_OFFSET is in units of 1KB blocks, </w:t>
-      </w:r>
-      <w:proofErr w:type="spellStart"/>
-      <w:r>
-        <w:t>ie</w:t>
-      </w:r>
-      <w:proofErr w:type="spellEnd"/>
-      <w:r>
-        <w:t xml:space="preserve"> it corresponds to physical DDR address MEM_OFFSET*0x400).</w:t>
+      <w:bookmarkEnd w:id="2"/>
+      <w:r>
+        <w:t xml:space="preserve">  Ability to access DDR memory content at a programmable MEM_OFFSET</w:t>
+      </w:r>
+      <w:r>
+        <w:t>[19:0]</w:t>
+      </w:r>
+      <w:r>
+        <w:t xml:space="preserve">. </w:t>
+      </w:r>
+    </w:p>
+    <w:p>
+      <w:r>
+        <w:t xml:space="preserve">Data from each window tag is written to the DDR </w:t>
+      </w:r>
+      <w:r>
+        <w:t xml:space="preserve">in multiple of 64-bit </w:t>
+      </w:r>
+      <w:r>
+        <w:t>at the boundary of 1KB block, and starts with two 64-bit event headers (more about that below). The remaining 126x64</w:t>
+      </w:r>
+      <w:r>
+        <w:t>b</w:t>
+      </w:r>
+      <w:r>
+        <w:t xml:space="preserve"> will contain hit data. The DDR</w:t>
+      </w:r>
+      <w:r>
+        <w:t>4</w:t>
+      </w:r>
+      <w:r>
+        <w:t xml:space="preserve"> memory </w:t>
+      </w:r>
+      <w:r>
+        <w:t xml:space="preserve">installed </w:t>
+      </w:r>
+      <w:r>
+        <w:t xml:space="preserve">on the ROC is </w:t>
+      </w:r>
+      <w:r>
+        <w:t>8</w:t>
+      </w:r>
+      <w:r>
+        <w:t>Gb</w:t>
+      </w:r>
+      <w:r>
+        <w:t xml:space="preserve"> and each address contains 8 bit. Hence there are a total of 2**20 x 1KB blocks, each spanning 0x400 addresses. A given memory offset thus correspond to the physical address </w:t>
+      </w:r>
+      <w:r>
+        <w:t>MEM_OFFSET*0x400.</w:t>
       </w:r>
       <w:r>
         <w:t xml:space="preserve"> </w:t>
@@ -531,13 +769,30 @@
         <w:t xml:space="preserve">1KB of memory is dumped to an internal </w:t>
       </w:r>
       <w:r>
+        <w:rPr>
+          <w:b/>
+          <w:bCs/>
+        </w:rPr>
         <w:t>DUMP_</w:t>
       </w:r>
       <w:r>
+        <w:rPr>
+          <w:b/>
+          <w:bCs/>
+        </w:rPr>
         <w:t>FIFO</w:t>
       </w:r>
       <w:r>
-        <w:t xml:space="preserve"> (64bx128 for write port, 16bx512 for read port)</w:t>
+        <w:t xml:space="preserve"> which has a </w:t>
+      </w:r>
+      <w:r>
+        <w:t>64bx128 write port</w:t>
+      </w:r>
+      <w:r>
+        <w:t xml:space="preserve"> and a </w:t>
+      </w:r>
+      <w:r>
+        <w:t>16bx512 for read port</w:t>
       </w:r>
       <w:r>
         <w:t xml:space="preserve">. The </w:t>
@@ -546,7 +801,13 @@
         <w:t>DUMP_</w:t>
       </w:r>
       <w:r>
-        <w:t xml:space="preserve">FIFO can be read via a DCS Block read of 512 words from address 0x200(512). </w:t>
+        <w:t>FIFO can be read via a DCS Block read of 512 words from address 512</w:t>
+      </w:r>
+      <w:r>
+        <w:t>(0x200)</w:t>
+      </w:r>
+      <w:r>
+        <w:t xml:space="preserve">. </w:t>
       </w:r>
     </w:p>
     <w:p>
@@ -558,11 +819,28 @@
       </w:pPr>
     </w:p>
     <w:p>
-      <w:r>
+      <w:pPr>
+        <w:rPr>
+          <w:u w:val="single"/>
+        </w:rPr>
+      </w:pPr>
+      <w:r>
+        <w:rPr>
+          <w:u w:val="single"/>
+        </w:rPr>
         <w:t>Recommended c</w:t>
       </w:r>
       <w:r>
-        <w:t>ommands sequence:</w:t>
+        <w:rPr>
+          <w:u w:val="single"/>
+        </w:rPr>
+        <w:t>ommands sequence</w:t>
+      </w:r>
+      <w:r>
+        <w:rPr>
+          <w:u w:val="single"/>
+        </w:rPr>
+        <w:t xml:space="preserve"> for a DDR dump</w:t>
       </w:r>
     </w:p>
     <w:p>
@@ -577,51 +855,115 @@
         </w:rPr>
       </w:pPr>
       <w:r>
-        <w:t xml:space="preserve">Read </w:t>
-      </w:r>
-      <w:r>
-        <w:rPr>
-          <w:b/>
-          <w:bCs/>
-        </w:rPr>
-        <w:t>start address</w:t>
-      </w:r>
-      <w:r>
-        <w:t xml:space="preserve"> DDR_READ_ADDR of </w:t>
-      </w:r>
-      <w:r>
-        <w:rPr>
-          <w:b/>
-          <w:bCs/>
-        </w:rPr>
-        <w:t>last DDR dump</w:t>
-      </w:r>
-      <w:r>
-        <w:t>: DDR_READ_ADDR[15:0] by issuing a DCS read of address 0x</w:t>
-      </w:r>
-      <w:r>
-        <w:t>F</w:t>
-      </w:r>
-      <w:r>
-        <w:t>(</w:t>
-      </w:r>
-      <w:r>
-        <w:t>15</w:t>
-      </w:r>
-      <w:r>
-        <w:t>) and DDR_READ_ADDR[19:16] by issuing a DCS read of address 0x1</w:t>
-      </w:r>
-      <w:r>
-        <w:t>0</w:t>
-      </w:r>
-      <w:r>
-        <w:t>(</w:t>
-      </w:r>
-      <w:r>
-        <w:t>16</w:t>
-      </w:r>
-      <w:r>
-        <w:t>).</w:t>
+        <w:t xml:space="preserve">Check that </w:t>
+      </w:r>
+      <w:r>
+        <w:rPr>
+          <w:b/>
+          <w:bCs/>
+        </w:rPr>
+        <w:t xml:space="preserve">DUMP_FIFO </w:t>
+      </w:r>
+      <w:r>
+        <w:rPr>
+          <w:b/>
+          <w:bCs/>
+        </w:rPr>
+        <w:t>is</w:t>
+      </w:r>
+      <w:r>
+        <w:rPr>
+          <w:b/>
+          <w:bCs/>
+        </w:rPr>
+        <w:t xml:space="preserve"> empty</w:t>
+      </w:r>
+      <w:r>
+        <w:rPr>
+          <w:b/>
+          <w:bCs/>
+        </w:rPr>
+        <w:t xml:space="preserve">, </w:t>
+      </w:r>
+      <w:proofErr w:type="spellStart"/>
+      <w:r>
+        <w:t>ie</w:t>
+      </w:r>
+      <w:proofErr w:type="spellEnd"/>
+      <w:r>
+        <w:t xml:space="preserve"> </w:t>
+      </w:r>
+      <w:r>
+        <w:t xml:space="preserve">that a </w:t>
+      </w:r>
+      <w:r>
+        <w:t xml:space="preserve">DCS read of address=20 </w:t>
+      </w:r>
+      <w:r>
+        <w:t>returns</w:t>
+      </w:r>
+      <w:r>
+        <w:t xml:space="preserve"> 0x</w:t>
+      </w:r>
+      <w:r>
+        <w:t xml:space="preserve">0 </w:t>
+      </w:r>
+      <w:r>
+        <w:t>(where bit[15]=DUMP_FIFO full; bit[7</w:t>
+      </w:r>
+      <w:r>
+        <w:t>:0]=DUMP</w:t>
+      </w:r>
+      <w:r>
+        <w:t>_FIFO WRCNT</w:t>
+      </w:r>
+      <w:r>
+        <w:t xml:space="preserve"> in units of 64-bit words</w:t>
+      </w:r>
+      <w:r>
+        <w:t>)</w:t>
+      </w:r>
+      <w:r>
+        <w:t xml:space="preserve"> and a</w:t>
+      </w:r>
+      <w:r>
+        <w:t xml:space="preserve"> </w:t>
+      </w:r>
+      <w:r>
+        <w:t>DCS read of address</w:t>
+      </w:r>
+      <w:r>
+        <w:t>=</w:t>
+      </w:r>
+      <w:r>
+        <w:t>21</w:t>
+      </w:r>
+      <w:r>
+        <w:t xml:space="preserve"> </w:t>
+      </w:r>
+      <w:r>
+        <w:t xml:space="preserve">returns 0x8000 (where bit[15]=DUMP_FIFO empty and </w:t>
+      </w:r>
+      <w:r>
+        <w:t>bit[9:0]=</w:t>
+      </w:r>
+      <w:r>
+        <w:t xml:space="preserve"> </w:t>
+      </w:r>
+      <w:r>
+        <w:t>RDCNT</w:t>
+      </w:r>
+      <w:r>
+        <w:t>, in units of 16-bit words)</w:t>
+      </w:r>
+      <w:r>
+        <w:t>. If otherwise, issue DDR reset via DCS write of any value to address</w:t>
+      </w:r>
+      <w:r>
+        <w:t>=14</w:t>
+      </w:r>
+      <w:r>
+        <w:t>.</w:t>
       </w:r>
     </w:p>
     <w:p>
@@ -636,43 +978,40 @@
         </w:rPr>
       </w:pPr>
       <w:r>
-        <w:t xml:space="preserve">Check that </w:t>
-      </w:r>
-      <w:r>
-        <w:rPr>
-          <w:b/>
-          <w:bCs/>
-        </w:rPr>
-        <w:t xml:space="preserve">DUMP_FIFO </w:t>
-      </w:r>
-      <w:r>
-        <w:rPr>
-          <w:b/>
-          <w:bCs/>
-        </w:rPr>
-        <w:t>is</w:t>
-      </w:r>
-      <w:r>
-        <w:rPr>
-          <w:b/>
-          <w:bCs/>
-        </w:rPr>
-        <w:t xml:space="preserve"> empty</w:t>
-      </w:r>
-      <w:r>
-        <w:t xml:space="preserve"> by requesting that </w:t>
-      </w:r>
-      <w:r>
-        <w:t xml:space="preserve">DCS read of address 0x15(21) returns 0x8000 (where bit[15]=DUMP_FIFO empty and </w:t>
-      </w:r>
-      <w:r>
-        <w:t>bit[9:0]=</w:t>
-      </w:r>
-      <w:r>
-        <w:t xml:space="preserve"> </w:t>
-      </w:r>
-      <w:r>
-        <w:t>RDCNT. If otherwise, issue DDR reset via DCS write of any value to address 0xE(14).</w:t>
+        <w:t xml:space="preserve">Set MEM_OFFSET </w:t>
+      </w:r>
+      <w:r>
+        <w:t xml:space="preserve">to read </w:t>
+      </w:r>
+      <w:r>
+        <w:t xml:space="preserve">via DCS write </w:t>
+      </w:r>
+      <w:r>
+        <w:t xml:space="preserve">of value MEM_OFFSET[15:0] </w:t>
+      </w:r>
+      <w:r>
+        <w:t>to address</w:t>
+      </w:r>
+      <w:r>
+        <w:t>=</w:t>
+      </w:r>
+      <w:r>
+        <w:t>33 and</w:t>
+      </w:r>
+      <w:r>
+        <w:t xml:space="preserve"> value </w:t>
+      </w:r>
+      <w:r>
+        <w:t>MEM_OFFSET[19:16] via address</w:t>
+      </w:r>
+      <w:r>
+        <w:t>=</w:t>
+      </w:r>
+      <w:r>
+        <w:t>34</w:t>
+      </w:r>
+      <w:r>
+        <w:t>. Default value after power up of MEM_OFFSET is zero.</w:t>
       </w:r>
     </w:p>
     <w:p>
@@ -687,28 +1026,22 @@
         </w:rPr>
       </w:pPr>
       <w:r>
-        <w:t xml:space="preserve">Set MEM_OFFSET </w:t>
-      </w:r>
-      <w:r>
-        <w:t xml:space="preserve">of 1KB block to read </w:t>
-      </w:r>
-      <w:r>
-        <w:t xml:space="preserve">via DCS write </w:t>
-      </w:r>
-      <w:r>
-        <w:t xml:space="preserve">of value MEM_OFFSET[15:0] </w:t>
-      </w:r>
-      <w:r>
-        <w:t>to address 0x21(33) and</w:t>
-      </w:r>
-      <w:r>
-        <w:t xml:space="preserve"> value </w:t>
-      </w:r>
-      <w:r>
-        <w:t>MEM_OFFSET[19:16] via address 0x22(34)</w:t>
-      </w:r>
-      <w:r>
-        <w:t>. Default value after power up of MEM_OFFSET is zero.</w:t>
+        <w:t>Issue MEM_READ via DCS write of value=1</w:t>
+      </w:r>
+      <w:r>
+        <w:t>, followed by 0,</w:t>
+      </w:r>
+      <w:r>
+        <w:t xml:space="preserve"> to address</w:t>
+      </w:r>
+      <w:r>
+        <w:t>=</w:t>
+      </w:r>
+      <w:r>
+        <w:t>32</w:t>
+      </w:r>
+      <w:r>
+        <w:t>.</w:t>
       </w:r>
     </w:p>
     <w:p>
@@ -723,10 +1056,71 @@
         </w:rPr>
       </w:pPr>
       <w:r>
-        <w:t>Issue MEM_READ via DCS write of value=1 to address 0x20(32), followed by write of value=0 to same address</w:t>
+        <w:t xml:space="preserve">Check that </w:t>
+      </w:r>
+      <w:r>
+        <w:rPr>
+          <w:b/>
+          <w:bCs/>
+        </w:rPr>
+        <w:t xml:space="preserve">DDR dump </w:t>
+      </w:r>
+      <w:r>
+        <w:rPr>
+          <w:b/>
+          <w:bCs/>
+        </w:rPr>
+        <w:t>is</w:t>
+      </w:r>
+      <w:r>
+        <w:rPr>
+          <w:b/>
+          <w:bCs/>
+        </w:rPr>
+        <w:t xml:space="preserve"> </w:t>
+      </w:r>
+      <w:r>
+        <w:rPr>
+          <w:b/>
+          <w:bCs/>
+        </w:rPr>
+        <w:t>ready to be read</w:t>
+      </w:r>
+      <w:r>
+        <w:t xml:space="preserve"> by requesting that DCS read of address</w:t>
+      </w:r>
+      <w:r>
+        <w:t>=</w:t>
+      </w:r>
+      <w:r>
+        <w:t xml:space="preserve">20 </w:t>
+      </w:r>
+      <w:r>
+        <w:t>be</w:t>
+      </w:r>
+      <w:r>
+        <w:t xml:space="preserve"> </w:t>
+      </w:r>
+      <w:r>
+        <w:t xml:space="preserve">equal to </w:t>
+      </w:r>
+      <w:r>
+        <w:t xml:space="preserve">0x8080  </w:t>
+      </w:r>
+      <w:r>
+        <w:t xml:space="preserve">and read of address=21 </w:t>
+      </w:r>
+      <w:r>
+        <w:t>be</w:t>
+      </w:r>
+      <w:r>
+        <w:t xml:space="preserve"> equal to 0x200</w:t>
       </w:r>
       <w:r>
         <w:t>.</w:t>
+      </w:r>
+      <w:r>
+        <w:t xml:space="preserve"> </w:t>
       </w:r>
     </w:p>
     <w:p>
@@ -741,64 +1135,16 @@
         </w:rPr>
       </w:pPr>
       <w:r>
-        <w:t xml:space="preserve">Check that </w:t>
-      </w:r>
-      <w:r>
-        <w:rPr>
-          <w:b/>
-          <w:bCs/>
-        </w:rPr>
-        <w:t xml:space="preserve">DDR dump </w:t>
-      </w:r>
-      <w:r>
-        <w:rPr>
-          <w:b/>
-          <w:bCs/>
-        </w:rPr>
-        <w:t>is</w:t>
-      </w:r>
-      <w:r>
-        <w:rPr>
-          <w:b/>
-          <w:bCs/>
-        </w:rPr>
-        <w:t xml:space="preserve"> done</w:t>
-      </w:r>
-      <w:r>
-        <w:t xml:space="preserve"> by requesting that DCS read of address 0x14(20) is 0x8080  (</w:t>
-      </w:r>
-      <w:r>
-        <w:t xml:space="preserve">where </w:t>
-      </w:r>
-      <w:r>
-        <w:t>bit[15]=DUMP_FIFO full; bit[7</w:t>
-      </w:r>
-      <w:r>
-        <w:t>:0]=DUMP</w:t>
-      </w:r>
-      <w:r>
-        <w:t>_FIFO</w:t>
-      </w:r>
-      <w:r>
-        <w:t xml:space="preserve"> WRCNT</w:t>
-      </w:r>
-      <w:r>
-        <w:t>)</w:t>
-      </w:r>
-    </w:p>
-    <w:p>
-      <w:pPr>
-        <w:pStyle w:val="ListParagraph"/>
-        <w:numPr>
-          <w:ilvl w:val="0"/>
-          <w:numId w:val="18"/>
-        </w:numPr>
-        <w:rPr>
-          <w:u w:val="single"/>
-        </w:rPr>
-      </w:pPr>
-      <w:r>
-        <w:t>Read DUMP_FIFO out by issuing a DCS Block Read of N=512 words to address 0x200(512)</w:t>
+        <w:t xml:space="preserve">Read </w:t>
+      </w:r>
+      <w:r>
+        <w:t xml:space="preserve">the </w:t>
+      </w:r>
+      <w:r>
+        <w:t>DUMP_FIFO by issuing a DCS Block Read of N=512 words to address 512</w:t>
+      </w:r>
+      <w:r>
+        <w:t>(0x200)</w:t>
       </w:r>
     </w:p>
     <w:p>
@@ -812,200 +1158,475 @@
     </w:p>
     <w:p>
       <w:pPr>
+        <w:rPr>
+          <w:u w:val="single"/>
+        </w:rPr>
+      </w:pPr>
+      <w:r>
+        <w:t xml:space="preserve">The </w:t>
+      </w:r>
+      <w:r>
+        <w:t xml:space="preserve">DDR </w:t>
+      </w:r>
+      <w:r>
+        <w:t xml:space="preserve">is </w:t>
+      </w:r>
+      <w:r>
+        <w:t xml:space="preserve">written to a monotonically increasing </w:t>
+      </w:r>
+      <w:r>
+        <w:t>address</w:t>
+      </w:r>
+      <w:r>
+        <w:t>es</w:t>
+      </w:r>
+      <w:r>
+        <w:t xml:space="preserve"> and</w:t>
+      </w:r>
+      <w:r>
+        <w:t xml:space="preserve"> start</w:t>
+      </w:r>
+      <w:r>
+        <w:t>s</w:t>
+      </w:r>
+      <w:r>
+        <w:t xml:space="preserve"> at an offset </w:t>
+      </w:r>
+      <w:r>
+        <w:t xml:space="preserve">= 0 </w:t>
+      </w:r>
+      <w:r>
+        <w:rPr>
+          <w:b/>
+          <w:bCs/>
+        </w:rPr>
+        <w:t>after a ROC FP</w:t>
+      </w:r>
+      <w:r>
+        <w:rPr>
+          <w:b/>
+          <w:bCs/>
+        </w:rPr>
+        <w:t>G</w:t>
+      </w:r>
+      <w:r>
+        <w:rPr>
+          <w:b/>
+          <w:bCs/>
+        </w:rPr>
+        <w:t xml:space="preserve">A reflash </w:t>
+      </w:r>
+      <w:r>
+        <w:rPr>
+          <w:b/>
+          <w:bCs/>
+        </w:rPr>
+        <w:t>OR</w:t>
+      </w:r>
+      <w:r>
+        <w:rPr>
+          <w:b/>
+          <w:bCs/>
+        </w:rPr>
+        <w:t xml:space="preserve"> </w:t>
+      </w:r>
+      <w:r>
+        <w:rPr>
+          <w:b/>
+          <w:bCs/>
+        </w:rPr>
+        <w:t xml:space="preserve">a board </w:t>
+      </w:r>
+      <w:r>
+        <w:rPr>
+          <w:b/>
+          <w:bCs/>
+        </w:rPr>
+        <w:t>power cycle</w:t>
+      </w:r>
+      <w:r>
+        <w:rPr>
+          <w:b/>
+          <w:bCs/>
+        </w:rPr>
+        <w:t xml:space="preserve"> OR </w:t>
+      </w:r>
+      <w:r>
+        <w:rPr>
+          <w:b/>
+          <w:bCs/>
+        </w:rPr>
+        <w:t xml:space="preserve">for the first event tag after a NULL </w:t>
+      </w:r>
+      <w:proofErr w:type="spellStart"/>
+      <w:r>
+        <w:rPr>
+          <w:b/>
+          <w:bCs/>
+        </w:rPr>
+        <w:t>Heartbit</w:t>
+      </w:r>
+      <w:proofErr w:type="spellEnd"/>
+      <w:r>
+        <w:t>.</w:t>
+      </w:r>
+      <w:r>
+        <w:t xml:space="preserve"> Once the </w:t>
+      </w:r>
+      <w:r>
+        <w:t>4</w:t>
+      </w:r>
+      <w:r>
+        <w:t>G</w:t>
+      </w:r>
+      <w:r>
+        <w:t>b</w:t>
+      </w:r>
+      <w:r>
+        <w:t xml:space="preserve"> DDR memory is exhausted, at memory block 1,048,575 (2**20-1 )</w:t>
+      </w:r>
+      <w:r>
+        <w:t xml:space="preserve">, it will wrap-around and starts again from </w:t>
+      </w:r>
+      <w:r>
+        <w:t>an offset=0</w:t>
+      </w:r>
+      <w:r>
+        <w:t>. Data</w:t>
+      </w:r>
+      <w:r>
+        <w:t xml:space="preserve"> from a single event is not allowed to straddle the memory wrap-around point</w:t>
+      </w:r>
+      <w:r>
+        <w:t xml:space="preserve">. </w:t>
+      </w:r>
+      <w:r>
+        <w:t xml:space="preserve">The </w:t>
+      </w:r>
+      <w:r>
+        <w:rPr>
+          <w:b/>
+          <w:bCs/>
+        </w:rPr>
+        <w:t>start addres</w:t>
+      </w:r>
+      <w:r>
+        <w:rPr>
+          <w:b/>
+          <w:bCs/>
+        </w:rPr>
+        <w:t xml:space="preserve">s </w:t>
+      </w:r>
+      <w:r>
+        <w:rPr>
+          <w:b/>
+          <w:bCs/>
+        </w:rPr>
+        <w:t>(</w:t>
+      </w:r>
+      <w:proofErr w:type="spellStart"/>
+      <w:r>
+        <w:rPr>
+          <w:b/>
+          <w:bCs/>
+        </w:rPr>
+        <w:t>ie</w:t>
+      </w:r>
+      <w:proofErr w:type="spellEnd"/>
+      <w:r>
+        <w:rPr>
+          <w:b/>
+          <w:bCs/>
+        </w:rPr>
+        <w:t xml:space="preserve"> the first 1kB block MEM_OFFSET) of </w:t>
+      </w:r>
+      <w:r>
+        <w:rPr>
+          <w:b/>
+          <w:bCs/>
+        </w:rPr>
+        <w:t xml:space="preserve">the last event </w:t>
+      </w:r>
+      <w:r>
+        <w:rPr>
+          <w:b/>
+          <w:bCs/>
+        </w:rPr>
+        <w:t>read from</w:t>
+      </w:r>
+      <w:r>
+        <w:rPr>
+          <w:b/>
+          <w:bCs/>
+        </w:rPr>
+        <w:t xml:space="preserve"> </w:t>
+      </w:r>
+      <w:r>
+        <w:rPr>
+          <w:b/>
+          <w:bCs/>
+        </w:rPr>
+        <w:t>DDR</w:t>
+      </w:r>
+      <w:r>
+        <w:rPr>
+          <w:b/>
+          <w:bCs/>
+        </w:rPr>
+        <w:t xml:space="preserve">, </w:t>
+      </w:r>
+      <w:r>
+        <w:t>or DDR_READ_ADDR, is saved to address=15 (D</w:t>
+      </w:r>
+      <w:r>
+        <w:t>DR_READ_ADDR</w:t>
+      </w:r>
+      <w:r>
+        <w:t xml:space="preserve">[15:0]) and address=16 </w:t>
+      </w:r>
+      <w:r>
+        <w:t>(</w:t>
+      </w:r>
+      <w:r>
+        <w:t>DDR_READ_ADDR[19:16]</w:t>
+      </w:r>
+      <w:r>
+        <w:t>)</w:t>
+      </w:r>
+      <w:r>
+        <w:t>.</w:t>
+      </w:r>
+    </w:p>
+    <w:p>
+      <w:pPr>
         <w:pStyle w:val="ListParagraph"/>
         <w:ind w:left="0"/>
       </w:pPr>
-      <w:r>
-        <w:t xml:space="preserve">The </w:t>
-      </w:r>
-      <w:r>
-        <w:t xml:space="preserve">DDR </w:t>
-      </w:r>
-      <w:r>
-        <w:t xml:space="preserve">is </w:t>
-      </w:r>
-      <w:r>
-        <w:t xml:space="preserve">written to a monotonically increasing </w:t>
-      </w:r>
-      <w:r>
-        <w:t xml:space="preserve">address starting at an offset </w:t>
-      </w:r>
-      <w:r>
-        <w:t xml:space="preserve">= 0 </w:t>
-      </w:r>
-      <w:r>
-        <w:t>after a ROC FPFA reflash or power cycle.</w:t>
-      </w:r>
-      <w:r>
-        <w:t xml:space="preserve"> Once the 4GB DDR memory is exhausted, at memory block 1,048,575 (2**20-1 ) </w:t>
-      </w:r>
     </w:p>
     <w:p>
       <w:pPr>
         <w:pStyle w:val="ListParagraph"/>
         <w:ind w:left="0"/>
       </w:pPr>
+      <w:r>
+        <w:t>When data from event</w:t>
+      </w:r>
+      <w:r>
+        <w:t>s</w:t>
+      </w:r>
+      <w:r>
+        <w:t xml:space="preserve"> are written to DDR, they are divided in </w:t>
+      </w:r>
+      <w:r>
+        <w:t xml:space="preserve">1 KB </w:t>
+      </w:r>
+      <w:r>
+        <w:t>blocks</w:t>
+      </w:r>
+      <w:r>
+        <w:t xml:space="preserve"> </w:t>
+      </w:r>
+      <w:r>
+        <w:t xml:space="preserve"> </w:t>
+      </w:r>
+      <w:r>
+        <w:t xml:space="preserve">containing </w:t>
+      </w:r>
+      <w:r>
+        <w:rPr>
+          <w:b/>
+          <w:bCs/>
+        </w:rPr>
+        <w:t>two 64-bit header</w:t>
+      </w:r>
+      <w:r>
+        <w:rPr>
+          <w:b/>
+          <w:bCs/>
+        </w:rPr>
+        <w:t xml:space="preserve"> </w:t>
+      </w:r>
+      <w:r>
+        <w:rPr>
+          <w:b/>
+          <w:bCs/>
+        </w:rPr>
+        <w:t>words</w:t>
+      </w:r>
+      <w:r>
+        <w:t xml:space="preserve"> and </w:t>
+      </w:r>
+      <w:r>
+        <w:rPr>
+          <w:b/>
+          <w:bCs/>
+        </w:rPr>
+        <w:t xml:space="preserve">a maximum of </w:t>
+      </w:r>
+      <w:r>
+        <w:rPr>
+          <w:b/>
+          <w:bCs/>
+        </w:rPr>
+        <w:t>12</w:t>
+      </w:r>
+      <w:r>
+        <w:rPr>
+          <w:b/>
+          <w:bCs/>
+        </w:rPr>
+        <w:t xml:space="preserve">6 </w:t>
+      </w:r>
+      <w:r>
+        <w:rPr>
+          <w:b/>
+          <w:bCs/>
+        </w:rPr>
+        <w:t>x</w:t>
+      </w:r>
+      <w:r>
+        <w:rPr>
+          <w:b/>
+          <w:bCs/>
+        </w:rPr>
+        <w:t xml:space="preserve"> </w:t>
+      </w:r>
+      <w:r>
+        <w:rPr>
+          <w:b/>
+          <w:bCs/>
+        </w:rPr>
+        <w:t xml:space="preserve">64-bit </w:t>
+      </w:r>
+      <w:r>
+        <w:rPr>
+          <w:b/>
+          <w:bCs/>
+        </w:rPr>
+        <w:t>payload</w:t>
+      </w:r>
+      <w:r>
+        <w:rPr>
+          <w:b/>
+          <w:bCs/>
+        </w:rPr>
+        <w:t xml:space="preserve"> words</w:t>
+      </w:r>
+      <w:r>
+        <w:t xml:space="preserve">. If the event contains </w:t>
+      </w:r>
+      <w:r>
+        <w:t xml:space="preserve">less than 126 x 64-bit, the remaining words in the block will be meaningless or contains info from a previous event block landing at that address. If the event contains </w:t>
+      </w:r>
+      <w:r>
+        <w:t>more than 126</w:t>
+      </w:r>
+      <w:r>
+        <w:t xml:space="preserve"> </w:t>
+      </w:r>
+      <w:r>
+        <w:t>x 64</w:t>
+      </w:r>
+      <w:r>
+        <w:t>b</w:t>
+      </w:r>
+      <w:r>
+        <w:t xml:space="preserve">, the remaining </w:t>
+      </w:r>
+      <w:r>
+        <w:t>payload words</w:t>
+      </w:r>
+      <w:r>
+        <w:t xml:space="preserve"> are written to the next address in memory. </w:t>
+      </w:r>
+      <w:r>
+        <w:t xml:space="preserve">The </w:t>
+      </w:r>
+      <w:r>
+        <w:rPr>
+          <w:b/>
+          <w:bCs/>
+        </w:rPr>
+        <w:t xml:space="preserve">maximum allowed event size is currently </w:t>
+      </w:r>
+      <w:r>
+        <w:rPr>
+          <w:b/>
+          <w:bCs/>
+        </w:rPr>
+        <w:t>(</w:t>
+      </w:r>
+      <w:r>
+        <w:rPr>
+          <w:b/>
+          <w:bCs/>
+        </w:rPr>
+        <w:t>2**10</w:t>
+      </w:r>
+      <w:r>
+        <w:rPr>
+          <w:b/>
+          <w:bCs/>
+        </w:rPr>
+        <w:t>-1)</w:t>
+      </w:r>
+      <w:r>
+        <w:rPr>
+          <w:b/>
+          <w:bCs/>
+        </w:rPr>
+        <w:t>x64b, or 8kB</w:t>
+      </w:r>
+      <w:r>
+        <w:t xml:space="preserve"> (</w:t>
+      </w:r>
+      <w:proofErr w:type="spellStart"/>
+      <w:r>
+        <w:t>ie</w:t>
+      </w:r>
+      <w:proofErr w:type="spellEnd"/>
+      <w:r>
+        <w:t xml:space="preserve"> 255 hits of 256b each). An event of size larger than this is labelled as overflow event and it will span 9x1kB blocks in order to fit the header words. </w:t>
+      </w:r>
+      <w:r>
+        <w:t>For instance an event with 96 hits</w:t>
+      </w:r>
+      <w:r>
+        <w:t xml:space="preserve"> of 256-bit each,</w:t>
+      </w:r>
+      <w:r>
+        <w:t xml:space="preserve"> will have 384 x 64-bit word payload, and will require to span four blocks, the first three with 126</w:t>
+      </w:r>
+      <w:r>
+        <w:t xml:space="preserve"> (0x7E)</w:t>
+      </w:r>
+      <w:r>
+        <w:t xml:space="preserve"> 64-bit</w:t>
+      </w:r>
+      <w:r>
+        <w:t>-</w:t>
+      </w:r>
+      <w:r>
+        <w:t>word</w:t>
+      </w:r>
+      <w:r>
+        <w:t>s</w:t>
+      </w:r>
+      <w:r>
+        <w:t xml:space="preserve"> each and the last one with 6.</w:t>
+      </w:r>
     </w:p>
     <w:p>
       <w:pPr>
         <w:pStyle w:val="ListParagraph"/>
         <w:ind w:left="0"/>
       </w:pPr>
-      <w:r>
-        <w:t>When data from event</w:t>
-      </w:r>
-      <w:r>
-        <w:t>s</w:t>
-      </w:r>
-      <w:r>
-        <w:t xml:space="preserve"> are written to DDR, they are divided in </w:t>
-      </w:r>
-      <w:r>
-        <w:t xml:space="preserve">1 KB </w:t>
-      </w:r>
-      <w:r>
-        <w:t>blocks</w:t>
-      </w:r>
-      <w:r>
-        <w:t xml:space="preserve"> </w:t>
-      </w:r>
-      <w:r>
-        <w:t xml:space="preserve"> </w:t>
-      </w:r>
-      <w:r>
-        <w:t xml:space="preserve">containing </w:t>
-      </w:r>
-      <w:r>
-        <w:rPr>
-          <w:b/>
-          <w:bCs/>
-        </w:rPr>
-        <w:t>two 64-bit header</w:t>
-      </w:r>
-      <w:r>
-        <w:rPr>
-          <w:b/>
-          <w:bCs/>
-        </w:rPr>
-        <w:t xml:space="preserve"> </w:t>
-      </w:r>
-      <w:r>
-        <w:rPr>
-          <w:b/>
-          <w:bCs/>
-        </w:rPr>
-        <w:t>words</w:t>
-      </w:r>
-      <w:r>
-        <w:t xml:space="preserve"> and </w:t>
-      </w:r>
-      <w:r>
-        <w:rPr>
-          <w:b/>
-          <w:bCs/>
-        </w:rPr>
-        <w:t xml:space="preserve">a maximum of </w:t>
-      </w:r>
-      <w:r>
-        <w:rPr>
-          <w:b/>
-          <w:bCs/>
-        </w:rPr>
-        <w:t>12</w:t>
-      </w:r>
-      <w:r>
-        <w:rPr>
-          <w:b/>
-          <w:bCs/>
-        </w:rPr>
-        <w:t xml:space="preserve">6 </w:t>
-      </w:r>
-      <w:r>
-        <w:rPr>
-          <w:b/>
-          <w:bCs/>
-        </w:rPr>
-        <w:t>x</w:t>
-      </w:r>
-      <w:r>
-        <w:rPr>
-          <w:b/>
-          <w:bCs/>
-        </w:rPr>
-        <w:t xml:space="preserve"> </w:t>
-      </w:r>
-      <w:r>
-        <w:rPr>
-          <w:b/>
-          <w:bCs/>
-        </w:rPr>
-        <w:t xml:space="preserve">64-bit </w:t>
-      </w:r>
-      <w:r>
-        <w:rPr>
-          <w:b/>
-          <w:bCs/>
-        </w:rPr>
-        <w:t>payload</w:t>
-      </w:r>
-      <w:r>
-        <w:rPr>
-          <w:b/>
-          <w:bCs/>
-        </w:rPr>
-        <w:t xml:space="preserve"> words</w:t>
-      </w:r>
-      <w:r>
-        <w:t xml:space="preserve">. If the event contains </w:t>
-      </w:r>
-      <w:r>
-        <w:t xml:space="preserve">less than 126 x 64-bit, the remaining words in the block will be meaningless or contains info from a previous event block landing at that address. If the event contains </w:t>
-      </w:r>
-      <w:r>
-        <w:t>more than 126</w:t>
-      </w:r>
-      <w:r>
-        <w:t xml:space="preserve"> </w:t>
-      </w:r>
-      <w:r>
-        <w:t xml:space="preserve">x 64-bit, the remaining </w:t>
-      </w:r>
-      <w:r>
-        <w:t>payload words</w:t>
-      </w:r>
-      <w:r>
-        <w:t xml:space="preserve"> are written to the next address in memory. For instance an event with 96 hits will have 384 x 64-bit word payload, and will require to span four blocks, the first three with 126</w:t>
-      </w:r>
-      <w:r>
-        <w:t xml:space="preserve"> (0x7E)</w:t>
-      </w:r>
-      <w:r>
-        <w:t xml:space="preserve"> 64-bit</w:t>
-      </w:r>
-      <w:r>
-        <w:t>-</w:t>
-      </w:r>
-      <w:r>
-        <w:t>word</w:t>
-      </w:r>
-      <w:r>
-        <w:t>s</w:t>
-      </w:r>
-      <w:r>
-        <w:t xml:space="preserve"> each and the last one with 6.</w:t>
-      </w:r>
     </w:p>
     <w:p>
       <w:pPr>
         <w:pStyle w:val="ListParagraph"/>
         <w:ind w:left="0"/>
       </w:pPr>
-    </w:p>
-    <w:p>
-      <w:pPr>
-        <w:pStyle w:val="ListParagraph"/>
-        <w:ind w:left="0"/>
-      </w:pPr>
       <w:r>
         <w:t>The</w:t>
       </w:r>
@@ -1030,6 +1651,7 @@
         <w:rPr>
           <w:color w:val="FF0000"/>
         </w:rPr>
+        <w:lastRenderedPageBreak/>
         <w:t>1</w:t>
       </w:r>
       <w:r>
@@ -1184,23 +1806,34 @@
         <w:t xml:space="preserve"> maximum allowed </w:t>
       </w:r>
       <w:r>
-        <w:t>number of</w:t>
-      </w:r>
-      <w:r>
-        <w:t xml:space="preserve"> </w:t>
-      </w:r>
-      <w:r>
-        <w:t xml:space="preserve">255 </w:t>
-      </w:r>
-      <w:r>
-        <w:t>hits</w:t>
-      </w:r>
-      <w:r>
-        <w:t xml:space="preserve"> per event tag. When this happen, the ROC firmware writes to DDR only the data </w:t>
-      </w:r>
-      <w:r>
-        <w:lastRenderedPageBreak/>
-        <w:t>for the first 255 hits, meaning it read all hits from DIGI CAL0 lane first, followed by CAL1, HV0 and HV1. Once the maximum number is reached, hits from the current and any remaining lanes are dropped.</w:t>
+        <w:t xml:space="preserve">size of 8KB. </w:t>
+      </w:r>
+      <w:r>
+        <w:t xml:space="preserve">When this happen, the ROC firmware writes to DDR </w:t>
+      </w:r>
+      <w:r>
+        <w:t xml:space="preserve">first the full data reported by the DIGI CAL0 lane, </w:t>
+      </w:r>
+      <w:r>
+        <w:t>followed by CAL1, HV0 and HV1</w:t>
+      </w:r>
+      <w:r>
+        <w:t xml:space="preserve"> lane, respectively</w:t>
+      </w:r>
+      <w:r>
+        <w:t xml:space="preserve">. Once the maximum </w:t>
+      </w:r>
+      <w:r>
+        <w:t>size</w:t>
+      </w:r>
+      <w:r>
+        <w:t xml:space="preserve"> is reached, </w:t>
+      </w:r>
+      <w:r>
+        <w:t>data</w:t>
+      </w:r>
+      <w:r>
+        <w:t xml:space="preserve"> from the current and any remaining lanes are dropped.</w:t>
       </w:r>
       <w:r>
         <w:t>)</w:t>
@@ -1365,10 +1998,22 @@
       </w:r>
       <w:proofErr w:type="spellEnd"/>
       <w:r>
-        <w:t xml:space="preserve"> first tag of current</w:t>
-      </w:r>
-      <w:r>
-        <w:t xml:space="preserve"> run) plus local tag sent by DIGI</w:t>
+        <w:t xml:space="preserve"> first tag of </w:t>
+      </w:r>
+      <w:r>
+        <w:t xml:space="preserve">a new </w:t>
+      </w:r>
+      <w:r>
+        <w:t>run</w:t>
+      </w:r>
+      <w:r>
+        <w:t xml:space="preserve"> after a null HB</w:t>
+      </w:r>
+      <w:r>
+        <w:t>) plus local tag sent by DIGI</w:t>
+      </w:r>
+      <w:r>
+        <w:t>.</w:t>
       </w:r>
     </w:p>
     <w:p>
@@ -1484,7 +2129,22 @@
       </w:r>
       <w:proofErr w:type="spellEnd"/>
       <w:r>
-        <w:t xml:space="preserve"> a number from 0, when event has no hits, to maximum allowed of 126, when event has more than 31 hits</w:t>
+        <w:t xml:space="preserve"> a number from 0, when event has no hits, to maximum allowed of 126</w:t>
+      </w:r>
+      <w:r>
+        <w:t xml:space="preserve"> (for instance if </w:t>
+      </w:r>
+      <w:r>
+        <w:t xml:space="preserve">event has more than 31 </w:t>
+      </w:r>
+      <w:r>
+        <w:t xml:space="preserve">x 256b </w:t>
+      </w:r>
+      <w:r>
+        <w:t>hits</w:t>
+      </w:r>
+      <w:r>
+        <w:t>)</w:t>
       </w:r>
     </w:p>
     <w:p>
@@ -1569,7 +2229,24 @@
       </w:r>
       <w:proofErr w:type="spellEnd"/>
       <w:r>
-        <w:t xml:space="preserve"> current block for event</w:t>
+        <w:t xml:space="preserve"> current </w:t>
+      </w:r>
+      <w:r>
+        <w:t xml:space="preserve">1kB </w:t>
+      </w:r>
+      <w:r>
+        <w:t>block for event</w:t>
+      </w:r>
+      <w:r>
+        <w:t xml:space="preserve"> </w:t>
+      </w:r>
+      <w:proofErr w:type="spellStart"/>
+      <w:r>
+        <w:t>reuiring</w:t>
+      </w:r>
+      <w:proofErr w:type="spellEnd"/>
+      <w:r>
+        <w:t xml:space="preserve"> more than multiple blocks</w:t>
       </w:r>
       <w:r>
         <w:t xml:space="preserve">, </w:t>
@@ -1966,6 +2643,7 @@
     </w:p>
     <w:p>
       <w:r>
+        <w:lastRenderedPageBreak/>
         <w:t>Using this information, the user know</w:t>
       </w:r>
       <w:r>
@@ -2023,16 +2701,27 @@
         <w:t>saved to a counter read via</w:t>
       </w:r>
       <w:r>
-        <w:t xml:space="preserve"> address 0x48(72). </w:t>
-      </w:r>
-      <w:r>
-        <w:t>During a memory read, they are compared to the Data Request event tag, and the number of times they do not agree is saved to a counter read via address 0x49(73).</w:t>
+        <w:t xml:space="preserve"> address</w:t>
+      </w:r>
+      <w:r>
+        <w:t>=</w:t>
+      </w:r>
+      <w:r>
+        <w:t xml:space="preserve">72. </w:t>
+      </w:r>
+      <w:r>
+        <w:t>During a memory read, they are compared to the Data Request event tag, and the number of times they do not agree is saved to a counter read via</w:t>
+      </w:r>
+      <w:r>
+        <w:t xml:space="preserve"> address=</w:t>
+      </w:r>
+      <w:r>
+        <w:t>73.</w:t>
       </w:r>
     </w:p>
     <w:p/>
     <w:p>
       <w:r>
-        <w:lastRenderedPageBreak/>
         <w:t xml:space="preserve">To have an idea of </w:t>
       </w:r>
       <w:r>
@@ -2078,7 +2767,7 @@
           <w:bCs/>
         </w:rPr>
       </w:pPr>
-      <w:bookmarkStart w:id="2" w:name="RS485"/>
+      <w:bookmarkStart w:id="3" w:name="RS485"/>
     </w:p>
     <w:p>
       <w:pPr>
@@ -2109,7 +2798,7 @@
         </w:rPr>
         <w:t>485 Interface</w:t>
       </w:r>
-      <w:bookmarkEnd w:id="2"/>
+      <w:bookmarkEnd w:id="3"/>
       <w:r>
         <w:t xml:space="preserve">: </w:t>
       </w:r>
@@ -2844,7 +3533,16 @@
           <w:sz w:val="24"/>
           <w:szCs w:val="24"/>
         </w:rPr>
-        <w:t xml:space="preserve"> (default value=0)</w:t>
+        <w:t xml:space="preserve"> </w:t>
+      </w:r>
+      <w:r>
+        <w:rPr>
+          <w:rFonts w:asciiTheme="minorHAnsi" w:hAnsiTheme="minorHAnsi" w:cstheme="minorHAnsi"/>
+          <w:sz w:val="24"/>
+          <w:szCs w:val="24"/>
+        </w:rPr>
+        <w:lastRenderedPageBreak/>
+        <w:t>(default value=0)</w:t>
       </w:r>
       <w:r>
         <w:rPr>
@@ -3080,7 +3778,6 @@
           <w:sz w:val="24"/>
           <w:szCs w:val="24"/>
         </w:rPr>
-        <w:lastRenderedPageBreak/>
         <w:t xml:space="preserve">After decoding the RS485_COMMAND, the </w:t>
       </w:r>
       <w:proofErr w:type="spellStart"/>
@@ -3535,6 +4232,7 @@
         </w:rPr>
       </w:pPr>
     </w:p>
+    <w:bookmarkStart w:id="4" w:name="fine_fiber"/>
     <w:p>
       <w:pPr>
         <w:pStyle w:val="HTMLPreformatted"/>
@@ -3544,8 +4242,140 @@
           <w:szCs w:val="24"/>
         </w:rPr>
       </w:pPr>
-    </w:p>
-    <w:bookmarkStart w:id="3" w:name="fine_fiber"/>
+      <w:r>
+        <w:rPr>
+          <w:rFonts w:asciiTheme="minorHAnsi" w:hAnsiTheme="minorHAnsi" w:cstheme="minorHAnsi"/>
+          <w:sz w:val="24"/>
+          <w:szCs w:val="24"/>
+        </w:rPr>
+        <w:fldChar w:fldCharType="begin"/>
+      </w:r>
+      <w:r>
+        <w:rPr>
+          <w:rFonts w:asciiTheme="minorHAnsi" w:hAnsiTheme="minorHAnsi" w:cstheme="minorHAnsi"/>
+          <w:sz w:val="24"/>
+          <w:szCs w:val="24"/>
+        </w:rPr>
+        <w:instrText>HYPERLINK  \l "_top"</w:instrText>
+      </w:r>
+      <w:r>
+        <w:rPr>
+          <w:rFonts w:asciiTheme="minorHAnsi" w:hAnsiTheme="minorHAnsi" w:cstheme="minorHAnsi"/>
+          <w:sz w:val="24"/>
+          <w:szCs w:val="24"/>
+        </w:rPr>
+      </w:r>
+      <w:r>
+        <w:rPr>
+          <w:rFonts w:asciiTheme="minorHAnsi" w:hAnsiTheme="minorHAnsi" w:cstheme="minorHAnsi"/>
+          <w:sz w:val="24"/>
+          <w:szCs w:val="24"/>
+        </w:rPr>
+        <w:fldChar w:fldCharType="separate"/>
+      </w:r>
+      <w:r>
+        <w:rPr>
+          <w:rStyle w:val="Hyperlink"/>
+          <w:rFonts w:asciiTheme="minorHAnsi" w:hAnsiTheme="minorHAnsi" w:cstheme="minorHAnsi"/>
+          <w:sz w:val="24"/>
+          <w:szCs w:val="24"/>
+        </w:rPr>
+        <w:t>Fine Fiber synchronization</w:t>
+      </w:r>
+      <w:bookmarkEnd w:id="4"/>
+      <w:r>
+        <w:rPr>
+          <w:rFonts w:asciiTheme="minorHAnsi" w:hAnsiTheme="minorHAnsi" w:cstheme="minorHAnsi"/>
+          <w:sz w:val="24"/>
+          <w:szCs w:val="24"/>
+        </w:rPr>
+        <w:fldChar w:fldCharType="end"/>
+      </w:r>
+      <w:r>
+        <w:rPr>
+          <w:rFonts w:asciiTheme="minorHAnsi" w:hAnsiTheme="minorHAnsi" w:cstheme="minorHAnsi"/>
+          <w:sz w:val="24"/>
+          <w:szCs w:val="24"/>
+        </w:rPr>
+        <w:t>: this fe</w:t>
+      </w:r>
+      <w:r>
+        <w:rPr>
+          <w:rFonts w:asciiTheme="minorHAnsi" w:hAnsiTheme="minorHAnsi" w:cstheme="minorHAnsi"/>
+          <w:sz w:val="24"/>
+          <w:szCs w:val="24"/>
+        </w:rPr>
+        <w:t>atures allow</w:t>
+      </w:r>
+      <w:r>
+        <w:rPr>
+          <w:rFonts w:asciiTheme="minorHAnsi" w:hAnsiTheme="minorHAnsi" w:cstheme="minorHAnsi"/>
+          <w:sz w:val="24"/>
+          <w:szCs w:val="24"/>
+        </w:rPr>
+        <w:t>s</w:t>
+      </w:r>
+      <w:r>
+        <w:rPr>
+          <w:rFonts w:asciiTheme="minorHAnsi" w:hAnsiTheme="minorHAnsi" w:cstheme="minorHAnsi"/>
+          <w:sz w:val="24"/>
+          <w:szCs w:val="24"/>
+        </w:rPr>
+        <w:t xml:space="preserve"> for a fine alignment of the DTC fiber data at the 5ns/20 = 250 </w:t>
+      </w:r>
+      <w:proofErr w:type="spellStart"/>
+      <w:r>
+        <w:rPr>
+          <w:rFonts w:asciiTheme="minorHAnsi" w:hAnsiTheme="minorHAnsi" w:cstheme="minorHAnsi"/>
+          <w:sz w:val="24"/>
+          <w:szCs w:val="24"/>
+        </w:rPr>
+        <w:t>ps</w:t>
+      </w:r>
+      <w:proofErr w:type="spellEnd"/>
+      <w:r>
+        <w:rPr>
+          <w:rFonts w:asciiTheme="minorHAnsi" w:hAnsiTheme="minorHAnsi" w:cstheme="minorHAnsi"/>
+          <w:sz w:val="24"/>
+          <w:szCs w:val="24"/>
+        </w:rPr>
+        <w:t xml:space="preserve"> level. It sets the 20-bit word encoding of the 0x3CBC character word used to lock the DTC fiber to one of its 20-possible values</w:t>
+      </w:r>
+      <w:r>
+        <w:rPr>
+          <w:rFonts w:asciiTheme="minorHAnsi" w:hAnsiTheme="minorHAnsi" w:cstheme="minorHAnsi"/>
+          <w:sz w:val="24"/>
+          <w:szCs w:val="24"/>
+        </w:rPr>
+        <w:t>. Any other value, sampled during the fiber locking and alignment process, generated a reset of the fiber transceiver.</w:t>
+      </w:r>
+      <w:r>
+        <w:rPr>
+          <w:rFonts w:asciiTheme="minorHAnsi" w:hAnsiTheme="minorHAnsi" w:cstheme="minorHAnsi"/>
+          <w:sz w:val="24"/>
+          <w:szCs w:val="24"/>
+        </w:rPr>
+        <w:t xml:space="preserve"> Default value = 0x941CF. Alternative values: 0x941CF </w:t>
+      </w:r>
+      <w:proofErr w:type="spellStart"/>
+      <w:r>
+        <w:rPr>
+          <w:rFonts w:asciiTheme="minorHAnsi" w:hAnsiTheme="minorHAnsi" w:cstheme="minorHAnsi"/>
+          <w:sz w:val="24"/>
+          <w:szCs w:val="24"/>
+        </w:rPr>
+        <w:t>right_shifted</w:t>
+      </w:r>
+      <w:proofErr w:type="spellEnd"/>
+      <w:r>
+        <w:rPr>
+          <w:rFonts w:asciiTheme="minorHAnsi" w:hAnsiTheme="minorHAnsi" w:cstheme="minorHAnsi"/>
+          <w:sz w:val="24"/>
+          <w:szCs w:val="24"/>
+        </w:rPr>
+        <w:t xml:space="preserve"> by BITSLIP_COUNTER[4:0], where BITSLIP_COUNTER goes from 0 to 20.</w:t>
+      </w:r>
+    </w:p>
     <w:p>
       <w:pPr>
         <w:pStyle w:val="HTMLPreformatted"/>
@@ -3555,86 +4385,47 @@
           <w:szCs w:val="24"/>
         </w:rPr>
       </w:pPr>
-      <w:r>
-        <w:rPr>
-          <w:rFonts w:asciiTheme="minorHAnsi" w:hAnsiTheme="minorHAnsi" w:cstheme="minorHAnsi"/>
-          <w:sz w:val="24"/>
-          <w:szCs w:val="24"/>
-        </w:rPr>
-        <w:fldChar w:fldCharType="begin"/>
-      </w:r>
-      <w:r>
-        <w:rPr>
-          <w:rFonts w:asciiTheme="minorHAnsi" w:hAnsiTheme="minorHAnsi" w:cstheme="minorHAnsi"/>
-          <w:sz w:val="24"/>
-          <w:szCs w:val="24"/>
-        </w:rPr>
-        <w:instrText>HYPERLINK  \l "_top"</w:instrText>
-      </w:r>
-      <w:r>
-        <w:rPr>
-          <w:rFonts w:asciiTheme="minorHAnsi" w:hAnsiTheme="minorHAnsi" w:cstheme="minorHAnsi"/>
-          <w:sz w:val="24"/>
-          <w:szCs w:val="24"/>
-        </w:rPr>
-      </w:r>
-      <w:r>
-        <w:rPr>
-          <w:rFonts w:asciiTheme="minorHAnsi" w:hAnsiTheme="minorHAnsi" w:cstheme="minorHAnsi"/>
-          <w:sz w:val="24"/>
-          <w:szCs w:val="24"/>
-        </w:rPr>
-        <w:fldChar w:fldCharType="separate"/>
-      </w:r>
-      <w:r>
-        <w:rPr>
-          <w:rStyle w:val="Hyperlink"/>
-          <w:rFonts w:asciiTheme="minorHAnsi" w:hAnsiTheme="minorHAnsi" w:cstheme="minorHAnsi"/>
-          <w:sz w:val="24"/>
-          <w:szCs w:val="24"/>
-        </w:rPr>
-        <w:t>Fine Fiber synchronization</w:t>
-      </w:r>
-      <w:bookmarkEnd w:id="3"/>
-      <w:r>
-        <w:rPr>
-          <w:rFonts w:asciiTheme="minorHAnsi" w:hAnsiTheme="minorHAnsi" w:cstheme="minorHAnsi"/>
-          <w:sz w:val="24"/>
-          <w:szCs w:val="24"/>
-        </w:rPr>
-        <w:fldChar w:fldCharType="end"/>
-      </w:r>
-      <w:r>
-        <w:rPr>
-          <w:rFonts w:asciiTheme="minorHAnsi" w:hAnsiTheme="minorHAnsi" w:cstheme="minorHAnsi"/>
-          <w:sz w:val="24"/>
-          <w:szCs w:val="24"/>
-        </w:rPr>
-        <w:t>: this fe</w:t>
-      </w:r>
-      <w:r>
-        <w:rPr>
-          <w:rFonts w:asciiTheme="minorHAnsi" w:hAnsiTheme="minorHAnsi" w:cstheme="minorHAnsi"/>
-          <w:sz w:val="24"/>
-          <w:szCs w:val="24"/>
-        </w:rPr>
-        <w:t>atures allow</w:t>
-      </w:r>
-      <w:r>
-        <w:rPr>
-          <w:rFonts w:asciiTheme="minorHAnsi" w:hAnsiTheme="minorHAnsi" w:cstheme="minorHAnsi"/>
-          <w:sz w:val="24"/>
-          <w:szCs w:val="24"/>
-        </w:rPr>
-        <w:t>s</w:t>
-      </w:r>
-      <w:r>
-        <w:rPr>
-          <w:rFonts w:asciiTheme="minorHAnsi" w:hAnsiTheme="minorHAnsi" w:cstheme="minorHAnsi"/>
-          <w:sz w:val="24"/>
-          <w:szCs w:val="24"/>
-        </w:rPr>
-        <w:t xml:space="preserve"> for a fine alignment of the DTC fiber data at the 5ns/20 = 250 </w:t>
+    </w:p>
+    <w:p>
+      <w:pPr>
+        <w:pStyle w:val="HTMLPreformatted"/>
+        <w:rPr>
+          <w:rFonts w:asciiTheme="minorHAnsi" w:hAnsiTheme="minorHAnsi" w:cstheme="minorHAnsi"/>
+          <w:sz w:val="24"/>
+          <w:szCs w:val="24"/>
+        </w:rPr>
+      </w:pPr>
+      <w:r>
+        <w:rPr>
+          <w:rFonts w:asciiTheme="minorHAnsi" w:hAnsiTheme="minorHAnsi" w:cstheme="minorHAnsi"/>
+          <w:sz w:val="24"/>
+          <w:szCs w:val="24"/>
+        </w:rPr>
+        <w:t xml:space="preserve">This alignment </w:t>
+      </w:r>
+      <w:r>
+        <w:rPr>
+          <w:rFonts w:asciiTheme="minorHAnsi" w:hAnsiTheme="minorHAnsi" w:cstheme="minorHAnsi"/>
+          <w:sz w:val="24"/>
+          <w:szCs w:val="24"/>
+        </w:rPr>
+        <w:t>procedure</w:t>
+      </w:r>
+      <w:r>
+        <w:rPr>
+          <w:rFonts w:asciiTheme="minorHAnsi" w:hAnsiTheme="minorHAnsi" w:cstheme="minorHAnsi"/>
+          <w:sz w:val="24"/>
+          <w:szCs w:val="24"/>
+        </w:rPr>
+        <w:t xml:space="preserve"> is driven by </w:t>
+      </w:r>
+      <w:r>
+        <w:rPr>
+          <w:rFonts w:asciiTheme="minorHAnsi" w:hAnsiTheme="minorHAnsi" w:cstheme="minorHAnsi"/>
+          <w:sz w:val="24"/>
+          <w:szCs w:val="24"/>
+        </w:rPr>
+        <w:t>the TOP_SERDES/</w:t>
       </w:r>
       <w:proofErr w:type="spellStart"/>
       <w:r>
@@ -3643,7 +4434,7 @@
           <w:sz w:val="24"/>
           <w:szCs w:val="24"/>
         </w:rPr>
-        <w:t>ps</w:t>
+        <w:t>XCVR_Block</w:t>
       </w:r>
       <w:proofErr w:type="spellEnd"/>
       <w:r>
@@ -3652,23 +4443,7 @@
           <w:sz w:val="24"/>
           <w:szCs w:val="24"/>
         </w:rPr>
-        <w:t xml:space="preserve"> level. It sets the 20-bit word encoding of the 0x3CBC character word used to lock the DTC fiber to one of its 20-possible values</w:t>
-      </w:r>
-      <w:r>
-        <w:rPr>
-          <w:rFonts w:asciiTheme="minorHAnsi" w:hAnsiTheme="minorHAnsi" w:cstheme="minorHAnsi"/>
-          <w:sz w:val="24"/>
-          <w:szCs w:val="24"/>
-        </w:rPr>
-        <w:t>. Any other value, sampled during the fiber locking and alignment process, generated a reset of the fiber transceiver.</w:t>
-      </w:r>
-      <w:r>
-        <w:rPr>
-          <w:rFonts w:asciiTheme="minorHAnsi" w:hAnsiTheme="minorHAnsi" w:cstheme="minorHAnsi"/>
-          <w:sz w:val="24"/>
-          <w:szCs w:val="24"/>
-        </w:rPr>
-        <w:t xml:space="preserve"> Default value = 0x941CF. Alternative values: 0x941CF </w:t>
+        <w:t>/</w:t>
       </w:r>
       <w:proofErr w:type="spellStart"/>
       <w:r>
@@ -3677,7 +4452,31 @@
           <w:sz w:val="24"/>
           <w:szCs w:val="24"/>
         </w:rPr>
-        <w:t>right_shifted</w:t>
+        <w:t>Clock_align</w:t>
+      </w:r>
+      <w:r>
+        <w:rPr>
+          <w:rFonts w:asciiTheme="minorHAnsi" w:hAnsiTheme="minorHAnsi" w:cstheme="minorHAnsi"/>
+          <w:sz w:val="24"/>
+          <w:szCs w:val="24"/>
+        </w:rPr>
+        <w:t>er</w:t>
+      </w:r>
+      <w:r>
+        <w:rPr>
+          <w:rFonts w:asciiTheme="minorHAnsi" w:hAnsiTheme="minorHAnsi" w:cstheme="minorHAnsi"/>
+          <w:sz w:val="24"/>
+          <w:szCs w:val="24"/>
+        </w:rPr>
+        <w:t>.</w:t>
+      </w:r>
+      <w:r>
+        <w:rPr>
+          <w:rFonts w:asciiTheme="minorHAnsi" w:hAnsiTheme="minorHAnsi" w:cstheme="minorHAnsi"/>
+          <w:sz w:val="24"/>
+          <w:szCs w:val="24"/>
+        </w:rPr>
+        <w:t>vhd</w:t>
       </w:r>
       <w:proofErr w:type="spellEnd"/>
       <w:r>
@@ -3686,7 +4485,23 @@
           <w:sz w:val="24"/>
           <w:szCs w:val="24"/>
         </w:rPr>
-        <w:t xml:space="preserve"> by BITSLIP_COUNTER[4:0], where BITSLIP_COUNTER goes from 0 to 20.</w:t>
+        <w:t xml:space="preserve"> </w:t>
+      </w:r>
+      <w:r>
+        <w:rPr>
+          <w:rFonts w:asciiTheme="minorHAnsi" w:hAnsiTheme="minorHAnsi" w:cstheme="minorHAnsi"/>
+          <w:sz w:val="24"/>
+          <w:szCs w:val="24"/>
+        </w:rPr>
+        <w:t>module</w:t>
+      </w:r>
+      <w:r>
+        <w:rPr>
+          <w:rFonts w:asciiTheme="minorHAnsi" w:hAnsiTheme="minorHAnsi" w:cstheme="minorHAnsi"/>
+          <w:sz w:val="24"/>
+          <w:szCs w:val="24"/>
+        </w:rPr>
+        <w:t xml:space="preserve"> and control by DRAC register 1, which is a RD/WR register.</w:t>
       </w:r>
     </w:p>
     <w:p>
@@ -3714,107 +4529,23 @@
           <w:sz w:val="24"/>
           <w:szCs w:val="24"/>
         </w:rPr>
-        <w:t xml:space="preserve">This alignment </w:t>
-      </w:r>
-      <w:r>
-        <w:rPr>
-          <w:rFonts w:asciiTheme="minorHAnsi" w:hAnsiTheme="minorHAnsi" w:cstheme="minorHAnsi"/>
-          <w:sz w:val="24"/>
-          <w:szCs w:val="24"/>
-        </w:rPr>
-        <w:t>procedure</w:t>
-      </w:r>
-      <w:r>
-        <w:rPr>
-          <w:rFonts w:asciiTheme="minorHAnsi" w:hAnsiTheme="minorHAnsi" w:cstheme="minorHAnsi"/>
-          <w:sz w:val="24"/>
-          <w:szCs w:val="24"/>
-        </w:rPr>
-        <w:t xml:space="preserve"> is driven by </w:t>
-      </w:r>
-      <w:r>
-        <w:rPr>
-          <w:rFonts w:asciiTheme="minorHAnsi" w:hAnsiTheme="minorHAnsi" w:cstheme="minorHAnsi"/>
-          <w:sz w:val="24"/>
-          <w:szCs w:val="24"/>
-        </w:rPr>
-        <w:t>the TOP_SERDES/</w:t>
-      </w:r>
-      <w:proofErr w:type="spellStart"/>
-      <w:r>
-        <w:rPr>
-          <w:rFonts w:asciiTheme="minorHAnsi" w:hAnsiTheme="minorHAnsi" w:cstheme="minorHAnsi"/>
-          <w:sz w:val="24"/>
-          <w:szCs w:val="24"/>
-        </w:rPr>
-        <w:t>XCVR_Block</w:t>
-      </w:r>
-      <w:proofErr w:type="spellEnd"/>
-      <w:r>
-        <w:rPr>
-          <w:rFonts w:asciiTheme="minorHAnsi" w:hAnsiTheme="minorHAnsi" w:cstheme="minorHAnsi"/>
-          <w:sz w:val="24"/>
-          <w:szCs w:val="24"/>
-        </w:rPr>
-        <w:t>/</w:t>
-      </w:r>
-      <w:proofErr w:type="spellStart"/>
-      <w:r>
-        <w:rPr>
-          <w:rFonts w:asciiTheme="minorHAnsi" w:hAnsiTheme="minorHAnsi" w:cstheme="minorHAnsi"/>
-          <w:sz w:val="24"/>
-          <w:szCs w:val="24"/>
-        </w:rPr>
-        <w:t>Clock_align</w:t>
-      </w:r>
-      <w:r>
-        <w:rPr>
-          <w:rFonts w:asciiTheme="minorHAnsi" w:hAnsiTheme="minorHAnsi" w:cstheme="minorHAnsi"/>
-          <w:sz w:val="24"/>
-          <w:szCs w:val="24"/>
-        </w:rPr>
-        <w:t>er</w:t>
-      </w:r>
-      <w:r>
-        <w:rPr>
-          <w:rFonts w:asciiTheme="minorHAnsi" w:hAnsiTheme="minorHAnsi" w:cstheme="minorHAnsi"/>
-          <w:sz w:val="24"/>
-          <w:szCs w:val="24"/>
-        </w:rPr>
-        <w:t>.</w:t>
-      </w:r>
-      <w:r>
-        <w:rPr>
-          <w:rFonts w:asciiTheme="minorHAnsi" w:hAnsiTheme="minorHAnsi" w:cstheme="minorHAnsi"/>
-          <w:sz w:val="24"/>
-          <w:szCs w:val="24"/>
-        </w:rPr>
-        <w:t>vhd</w:t>
-      </w:r>
-      <w:proofErr w:type="spellEnd"/>
-      <w:r>
-        <w:rPr>
-          <w:rFonts w:asciiTheme="minorHAnsi" w:hAnsiTheme="minorHAnsi" w:cstheme="minorHAnsi"/>
-          <w:sz w:val="24"/>
-          <w:szCs w:val="24"/>
-        </w:rPr>
-        <w:t xml:space="preserve"> </w:t>
-      </w:r>
-      <w:r>
-        <w:rPr>
-          <w:rFonts w:asciiTheme="minorHAnsi" w:hAnsiTheme="minorHAnsi" w:cstheme="minorHAnsi"/>
-          <w:sz w:val="24"/>
-          <w:szCs w:val="24"/>
-        </w:rPr>
-        <w:t>module</w:t>
-      </w:r>
-      <w:r>
-        <w:rPr>
-          <w:rFonts w:asciiTheme="minorHAnsi" w:hAnsiTheme="minorHAnsi" w:cstheme="minorHAnsi"/>
-          <w:sz w:val="24"/>
-          <w:szCs w:val="24"/>
-        </w:rPr>
-        <w:t xml:space="preserve"> and control by DRAC register 1, which is a RD/WR register.</w:t>
+        <w:t>DCS write to address</w:t>
+      </w:r>
+      <w:r>
+        <w:rPr>
+          <w:rFonts w:asciiTheme="minorHAnsi" w:hAnsiTheme="minorHAnsi" w:cstheme="minorHAnsi"/>
+          <w:sz w:val="24"/>
+          <w:szCs w:val="24"/>
+        </w:rPr>
+        <w:t>=1</w:t>
+      </w:r>
+      <w:r>
+        <w:rPr>
+          <w:rFonts w:asciiTheme="minorHAnsi" w:hAnsiTheme="minorHAnsi" w:cstheme="minorHAnsi"/>
+          <w:sz w:val="24"/>
+          <w:szCs w:val="24"/>
+        </w:rPr>
+        <w:t xml:space="preserve">  sets BITSLIP_COUNTER and starts the alignment procedure.</w:t>
       </w:r>
     </w:p>
     <w:p>
@@ -3842,35 +4573,23 @@
           <w:sz w:val="24"/>
           <w:szCs w:val="24"/>
         </w:rPr>
-        <w:t>DCS write to address 0x1  sets BITSLIP_COUNTER and starts the alignment procedure.</w:t>
-      </w:r>
-    </w:p>
-    <w:p>
-      <w:pPr>
-        <w:pStyle w:val="HTMLPreformatted"/>
-        <w:rPr>
-          <w:rFonts w:asciiTheme="minorHAnsi" w:hAnsiTheme="minorHAnsi" w:cstheme="minorHAnsi"/>
-          <w:sz w:val="24"/>
-          <w:szCs w:val="24"/>
-        </w:rPr>
-      </w:pPr>
-    </w:p>
-    <w:p>
-      <w:pPr>
-        <w:pStyle w:val="HTMLPreformatted"/>
-        <w:rPr>
-          <w:rFonts w:asciiTheme="minorHAnsi" w:hAnsiTheme="minorHAnsi" w:cstheme="minorHAnsi"/>
-          <w:sz w:val="24"/>
-          <w:szCs w:val="24"/>
-        </w:rPr>
-      </w:pPr>
-      <w:r>
-        <w:rPr>
-          <w:rFonts w:asciiTheme="minorHAnsi" w:hAnsiTheme="minorHAnsi" w:cstheme="minorHAnsi"/>
-          <w:sz w:val="24"/>
-          <w:szCs w:val="24"/>
-        </w:rPr>
-        <w:t xml:space="preserve">DCS read of address 0x1 returns: </w:t>
+        <w:t>DCS read of address</w:t>
+      </w:r>
+      <w:r>
+        <w:rPr>
+          <w:rFonts w:asciiTheme="minorHAnsi" w:hAnsiTheme="minorHAnsi" w:cstheme="minorHAnsi"/>
+          <w:sz w:val="24"/>
+          <w:szCs w:val="24"/>
+        </w:rPr>
+        <w:t>=1</w:t>
+      </w:r>
+      <w:r>
+        <w:rPr>
+          <w:rFonts w:asciiTheme="minorHAnsi" w:hAnsiTheme="minorHAnsi" w:cstheme="minorHAnsi"/>
+          <w:sz w:val="24"/>
+          <w:szCs w:val="24"/>
+        </w:rPr>
+        <w:t xml:space="preserve"> returns: </w:t>
       </w:r>
     </w:p>
     <w:p>
@@ -3910,36 +4629,11 @@
         <w:tab/>
         <w:t>bit[4:0]=BITSLIP_COUNTER</w:t>
       </w:r>
-    </w:p>
-    <w:p>
-      <w:pPr>
-        <w:rPr>
-          <w:u w:val="single"/>
-        </w:rPr>
-      </w:pPr>
-    </w:p>
-    <w:p>
-      <w:pPr>
-        <w:rPr>
-          <w:b/>
-          <w:bCs/>
-        </w:rPr>
-      </w:pPr>
-    </w:p>
-    <w:p>
-      <w:pPr>
-        <w:rPr>
-          <w:b/>
-          <w:bCs/>
-        </w:rPr>
-      </w:pPr>
-    </w:p>
-    <w:p>
       <w:r>
         <w:br w:type="page"/>
       </w:r>
     </w:p>
-    <w:bookmarkStart w:id="4" w:name="digi_rw"/>
+    <w:bookmarkStart w:id="5" w:name="digi_rw"/>
     <w:p>
       <w:r>
         <w:lastRenderedPageBreak/>
@@ -3960,7 +4654,7 @@
       <w:r>
         <w:fldChar w:fldCharType="end"/>
       </w:r>
-      <w:bookmarkEnd w:id="4"/>
+      <w:bookmarkEnd w:id="5"/>
       <w:r>
         <w:t xml:space="preserve">: this feature allows to send RD/WR commands </w:t>
       </w:r>
@@ -4048,19 +4742,31 @@
       </w:r>
       <w:proofErr w:type="spellEnd"/>
       <w:r>
-        <w:t>.  It can be set high via a DCS write to address 6. A DCS read of address 6 returns its current value. Default set to 0</w:t>
+        <w:t>.  It can be set high via a DCS write to address</w:t>
+      </w:r>
+      <w:r>
+        <w:t>=</w:t>
+      </w:r>
+      <w:r>
+        <w:t>6. A DCS read of address</w:t>
+      </w:r>
+      <w:r>
+        <w:t>=</w:t>
+      </w:r>
+      <w:r>
+        <w:t>6 returns its current value. Default set to 0</w:t>
       </w:r>
     </w:p>
     <w:p/>
     <w:p>
       <w:r>
-        <w:t>DCS_CAL_INIT:  set to 1/0  via DCS write of address (0x1</w:t>
-      </w:r>
-      <w:r>
-        <w:t>7</w:t>
-      </w:r>
-      <w:r>
-        <w:t>)23</w:t>
+        <w:t>DCS_CAL_INIT:  set to 1/0  via DCS write of address</w:t>
+      </w:r>
+      <w:r>
+        <w:t>=</w:t>
+      </w:r>
+      <w:r>
+        <w:t>23</w:t>
       </w:r>
       <w:r>
         <w:t>. Must toggle 1-&gt;0 after address and data are set.</w:t>
@@ -4068,13 +4774,13 @@
     </w:p>
     <w:p>
       <w:r>
-        <w:t>DCS_CAL_DATA_IN[15:0]:   set via DCS write of address (0x1</w:t>
-      </w:r>
-      <w:r>
-        <w:t>8</w:t>
-      </w:r>
-      <w:r>
-        <w:t>)2</w:t>
+        <w:t>DCS_CAL_DATA_IN[15:0]:   set via DCS write of address</w:t>
+      </w:r>
+      <w:r>
+        <w:t>=</w:t>
+      </w:r>
+      <w:r>
+        <w:t>2</w:t>
       </w:r>
       <w:r>
         <w:t>4</w:t>
@@ -4082,43 +4788,91 @@
     </w:p>
     <w:p>
       <w:r>
-        <w:t>DCS_CAL_ADDR[8:0]:   set via DCS write of address (0x19)25,  where bit[8]=1 if RD, 0 if WR</w:t>
-      </w:r>
-    </w:p>
-    <w:p>
-      <w:r>
-        <w:t>DCS_CAL_BUSY: status reported by bit[0] of DCS read of address 0x45(69)</w:t>
-      </w:r>
-    </w:p>
-    <w:p>
-      <w:r>
-        <w:t>DCS_CAL_DATA_OUT[15:0]:   reported via DCS read of address 0x46(70) after BUSY is released</w:t>
+        <w:t>DCS_CAL_ADDR[8:0]:   set via DCS write of address</w:t>
+      </w:r>
+      <w:r>
+        <w:t>=</w:t>
+      </w:r>
+      <w:r>
+        <w:t>25,  where bit[8]=1 if RD, 0 if WR</w:t>
+      </w:r>
+    </w:p>
+    <w:p>
+      <w:r>
+        <w:t>DCS_CAL_BUSY: status reported by bit[0] of DCS read of addres</w:t>
+      </w:r>
+      <w:r>
+        <w:t>s=</w:t>
+      </w:r>
+      <w:r>
+        <w:t>69</w:t>
+      </w:r>
+    </w:p>
+    <w:p>
+      <w:r>
+        <w:t>DCS_CAL_DATA_OUT[15:0]:   reported via DCS read of address</w:t>
+      </w:r>
+      <w:r>
+        <w:t>=</w:t>
+      </w:r>
+      <w:r>
+        <w:t>70 after BUSY is released</w:t>
       </w:r>
     </w:p>
     <w:p/>
     <w:p>
       <w:r>
-        <w:t>DCS_HV_INIT:  set to 1/0  via DCS write of address (0x1A)26. Must toggle 1-&gt;0 after address and data are set.</w:t>
-      </w:r>
-    </w:p>
-    <w:p>
-      <w:r>
-        <w:t>DCS_HV_DATA_IN[15:0]:   set via DCS write of address (0x1B)27</w:t>
-      </w:r>
-    </w:p>
-    <w:p>
-      <w:r>
-        <w:t>DCS_HV_ADDR[8:0]:   set via DCS write of address (0x1C)28,  where bit[8]=1 if RD, 0 if WR</w:t>
-      </w:r>
-    </w:p>
-    <w:p>
-      <w:r>
-        <w:t>DCS_HV_BUSY: status reported by bit[4] of DCS read of address 0x45(69)</w:t>
-      </w:r>
-    </w:p>
-    <w:p>
-      <w:r>
-        <w:t>DCS_CAL_DATA_OUT[15:0]:   reported via DCS read of address 0x47(71) after BUSY is released</w:t>
+        <w:t>DCS_HV_INIT:  set to 1/0  via DCS write of address</w:t>
+      </w:r>
+      <w:r>
+        <w:t>=</w:t>
+      </w:r>
+      <w:r>
+        <w:t>26. Must toggle 1-&gt;0 after address and data are set.</w:t>
+      </w:r>
+    </w:p>
+    <w:p>
+      <w:r>
+        <w:t>DCS_HV_DATA_IN[15:0]:   set via DCS write of address</w:t>
+      </w:r>
+      <w:r>
+        <w:t>=</w:t>
+      </w:r>
+      <w:r>
+        <w:t>27</w:t>
+      </w:r>
+    </w:p>
+    <w:p>
+      <w:r>
+        <w:t>DCS_HV_ADDR[8:0]:   set via DCS write of address</w:t>
+      </w:r>
+      <w:r>
+        <w:t>=</w:t>
+      </w:r>
+      <w:r>
+        <w:t>28,  where bit[8]=1 if RD, 0 if WR</w:t>
+      </w:r>
+    </w:p>
+    <w:p>
+      <w:r>
+        <w:t>DCS_HV_BUSY: status reported by bit[4] of DCS read of address</w:t>
+      </w:r>
+      <w:r>
+        <w:t>=</w:t>
+      </w:r>
+      <w:r>
+        <w:t>69</w:t>
+      </w:r>
+    </w:p>
+    <w:p>
+      <w:r>
+        <w:t>DCS_CAL_DATA_OUT[15:0]:   reported via DCS read of address</w:t>
+      </w:r>
+      <w:r>
+        <w:t>=</w:t>
+      </w:r>
+      <w:r>
+        <w:t>71 after BUSY is released</w:t>
       </w:r>
     </w:p>
     <w:p/>
@@ -4140,7 +4894,7 @@
       <w:r>
         <w:t xml:space="preserve">: </w:t>
       </w:r>
-      <w:bookmarkStart w:id="5" w:name="rd_tag"/>
+      <w:bookmarkStart w:id="6" w:name="rd_tag"/>
       <w:r>
         <w:rPr>
           <w:b/>
@@ -4180,7 +4934,7 @@
         </w:rPr>
         <w:t>READ OF EVENT TAG in DIGI</w:t>
       </w:r>
-      <w:bookmarkEnd w:id="5"/>
+      <w:bookmarkEnd w:id="6"/>
       <w:r>
         <w:rPr>
           <w:b/>
@@ -4999,7 +5753,7 @@
         </w:rPr>
         <w:t xml:space="preserve"> commands, disable TWI by writing data = 0 to  reg = 6 </w:t>
       </w:r>
-      <w:bookmarkStart w:id="6" w:name="disables"/>
+      <w:bookmarkStart w:id="7" w:name="disables"/>
     </w:p>
     <w:p>
       <w:pPr>
@@ -5015,7 +5769,6 @@
           <w:sz w:val="21"/>
           <w:szCs w:val="21"/>
         </w:rPr>
-        <w:lastRenderedPageBreak/>
         <w:t>Example 2:</w:t>
       </w:r>
       <w:r>
@@ -5092,6 +5845,7 @@
           <w:sz w:val="21"/>
           <w:szCs w:val="21"/>
         </w:rPr>
+        <w:lastRenderedPageBreak/>
         <w:t>Read reg = 6. If return 0, w</w:t>
       </w:r>
       <w:r>
@@ -5714,7 +6468,7 @@
           </w:rPr>
           <w:t>Disabled features:</w:t>
         </w:r>
-        <w:bookmarkEnd w:id="6"/>
+        <w:bookmarkEnd w:id="7"/>
       </w:hyperlink>
     </w:p>
     <w:p>
@@ -5724,7 +6478,7 @@
         </w:rPr>
       </w:pPr>
     </w:p>
-    <w:bookmarkStart w:id="7" w:name="error_counter"/>
+    <w:bookmarkStart w:id="8" w:name="error_counter"/>
     <w:p>
       <w:pPr>
         <w:pStyle w:val="ListParagraph"/>
@@ -5735,6 +6489,7 @@
         <w:rPr>
           <w:b/>
           <w:bCs/>
+          <w:color w:val="A5A5A5" w:themeColor="accent3"/>
           <w:sz w:val="22"/>
           <w:szCs w:val="22"/>
           <w:u w:val="single"/>
@@ -5744,6 +6499,7 @@
         <w:rPr>
           <w:b/>
           <w:bCs/>
+          <w:color w:val="A5A5A5" w:themeColor="accent3"/>
           <w:sz w:val="22"/>
           <w:szCs w:val="22"/>
           <w:u w:val="single"/>
@@ -5754,6 +6510,7 @@
         <w:rPr>
           <w:b/>
           <w:bCs/>
+          <w:color w:val="A5A5A5" w:themeColor="accent3"/>
           <w:sz w:val="22"/>
           <w:szCs w:val="22"/>
           <w:u w:val="single"/>
@@ -5764,6 +6521,7 @@
         <w:rPr>
           <w:b/>
           <w:bCs/>
+          <w:color w:val="A5A5A5" w:themeColor="accent3"/>
           <w:sz w:val="22"/>
           <w:szCs w:val="22"/>
           <w:u w:val="single"/>
@@ -5773,6 +6531,7 @@
         <w:rPr>
           <w:b/>
           <w:bCs/>
+          <w:color w:val="A5A5A5" w:themeColor="accent3"/>
           <w:sz w:val="22"/>
           <w:szCs w:val="22"/>
           <w:u w:val="single"/>
@@ -5784,16 +6543,18 @@
           <w:rStyle w:val="Hyperlink"/>
           <w:b/>
           <w:bCs/>
+          <w:color w:val="A5A5A5" w:themeColor="accent3"/>
           <w:sz w:val="22"/>
           <w:szCs w:val="22"/>
         </w:rPr>
         <w:t>Error counters read</w:t>
       </w:r>
-      <w:bookmarkEnd w:id="7"/>
-      <w:r>
-        <w:rPr>
-          <w:b/>
-          <w:bCs/>
+      <w:bookmarkEnd w:id="8"/>
+      <w:r>
+        <w:rPr>
+          <w:b/>
+          <w:bCs/>
+          <w:color w:val="A5A5A5" w:themeColor="accent3"/>
           <w:sz w:val="22"/>
           <w:szCs w:val="22"/>
           <w:u w:val="single"/>
@@ -5806,6 +6567,7 @@
         <w:rPr>
           <w:b/>
           <w:bCs/>
+          <w:color w:val="A5A5A5" w:themeColor="accent3"/>
           <w:u w:val="single"/>
         </w:rPr>
       </w:pPr>
@@ -5813,12 +6575,14 @@
     <w:p>
       <w:pPr>
         <w:rPr>
+          <w:color w:val="A5A5A5" w:themeColor="accent3"/>
           <w:sz w:val="20"/>
           <w:szCs w:val="20"/>
         </w:rPr>
       </w:pPr>
       <w:r>
         <w:rPr>
+          <w:color w:val="A5A5A5" w:themeColor="accent3"/>
           <w:sz w:val="20"/>
           <w:szCs w:val="20"/>
         </w:rPr>
@@ -5828,6 +6592,7 @@
         <w:rPr>
           <w:i/>
           <w:iCs/>
+          <w:color w:val="A5A5A5" w:themeColor="accent3"/>
           <w:sz w:val="20"/>
           <w:szCs w:val="20"/>
         </w:rPr>
@@ -5835,45 +6600,35 @@
       </w:r>
       <w:r>
         <w:rPr>
+          <w:color w:val="A5A5A5" w:themeColor="accent3"/>
           <w:sz w:val="20"/>
           <w:szCs w:val="20"/>
         </w:rPr>
-        <w:t xml:space="preserve"> (both diagnostic counters or FSM states) are </w:t>
-      </w:r>
-      <w:r>
-        <w:rPr>
+        <w:t xml:space="preserve"> (both diagnostic counters or FSM states) are sent to TOP_SERDES/</w:t>
+      </w:r>
+      <w:proofErr w:type="spellStart"/>
+      <w:r>
+        <w:rPr>
+          <w:color w:val="A5A5A5" w:themeColor="accent3"/>
           <w:sz w:val="20"/>
           <w:szCs w:val="20"/>
         </w:rPr>
-        <w:t>sent to</w:t>
-      </w:r>
-      <w:r>
-        <w:rPr>
+        <w:t>ErrorCounter</w:t>
+      </w:r>
+      <w:proofErr w:type="spellEnd"/>
+      <w:r>
+        <w:rPr>
+          <w:color w:val="A5A5A5" w:themeColor="accent3"/>
           <w:sz w:val="20"/>
           <w:szCs w:val="20"/>
         </w:rPr>
-        <w:t xml:space="preserve"> TOP_SERDES/</w:t>
-      </w:r>
-      <w:proofErr w:type="spellStart"/>
-      <w:r>
-        <w:rPr>
-          <w:sz w:val="20"/>
-          <w:szCs w:val="20"/>
-        </w:rPr>
-        <w:t>ErrorCounter</w:t>
-      </w:r>
-      <w:proofErr w:type="spellEnd"/>
-      <w:r>
-        <w:rPr>
-          <w:sz w:val="20"/>
-          <w:szCs w:val="20"/>
-        </w:rPr>
         <w:t xml:space="preserve"> module (see list in “Error_counters_list.xlsx”) and can be read via:</w:t>
       </w:r>
     </w:p>
     <w:p>
       <w:pPr>
         <w:rPr>
+          <w:color w:val="A5A5A5" w:themeColor="accent3"/>
           <w:sz w:val="20"/>
           <w:szCs w:val="20"/>
         </w:rPr>
@@ -5887,6 +6642,7 @@
           <w:numId w:val="12"/>
         </w:numPr>
         <w:rPr>
+          <w:color w:val="A5A5A5" w:themeColor="accent3"/>
           <w:sz w:val="20"/>
           <w:szCs w:val="20"/>
           <w:u w:val="single"/>
@@ -5894,6 +6650,7 @@
       </w:pPr>
       <w:r>
         <w:rPr>
+          <w:color w:val="A5A5A5" w:themeColor="accent3"/>
           <w:sz w:val="20"/>
           <w:szCs w:val="20"/>
         </w:rPr>
@@ -5908,6 +6665,7 @@
           <w:numId w:val="12"/>
         </w:numPr>
         <w:rPr>
+          <w:color w:val="A5A5A5" w:themeColor="accent3"/>
           <w:sz w:val="20"/>
           <w:szCs w:val="20"/>
           <w:u w:val="single"/>
@@ -5915,6 +6673,7 @@
       </w:pPr>
       <w:r>
         <w:rPr>
+          <w:color w:val="A5A5A5" w:themeColor="accent3"/>
           <w:sz w:val="20"/>
           <w:szCs w:val="20"/>
         </w:rPr>
@@ -5929,12 +6688,14 @@
           <w:numId w:val="12"/>
         </w:numPr>
         <w:rPr>
+          <w:color w:val="A5A5A5" w:themeColor="accent3"/>
           <w:sz w:val="20"/>
           <w:szCs w:val="20"/>
         </w:rPr>
       </w:pPr>
       <w:r>
         <w:rPr>
+          <w:color w:val="A5A5A5" w:themeColor="accent3"/>
           <w:sz w:val="20"/>
           <w:szCs w:val="20"/>
         </w:rPr>
@@ -5949,12 +6710,14 @@
           <w:numId w:val="12"/>
         </w:numPr>
         <w:rPr>
+          <w:color w:val="A5A5A5" w:themeColor="accent3"/>
           <w:sz w:val="20"/>
           <w:szCs w:val="20"/>
         </w:rPr>
       </w:pPr>
       <w:r>
         <w:rPr>
+          <w:color w:val="A5A5A5" w:themeColor="accent3"/>
           <w:sz w:val="20"/>
           <w:szCs w:val="20"/>
         </w:rPr>
@@ -5964,6 +6727,7 @@
     <w:p>
       <w:pPr>
         <w:rPr>
+          <w:color w:val="A5A5A5" w:themeColor="accent3"/>
           <w:sz w:val="20"/>
           <w:szCs w:val="20"/>
         </w:rPr>
@@ -5974,6 +6738,7 @@
         <w:rPr>
           <w:b/>
           <w:bCs/>
+          <w:color w:val="A5A5A5" w:themeColor="accent3"/>
           <w:sz w:val="20"/>
           <w:szCs w:val="20"/>
         </w:rPr>
@@ -5982,6 +6747,7 @@
         <w:rPr>
           <w:b/>
           <w:bCs/>
+          <w:color w:val="A5A5A5" w:themeColor="accent3"/>
           <w:sz w:val="20"/>
           <w:szCs w:val="20"/>
         </w:rPr>
@@ -5996,6 +6762,7 @@
           <w:numId w:val="14"/>
         </w:numPr>
         <w:rPr>
+          <w:color w:val="A5A5A5" w:themeColor="accent3"/>
           <w:sz w:val="20"/>
           <w:szCs w:val="20"/>
         </w:rPr>
@@ -6003,6 +6770,7 @@
       <w:r>
         <w:rPr>
           <w:rFonts w:cstheme="minorHAnsi"/>
+          <w:color w:val="A5A5A5" w:themeColor="accent3"/>
           <w:sz w:val="20"/>
           <w:szCs w:val="20"/>
         </w:rPr>
@@ -6010,10 +6778,27 @@
       </w:r>
       <w:r>
         <w:rPr>
+          <w:color w:val="A5A5A5" w:themeColor="accent3"/>
           <w:sz w:val="20"/>
           <w:szCs w:val="20"/>
         </w:rPr>
-        <w:t>“Error_counters_list.xlsx”, DCS CRC errors are recorded in error address 9</w:t>
+        <w:t>“Error_counters_list.xlsx”, DCS CRC errors are recorded in error address</w:t>
+      </w:r>
+      <w:r>
+        <w:rPr>
+          <w:color w:val="A5A5A5" w:themeColor="accent3"/>
+          <w:sz w:val="20"/>
+          <w:szCs w:val="20"/>
+        </w:rPr>
+        <w:t>=</w:t>
+      </w:r>
+      <w:r>
+        <w:rPr>
+          <w:color w:val="A5A5A5" w:themeColor="accent3"/>
+          <w:sz w:val="20"/>
+          <w:szCs w:val="20"/>
+        </w:rPr>
+        <w:t>9</w:t>
       </w:r>
     </w:p>
     <w:p>
@@ -6025,6 +6810,7 @@
         </w:numPr>
         <w:rPr>
           <w:rFonts w:cstheme="minorHAnsi"/>
+          <w:color w:val="A5A5A5" w:themeColor="accent3"/>
           <w:sz w:val="20"/>
           <w:szCs w:val="20"/>
         </w:rPr>
@@ -6032,6 +6818,7 @@
       <w:r>
         <w:rPr>
           <w:rFonts w:cstheme="minorHAnsi"/>
+          <w:color w:val="A5A5A5" w:themeColor="accent3"/>
           <w:sz w:val="20"/>
           <w:szCs w:val="20"/>
         </w:rPr>
@@ -6047,6 +6834,7 @@
         </w:numPr>
         <w:rPr>
           <w:rFonts w:cstheme="minorHAnsi"/>
+          <w:color w:val="A5A5A5" w:themeColor="accent3"/>
           <w:sz w:val="20"/>
           <w:szCs w:val="20"/>
         </w:rPr>
@@ -6054,6 +6842,7 @@
       <w:r>
         <w:rPr>
           <w:rFonts w:cstheme="minorHAnsi"/>
+          <w:color w:val="A5A5A5" w:themeColor="accent3"/>
           <w:sz w:val="20"/>
           <w:szCs w:val="20"/>
         </w:rPr>
@@ -6063,6 +6852,7 @@
       <w:r>
         <w:rPr>
           <w:rFonts w:cstheme="minorHAnsi"/>
+          <w:color w:val="A5A5A5" w:themeColor="accent3"/>
           <w:sz w:val="20"/>
           <w:szCs w:val="20"/>
         </w:rPr>
@@ -6072,6 +6862,7 @@
       <w:r>
         <w:rPr>
           <w:rFonts w:cstheme="minorHAnsi"/>
+          <w:color w:val="A5A5A5" w:themeColor="accent3"/>
           <w:sz w:val="20"/>
           <w:szCs w:val="20"/>
         </w:rPr>
@@ -6087,6 +6878,7 @@
         </w:numPr>
         <w:rPr>
           <w:rFonts w:cstheme="minorHAnsi"/>
+          <w:color w:val="A5A5A5" w:themeColor="accent3"/>
           <w:sz w:val="20"/>
           <w:szCs w:val="20"/>
         </w:rPr>
@@ -6094,6 +6886,7 @@
       <w:r>
         <w:rPr>
           <w:rFonts w:cstheme="minorHAnsi"/>
+          <w:color w:val="A5A5A5" w:themeColor="accent3"/>
           <w:sz w:val="20"/>
           <w:szCs w:val="20"/>
         </w:rPr>
@@ -6109,6 +6902,7 @@
         </w:numPr>
         <w:rPr>
           <w:rFonts w:cstheme="minorHAnsi"/>
+          <w:color w:val="A5A5A5" w:themeColor="accent3"/>
           <w:sz w:val="20"/>
           <w:szCs w:val="20"/>
         </w:rPr>
@@ -6116,6 +6910,7 @@
       <w:r>
         <w:rPr>
           <w:rFonts w:cstheme="minorHAnsi"/>
+          <w:color w:val="A5A5A5" w:themeColor="accent3"/>
           <w:sz w:val="20"/>
           <w:szCs w:val="20"/>
         </w:rPr>
@@ -6129,6 +6924,7 @@
         <w:rPr>
           <w:b/>
           <w:bCs/>
+          <w:color w:val="A5A5A5" w:themeColor="accent3"/>
           <w:sz w:val="20"/>
           <w:szCs w:val="20"/>
         </w:rPr>
@@ -6137,13 +6933,14 @@
     <w:p>
       <w:pPr>
         <w:rPr>
+          <w:color w:val="A5A5A5" w:themeColor="accent3"/>
           <w:sz w:val="20"/>
           <w:szCs w:val="20"/>
           <w:u w:val="single"/>
         </w:rPr>
       </w:pPr>
     </w:p>
-    <w:bookmarkStart w:id="8" w:name="DIGI_sim"/>
+    <w:bookmarkStart w:id="9" w:name="DIGI_sim"/>
     <w:p>
       <w:pPr>
         <w:pStyle w:val="ListParagraph"/>
@@ -6154,6 +6951,7 @@
         <w:rPr>
           <w:b/>
           <w:bCs/>
+          <w:color w:val="A5A5A5" w:themeColor="accent3"/>
           <w:sz w:val="22"/>
           <w:szCs w:val="22"/>
           <w:u w:val="single"/>
@@ -6163,6 +6961,7 @@
         <w:rPr>
           <w:b/>
           <w:bCs/>
+          <w:color w:val="A5A5A5" w:themeColor="accent3"/>
           <w:sz w:val="22"/>
           <w:szCs w:val="22"/>
           <w:u w:val="single"/>
@@ -6173,6 +6972,7 @@
         <w:rPr>
           <w:b/>
           <w:bCs/>
+          <w:color w:val="A5A5A5" w:themeColor="accent3"/>
           <w:sz w:val="22"/>
           <w:szCs w:val="22"/>
           <w:u w:val="single"/>
@@ -6183,6 +6983,7 @@
         <w:rPr>
           <w:b/>
           <w:bCs/>
+          <w:color w:val="A5A5A5" w:themeColor="accent3"/>
           <w:sz w:val="22"/>
           <w:szCs w:val="22"/>
           <w:u w:val="single"/>
@@ -6192,6 +6993,7 @@
         <w:rPr>
           <w:b/>
           <w:bCs/>
+          <w:color w:val="A5A5A5" w:themeColor="accent3"/>
           <w:sz w:val="22"/>
           <w:szCs w:val="22"/>
           <w:u w:val="single"/>
@@ -6203,6 +7005,7 @@
           <w:rStyle w:val="Hyperlink"/>
           <w:b/>
           <w:bCs/>
+          <w:color w:val="A5A5A5" w:themeColor="accent3"/>
           <w:sz w:val="22"/>
           <w:szCs w:val="22"/>
         </w:rPr>
@@ -6212,6 +7015,7 @@
         <w:rPr>
           <w:b/>
           <w:bCs/>
+          <w:color w:val="A5A5A5" w:themeColor="accent3"/>
           <w:sz w:val="22"/>
           <w:szCs w:val="22"/>
           <w:u w:val="single"/>
@@ -6219,12 +7023,13 @@
         <w:fldChar w:fldCharType="end"/>
       </w:r>
     </w:p>
-    <w:bookmarkEnd w:id="8"/>
-    <w:p>
-      <w:pPr>
-        <w:rPr>
-          <w:b/>
-          <w:bCs/>
+    <w:bookmarkEnd w:id="9"/>
+    <w:p>
+      <w:pPr>
+        <w:rPr>
+          <w:b/>
+          <w:bCs/>
+          <w:color w:val="A5A5A5" w:themeColor="accent3"/>
           <w:u w:val="single"/>
         </w:rPr>
       </w:pPr>
@@ -6232,12 +7037,14 @@
     <w:p>
       <w:pPr>
         <w:rPr>
+          <w:color w:val="A5A5A5" w:themeColor="accent3"/>
           <w:sz w:val="20"/>
           <w:szCs w:val="20"/>
         </w:rPr>
       </w:pPr>
       <w:r>
         <w:rPr>
+          <w:color w:val="A5A5A5" w:themeColor="accent3"/>
           <w:sz w:val="20"/>
           <w:szCs w:val="20"/>
         </w:rPr>
@@ -6246,6 +7053,7 @@
       <w:proofErr w:type="spellStart"/>
       <w:r>
         <w:rPr>
+          <w:color w:val="A5A5A5" w:themeColor="accent3"/>
           <w:sz w:val="20"/>
           <w:szCs w:val="20"/>
         </w:rPr>
@@ -6254,6 +7062,7 @@
       <w:proofErr w:type="spellEnd"/>
       <w:r>
         <w:rPr>
+          <w:color w:val="A5A5A5" w:themeColor="accent3"/>
           <w:sz w:val="20"/>
           <w:szCs w:val="20"/>
         </w:rPr>
@@ -6268,16 +7077,34 @@
           <w:numId w:val="22"/>
         </w:numPr>
         <w:rPr>
+          <w:color w:val="A5A5A5" w:themeColor="accent3"/>
           <w:sz w:val="20"/>
           <w:szCs w:val="20"/>
         </w:rPr>
       </w:pPr>
       <w:r>
         <w:rPr>
+          <w:color w:val="A5A5A5" w:themeColor="accent3"/>
           <w:sz w:val="20"/>
           <w:szCs w:val="20"/>
         </w:rPr>
-        <w:t>Configure ROC to send patterns to DDR and enabling DIGI simulation by writing 0x810 (to send 320bit increasing counter) or 0x1810 (to send alternating 0x5555 and 0xAAAA) to address 8 (RW register)</w:t>
+        <w:t>Configure ROC to send patterns to DDR and enabling DIGI simulation by writing 0x810 (to send 320bit increasing counter) or 0x1810 (to send alternating 0x5555 and 0xAAAA) to address</w:t>
+      </w:r>
+      <w:r>
+        <w:rPr>
+          <w:color w:val="A5A5A5" w:themeColor="accent3"/>
+          <w:sz w:val="20"/>
+          <w:szCs w:val="20"/>
+        </w:rPr>
+        <w:t>=</w:t>
+      </w:r>
+      <w:r>
+        <w:rPr>
+          <w:color w:val="A5A5A5" w:themeColor="accent3"/>
+          <w:sz w:val="20"/>
+          <w:szCs w:val="20"/>
+        </w:rPr>
+        <w:t>8 (RW register)</w:t>
       </w:r>
     </w:p>
     <w:p>
@@ -6288,16 +7115,34 @@
           <w:numId w:val="22"/>
         </w:numPr>
         <w:rPr>
+          <w:color w:val="A5A5A5" w:themeColor="accent3"/>
           <w:sz w:val="20"/>
           <w:szCs w:val="20"/>
         </w:rPr>
       </w:pPr>
       <w:r>
         <w:rPr>
+          <w:color w:val="A5A5A5" w:themeColor="accent3"/>
           <w:sz w:val="20"/>
           <w:szCs w:val="20"/>
         </w:rPr>
-        <w:t xml:space="preserve">Set the number N of simulated DIGI hits per Serdes lane via a write to address 15 (RW register); default value is 2. </w:t>
+        <w:t>Set the number N of simulated DIGI hits per Serdes lane via a write to address</w:t>
+      </w:r>
+      <w:r>
+        <w:rPr>
+          <w:color w:val="A5A5A5" w:themeColor="accent3"/>
+          <w:sz w:val="20"/>
+          <w:szCs w:val="20"/>
+        </w:rPr>
+        <w:t>=</w:t>
+      </w:r>
+      <w:r>
+        <w:rPr>
+          <w:color w:val="A5A5A5" w:themeColor="accent3"/>
+          <w:sz w:val="20"/>
+          <w:szCs w:val="20"/>
+        </w:rPr>
+        <w:t xml:space="preserve">15 (RW register); default value is 2. </w:t>
       </w:r>
     </w:p>
     <w:p>
@@ -6308,12 +7153,14 @@
           <w:numId w:val="22"/>
         </w:numPr>
         <w:rPr>
+          <w:color w:val="A5A5A5" w:themeColor="accent3"/>
           <w:sz w:val="20"/>
           <w:szCs w:val="20"/>
         </w:rPr>
       </w:pPr>
       <w:r>
         <w:rPr>
+          <w:color w:val="A5A5A5" w:themeColor="accent3"/>
           <w:sz w:val="20"/>
           <w:szCs w:val="20"/>
         </w:rPr>
@@ -6355,8 +7202,8 @@
         <w:br w:type="page"/>
       </w:r>
     </w:p>
-    <w:bookmarkStart w:id="9" w:name="old"/>
-    <w:bookmarkStart w:id="10" w:name="newrun"/>
+    <w:bookmarkStart w:id="10" w:name="old"/>
+    <w:bookmarkStart w:id="11" w:name="newrun"/>
     <w:p>
       <w:pPr>
         <w:rPr>
@@ -6417,7 +7264,7 @@
         <w:fldChar w:fldCharType="end"/>
       </w:r>
     </w:p>
-    <w:bookmarkEnd w:id="9"/>
+    <w:bookmarkEnd w:id="10"/>
     <w:p>
       <w:pPr>
         <w:rPr>
@@ -6444,7 +7291,7 @@
           </w:rPr>
           <w:t>concept and HALTRUN_EN option</w:t>
         </w:r>
-        <w:bookmarkEnd w:id="10"/>
+        <w:bookmarkEnd w:id="11"/>
       </w:hyperlink>
       <w:r>
         <w:rPr>
@@ -6734,7 +7581,7 @@
         </w:rPr>
       </w:pPr>
     </w:p>
-    <w:bookmarkStart w:id="11" w:name="loopback"/>
+    <w:bookmarkStart w:id="12" w:name="loopback"/>
     <w:p>
       <w:r>
         <w:rPr>
@@ -6783,7 +7630,7 @@
         </w:rPr>
         <w:t>logic</w:t>
       </w:r>
-      <w:bookmarkEnd w:id="11"/>
+      <w:bookmarkEnd w:id="12"/>
       <w:r>
         <w:rPr>
           <w:b/>
@@ -6828,7 +7675,7 @@
       </w:r>
     </w:p>
     <w:p/>
-    <w:bookmarkStart w:id="12" w:name="enables"/>
+    <w:bookmarkStart w:id="13" w:name="enables"/>
     <w:p>
       <w:r>
         <w:lastRenderedPageBreak/>
@@ -6846,7 +7693,7 @@
         </w:rPr>
         <w:t>Clock and Event Window controls via serial vs fiber</w:t>
       </w:r>
-      <w:bookmarkEnd w:id="12"/>
+      <w:bookmarkEnd w:id="13"/>
       <w:r>
         <w:fldChar w:fldCharType="end"/>
       </w:r>
@@ -6965,7 +7812,7 @@
       </w:pPr>
     </w:p>
     <w:p>
-      <w:bookmarkStart w:id="13" w:name="appendixA"/>
+      <w:bookmarkStart w:id="14" w:name="appendixA"/>
       <w:r>
         <w:t>At power up, by default</w:t>
       </w:r>
@@ -7146,7 +7993,7 @@
         </w:r>
       </w:hyperlink>
     </w:p>
-    <w:bookmarkEnd w:id="13"/>
+    <w:bookmarkEnd w:id="14"/>
     <w:p>
       <w:pPr>
         <w:rPr>

</xml_diff>

<commit_message>
CRCSUM 0x00F8, meet timing with high effort
Added register to RS485 RX input. Added data header STATUS bits for HB and DREQ tag inconsistencies.
</commit_message>
<xml_diff>
--- a/commands_for_ROC_FW_timingconstrained.docx
+++ b/commands_for_ROC_FW_timingconstrained.docx
@@ -12,6 +12,8 @@
           <w:szCs w:val="32"/>
         </w:rPr>
       </w:pPr>
+      <w:bookmarkStart w:id="0" w:name="_top"/>
+      <w:bookmarkEnd w:id="0"/>
       <w:proofErr w:type="spellStart"/>
       <w:r>
         <w:rPr>
@@ -67,13 +69,16 @@
         <w:t>This document reports on features of the ROC Firmware released on 0</w:t>
       </w:r>
       <w:r>
-        <w:t>5</w:t>
+        <w:t>6</w:t>
       </w:r>
       <w:r>
         <w:t>/</w:t>
       </w:r>
       <w:r>
-        <w:t>04</w:t>
+        <w:t>0</w:t>
+      </w:r>
+      <w:r>
+        <w:t>7</w:t>
       </w:r>
       <w:r>
         <w:t>/2025 to “</w:t>
@@ -107,7 +112,7 @@
         <w:t xml:space="preserve"> for details)</w:t>
       </w:r>
       <w:r>
-        <w:t xml:space="preserve">. See here for a list of changes. </w:t>
+        <w:t xml:space="preserve">. </w:t>
       </w:r>
       <w:r>
         <w:t>It is divided in three part:</w:t>
@@ -142,7 +147,25 @@
           <w:rPr>
             <w:rStyle w:val="Hyperlink"/>
           </w:rPr>
-          <w:t xml:space="preserve"> feature</w:t>
+          <w:t xml:space="preserve"> </w:t>
+        </w:r>
+        <w:r>
+          <w:rPr>
+            <w:rStyle w:val="Hyperlink"/>
+          </w:rPr>
+          <w:t>f</w:t>
+        </w:r>
+        <w:r>
+          <w:rPr>
+            <w:rStyle w:val="Hyperlink"/>
+          </w:rPr>
+          <w:t>e</w:t>
+        </w:r>
+        <w:r>
+          <w:rPr>
+            <w:rStyle w:val="Hyperlink"/>
+          </w:rPr>
+          <w:t>ature</w:t>
         </w:r>
         <w:r>
           <w:rPr>
@@ -150,16 +173,92 @@
           </w:rPr>
           <w:t>s</w:t>
         </w:r>
+        <w:r>
+          <w:rPr>
+            <w:rStyle w:val="Hyperlink"/>
+          </w:rPr>
+          <w:t>:</w:t>
+        </w:r>
       </w:hyperlink>
       <w:r>
-        <w:t>: these are feature</w:t>
-      </w:r>
-      <w:r>
-        <w:t>s</w:t>
-      </w:r>
-      <w:r>
-        <w:t xml:space="preserve"> first available in this ROC_FW release</w:t>
-      </w:r>
+        <w:t xml:space="preserve"> </w:t>
+      </w:r>
+    </w:p>
+    <w:p>
+      <w:pPr>
+        <w:pStyle w:val="ListParagraph"/>
+        <w:numPr>
+          <w:ilvl w:val="1"/>
+          <w:numId w:val="23"/>
+        </w:numPr>
+      </w:pPr>
+      <w:hyperlink w:anchor="status_bit" w:history="1">
+        <w:r>
+          <w:rPr>
+            <w:rStyle w:val="Hyperlink"/>
+          </w:rPr>
+          <w:t>STATUS</w:t>
+        </w:r>
+        <w:r>
+          <w:rPr>
+            <w:rStyle w:val="Hyperlink"/>
+          </w:rPr>
+          <w:t xml:space="preserve"> </w:t>
+        </w:r>
+        <w:r>
+          <w:rPr>
+            <w:rStyle w:val="Hyperlink"/>
+          </w:rPr>
+          <w:t>bits in data p</w:t>
+        </w:r>
+        <w:r>
+          <w:rPr>
+            <w:rStyle w:val="Hyperlink"/>
+          </w:rPr>
+          <w:t>a</w:t>
+        </w:r>
+        <w:r>
+          <w:rPr>
+            <w:rStyle w:val="Hyperlink"/>
+          </w:rPr>
+          <w:t>cket header</w:t>
+        </w:r>
+      </w:hyperlink>
+    </w:p>
+    <w:p>
+      <w:pPr>
+        <w:pStyle w:val="ListParagraph"/>
+        <w:numPr>
+          <w:ilvl w:val="1"/>
+          <w:numId w:val="23"/>
+        </w:numPr>
+      </w:pPr>
+      <w:hyperlink w:anchor="remote_prog" w:history="1">
+        <w:r>
+          <w:rPr>
+            <w:rStyle w:val="Hyperlink"/>
+          </w:rPr>
+          <w:t>Re</w:t>
+        </w:r>
+        <w:r>
+          <w:rPr>
+            <w:rStyle w:val="Hyperlink"/>
+          </w:rPr>
+          <w:t>m</w:t>
+        </w:r>
+        <w:r>
+          <w:rPr>
+            <w:rStyle w:val="Hyperlink"/>
+          </w:rPr>
+          <w:t>o</w:t>
+        </w:r>
+        <w:r>
+          <w:rPr>
+            <w:rStyle w:val="Hyperlink"/>
+          </w:rPr>
+          <w:t>te programmability functions</w:t>
+        </w:r>
+      </w:hyperlink>
     </w:p>
     <w:p>
       <w:pPr>
@@ -254,19 +353,7 @@
           <w:rPr>
             <w:rStyle w:val="Hyperlink"/>
           </w:rPr>
-          <w:t>S</w:t>
-        </w:r>
-        <w:r>
-          <w:rPr>
-            <w:rStyle w:val="Hyperlink"/>
-          </w:rPr>
-          <w:t>P</w:t>
-        </w:r>
-        <w:r>
-          <w:rPr>
-            <w:rStyle w:val="Hyperlink"/>
-          </w:rPr>
-          <w:t xml:space="preserve">I read/write </w:t>
+          <w:t xml:space="preserve">SPI read/write </w:t>
         </w:r>
         <w:r>
           <w:rPr>
@@ -299,7 +386,19 @@
         </w:r>
       </w:hyperlink>
       <w:r>
-        <w:t>: these are features existing in previous release and now disab</w:t>
+        <w:t>: these features exist</w:t>
+      </w:r>
+      <w:r>
+        <w:t>ed</w:t>
+      </w:r>
+      <w:r>
+        <w:t xml:space="preserve"> in previous release </w:t>
+      </w:r>
+      <w:r>
+        <w:t>but</w:t>
+      </w:r>
+      <w:r>
+        <w:t xml:space="preserve"> now disab</w:t>
       </w:r>
       <w:r>
         <w:t>le</w:t>
@@ -465,54 +564,1474 @@
     </w:p>
     <w:p>
       <w:pPr>
-        <w:jc w:val="center"/>
-        <w:rPr>
-          <w:b/>
-          <w:bCs/>
-          <w:sz w:val="32"/>
-          <w:szCs w:val="32"/>
-        </w:rPr>
-      </w:pPr>
-    </w:p>
-    <w:p>
-      <w:pPr>
-        <w:rPr>
-          <w:b/>
-          <w:bCs/>
-        </w:rPr>
-      </w:pPr>
-      <w:bookmarkStart w:id="0" w:name="new"/>
-    </w:p>
-    <w:p>
-      <w:pPr>
-        <w:rPr>
-          <w:b/>
-          <w:bCs/>
-        </w:rPr>
-      </w:pPr>
-      <w:hyperlink w:anchor="_top" w:history="1">
-        <w:r>
-          <w:rPr>
-            <w:rStyle w:val="Hyperlink"/>
-            <w:b/>
-            <w:bCs/>
-          </w:rPr>
-          <w:t>New features:</w:t>
-        </w:r>
-      </w:hyperlink>
-    </w:p>
-    <w:p>
-      <w:pPr>
-        <w:rPr>
-          <w:b/>
-          <w:bCs/>
-        </w:rPr>
-      </w:pPr>
-    </w:p>
-    <w:p>
-      <w:bookmarkStart w:id="1" w:name="timeout"/>
-      <w:r>
-        <w:rPr>
+        <w:rPr>
+          <w:b/>
+          <w:bCs/>
+        </w:rPr>
+      </w:pPr>
+    </w:p>
+    <w:p>
+      <w:pPr>
+        <w:rPr>
+          <w:b/>
+          <w:bCs/>
+        </w:rPr>
+      </w:pPr>
+      <w:r>
+        <w:rPr>
+          <w:b/>
+          <w:bCs/>
+        </w:rPr>
+        <w:br w:type="page"/>
+      </w:r>
+    </w:p>
+    <w:bookmarkStart w:id="1" w:name="new"/>
+    <w:p>
+      <w:pPr>
+        <w:rPr>
+          <w:b/>
+          <w:bCs/>
+        </w:rPr>
+      </w:pPr>
+      <w:r>
+        <w:rPr>
+          <w:b/>
+          <w:bCs/>
+        </w:rPr>
+        <w:lastRenderedPageBreak/>
+        <w:fldChar w:fldCharType="begin"/>
+      </w:r>
+      <w:r>
+        <w:rPr>
+          <w:b/>
+          <w:bCs/>
+        </w:rPr>
+        <w:instrText>HYPERLINK  \l "_top"</w:instrText>
+      </w:r>
+      <w:r>
+        <w:rPr>
+          <w:b/>
+          <w:bCs/>
+        </w:rPr>
+      </w:r>
+      <w:r>
+        <w:rPr>
+          <w:b/>
+          <w:bCs/>
+        </w:rPr>
+        <w:fldChar w:fldCharType="separate"/>
+      </w:r>
+      <w:r>
+        <w:rPr>
+          <w:rStyle w:val="Hyperlink"/>
+          <w:b/>
+          <w:bCs/>
+        </w:rPr>
+        <w:t>New Featu</w:t>
+      </w:r>
+      <w:r>
+        <w:rPr>
+          <w:rStyle w:val="Hyperlink"/>
+          <w:b/>
+          <w:bCs/>
+        </w:rPr>
+        <w:t>r</w:t>
+      </w:r>
+      <w:r>
+        <w:rPr>
+          <w:rStyle w:val="Hyperlink"/>
+          <w:b/>
+          <w:bCs/>
+        </w:rPr>
+        <w:t>es</w:t>
+      </w:r>
+      <w:r>
+        <w:rPr>
+          <w:b/>
+          <w:bCs/>
+        </w:rPr>
+        <w:fldChar w:fldCharType="end"/>
+      </w:r>
+    </w:p>
+    <w:bookmarkEnd w:id="1"/>
+    <w:p>
+      <w:pPr>
+        <w:rPr>
+          <w:b/>
+          <w:bCs/>
+        </w:rPr>
+      </w:pPr>
+    </w:p>
+    <w:bookmarkStart w:id="2" w:name="status_bit"/>
+    <w:p>
+      <w:r>
+        <w:rPr>
+          <w:b/>
+          <w:bCs/>
+        </w:rPr>
+        <w:fldChar w:fldCharType="begin"/>
+      </w:r>
+      <w:r>
+        <w:rPr>
+          <w:b/>
+          <w:bCs/>
+        </w:rPr>
+        <w:instrText>HYPERLINK  \l "_top"</w:instrText>
+      </w:r>
+      <w:r>
+        <w:rPr>
+          <w:b/>
+          <w:bCs/>
+        </w:rPr>
+      </w:r>
+      <w:r>
+        <w:rPr>
+          <w:b/>
+          <w:bCs/>
+        </w:rPr>
+        <w:fldChar w:fldCharType="separate"/>
+      </w:r>
+      <w:r>
+        <w:rPr>
+          <w:rStyle w:val="Hyperlink"/>
+          <w:b/>
+          <w:bCs/>
+        </w:rPr>
+        <w:t xml:space="preserve">STATUS bit </w:t>
+      </w:r>
+      <w:r>
+        <w:rPr>
+          <w:rStyle w:val="Hyperlink"/>
+          <w:b/>
+          <w:bCs/>
+        </w:rPr>
+        <w:t>i</w:t>
+      </w:r>
+      <w:r>
+        <w:rPr>
+          <w:rStyle w:val="Hyperlink"/>
+          <w:b/>
+          <w:bCs/>
+        </w:rPr>
+        <w:t>n data header packet</w:t>
+      </w:r>
+      <w:bookmarkEnd w:id="2"/>
+      <w:r>
+        <w:rPr>
+          <w:b/>
+          <w:bCs/>
+        </w:rPr>
+        <w:fldChar w:fldCharType="end"/>
+      </w:r>
+      <w:r>
+        <w:rPr>
+          <w:b/>
+          <w:bCs/>
+        </w:rPr>
+        <w:t xml:space="preserve">: </w:t>
+      </w:r>
+      <w:r>
+        <w:t xml:space="preserve">in response to a Data Request from the DTC , the ROC </w:t>
+      </w:r>
+      <w:r>
+        <w:t>replied with</w:t>
+      </w:r>
+      <w:r>
+        <w:t xml:space="preserve"> a </w:t>
+      </w:r>
+      <w:r>
+        <w:t xml:space="preserve">16 byte </w:t>
+      </w:r>
+      <w:r>
+        <w:t xml:space="preserve">data header, followed by </w:t>
+      </w:r>
+      <w:r>
+        <w:t xml:space="preserve">as many </w:t>
+      </w:r>
+      <w:r>
+        <w:t xml:space="preserve">payload data packets </w:t>
+      </w:r>
+      <w:r>
+        <w:t>needed to return the hits seen in the panel. A</w:t>
+      </w:r>
+      <w:r>
+        <w:t xml:space="preserve">s specified </w:t>
+      </w:r>
+      <w:r>
+        <w:t>by</w:t>
+      </w:r>
+      <w:r>
+        <w:t xml:space="preserve"> Mu2e-docDB-4914</w:t>
+      </w:r>
+      <w:r>
+        <w:t xml:space="preserve">, byte 14 of the data header packet contains the STATUS bits. </w:t>
+      </w:r>
+    </w:p>
+    <w:p/>
+    <w:p>
+      <w:r>
+        <w:t>At present the status bit</w:t>
+      </w:r>
+      <w:r>
+        <w:t>s</w:t>
+      </w:r>
+      <w:r>
+        <w:t xml:space="preserve"> have the following meaning:</w:t>
+      </w:r>
+    </w:p>
+    <w:p>
+      <w:r>
+        <w:rPr>
+          <w:b/>
+          <w:bCs/>
+        </w:rPr>
+        <w:t>STATUS[0]:</w:t>
+      </w:r>
+      <w:r>
+        <w:t xml:space="preserve">  if 1, event has some</w:t>
+      </w:r>
+      <w:r>
+        <w:t xml:space="preserve"> data; if 0, event has no payload packets</w:t>
+      </w:r>
+    </w:p>
+    <w:p>
+      <w:r>
+        <w:rPr>
+          <w:b/>
+          <w:bCs/>
+        </w:rPr>
+        <w:t>STATUS[</w:t>
+      </w:r>
+      <w:r>
+        <w:rPr>
+          <w:b/>
+          <w:bCs/>
+        </w:rPr>
+        <w:t>1</w:t>
+      </w:r>
+      <w:r>
+        <w:rPr>
+          <w:b/>
+          <w:bCs/>
+        </w:rPr>
+        <w:t>]:</w:t>
+      </w:r>
+      <w:r>
+        <w:t xml:space="preserve"> </w:t>
+      </w:r>
+      <w:r>
+        <w:t xml:space="preserve"> unused</w:t>
+      </w:r>
+      <w:r>
+        <w:t xml:space="preserve"> </w:t>
+      </w:r>
+    </w:p>
+    <w:p>
+      <w:pPr>
+        <w:rPr>
+          <w:b/>
+          <w:bCs/>
+        </w:rPr>
+      </w:pPr>
+      <w:r>
+        <w:rPr>
+          <w:b/>
+          <w:bCs/>
+        </w:rPr>
+        <w:t>STATUS[</w:t>
+      </w:r>
+      <w:r>
+        <w:rPr>
+          <w:b/>
+          <w:bCs/>
+        </w:rPr>
+        <w:t>2</w:t>
+      </w:r>
+      <w:r>
+        <w:rPr>
+          <w:b/>
+          <w:bCs/>
+        </w:rPr>
+        <w:t>]:</w:t>
+      </w:r>
+      <w:r>
+        <w:t xml:space="preserve">  if 1, event has </w:t>
+      </w:r>
+      <w:r>
+        <w:t xml:space="preserve">some internal tag error, </w:t>
+      </w:r>
+      <w:proofErr w:type="spellStart"/>
+      <w:r>
+        <w:t>ie</w:t>
+      </w:r>
+      <w:proofErr w:type="spellEnd"/>
+      <w:r>
+        <w:t xml:space="preserve"> either one DIGI reported a TAG_SYNC error (TAG_SYNC is a signal</w:t>
+      </w:r>
+      <w:r>
+        <w:t xml:space="preserve"> sent from the ROC to the DIGI FPGA every 2*14=8192 tags</w:t>
+      </w:r>
+      <w:r>
+        <w:t>) or the ROC detected that the event tag reported by different DIGI SerDes lanes does not agree</w:t>
+      </w:r>
+    </w:p>
+    <w:p>
+      <w:r>
+        <w:rPr>
+          <w:b/>
+          <w:bCs/>
+        </w:rPr>
+        <w:t>STATUS[</w:t>
+      </w:r>
+      <w:r>
+        <w:rPr>
+          <w:b/>
+          <w:bCs/>
+        </w:rPr>
+        <w:t>3</w:t>
+      </w:r>
+      <w:r>
+        <w:rPr>
+          <w:b/>
+          <w:bCs/>
+        </w:rPr>
+        <w:t>]:</w:t>
+      </w:r>
+      <w:r>
+        <w:t xml:space="preserve">  if 1, event has </w:t>
+      </w:r>
+      <w:r>
+        <w:t>timed-out, meaning if could not reply to DTC Data Request within the time set by the “</w:t>
+      </w:r>
+      <w:proofErr w:type="spellStart"/>
+      <w:r>
+        <w:t>Event_Timeout</w:t>
+      </w:r>
+      <w:proofErr w:type="spellEnd"/>
+      <w:r>
+        <w:t xml:space="preserve">” registers 0x60 &amp; 0x61 (default 0xFFFF in </w:t>
+      </w:r>
+      <w:r>
+        <w:t>u</w:t>
+      </w:r>
+      <w:r>
+        <w:t>nits of 12.5 ns</w:t>
+      </w:r>
+      <w:r>
+        <w:t xml:space="preserve">, or 820 </w:t>
+      </w:r>
+      <w:r>
+        <w:rPr>
+          <w:rFonts w:ascii="Symbol" w:hAnsi="Symbol"/>
+        </w:rPr>
+        <w:t>m</w:t>
+      </w:r>
+      <w:r>
+        <w:t>s</w:t>
+      </w:r>
+      <w:r>
+        <w:t xml:space="preserve">) </w:t>
+      </w:r>
+    </w:p>
+    <w:p>
+      <w:pPr>
+        <w:rPr>
+          <w:b/>
+          <w:bCs/>
+        </w:rPr>
+      </w:pPr>
+      <w:r>
+        <w:rPr>
+          <w:b/>
+          <w:bCs/>
+        </w:rPr>
+        <w:t>STATUS[</w:t>
+      </w:r>
+      <w:r>
+        <w:rPr>
+          <w:b/>
+          <w:bCs/>
+        </w:rPr>
+        <w:t>4</w:t>
+      </w:r>
+      <w:r>
+        <w:rPr>
+          <w:b/>
+          <w:bCs/>
+        </w:rPr>
+        <w:t>]:</w:t>
+      </w:r>
+      <w:r>
+        <w:t xml:space="preserve">  if 1, event has </w:t>
+      </w:r>
+      <w:r>
+        <w:t xml:space="preserve">an Overflow, </w:t>
+      </w:r>
+      <w:proofErr w:type="spellStart"/>
+      <w:r>
+        <w:t>ie</w:t>
+      </w:r>
+      <w:proofErr w:type="spellEnd"/>
+      <w:r>
+        <w:t xml:space="preserve"> it reports ONLY data from the </w:t>
+      </w:r>
+      <w:r>
+        <w:t xml:space="preserve">first 8kB sent by the DIGI for that event windows (corresponding to the </w:t>
+      </w:r>
+      <w:r>
+        <w:t xml:space="preserve">first 255 </w:t>
+      </w:r>
+      <w:r>
+        <w:t xml:space="preserve">hits </w:t>
+      </w:r>
+      <w:r>
+        <w:t>for a</w:t>
+      </w:r>
+      <w:r>
+        <w:t xml:space="preserve"> 256-bit</w:t>
+      </w:r>
+      <w:r>
+        <w:t xml:space="preserve"> bit</w:t>
+      </w:r>
+      <w:r>
+        <w:t>)</w:t>
+      </w:r>
+    </w:p>
+    <w:p>
+      <w:pPr>
+        <w:rPr>
+          <w:b/>
+          <w:bCs/>
+        </w:rPr>
+      </w:pPr>
+      <w:r>
+        <w:rPr>
+          <w:b/>
+          <w:bCs/>
+        </w:rPr>
+        <w:t>STATUS[</w:t>
+      </w:r>
+      <w:r>
+        <w:rPr>
+          <w:b/>
+          <w:bCs/>
+        </w:rPr>
+        <w:t>5</w:t>
+      </w:r>
+      <w:r>
+        <w:rPr>
+          <w:b/>
+          <w:bCs/>
+        </w:rPr>
+        <w:t>]:</w:t>
+      </w:r>
+      <w:r>
+        <w:t xml:space="preserve">  if 1, event has </w:t>
+      </w:r>
+      <w:r>
+        <w:t xml:space="preserve">HB inconsistency error, </w:t>
+      </w:r>
+      <w:proofErr w:type="spellStart"/>
+      <w:r>
+        <w:t>ie</w:t>
+      </w:r>
+      <w:proofErr w:type="spellEnd"/>
+      <w:r>
+        <w:t xml:space="preserve"> the tag </w:t>
+      </w:r>
+      <w:r>
+        <w:t xml:space="preserve">contained in the DIGI data header does not agree with the tag passed </w:t>
+      </w:r>
+      <w:r>
+        <w:t xml:space="preserve">in the </w:t>
+      </w:r>
+      <w:proofErr w:type="spellStart"/>
+      <w:r>
+        <w:t>Heartbit</w:t>
+      </w:r>
+      <w:proofErr w:type="spellEnd"/>
+      <w:r>
+        <w:t xml:space="preserve"> packet </w:t>
+      </w:r>
+      <w:r>
+        <w:t>(and saved in the DDR header word)</w:t>
+      </w:r>
+    </w:p>
+    <w:p>
+      <w:pPr>
+        <w:rPr>
+          <w:b/>
+          <w:bCs/>
+        </w:rPr>
+      </w:pPr>
+      <w:r>
+        <w:rPr>
+          <w:b/>
+          <w:bCs/>
+        </w:rPr>
+        <w:t>STATUS[</w:t>
+      </w:r>
+      <w:r>
+        <w:rPr>
+          <w:b/>
+          <w:bCs/>
+        </w:rPr>
+        <w:t>6</w:t>
+      </w:r>
+      <w:r>
+        <w:rPr>
+          <w:b/>
+          <w:bCs/>
+        </w:rPr>
+        <w:t>]:</w:t>
+      </w:r>
+      <w:r>
+        <w:t xml:space="preserve">  if 1, event has </w:t>
+      </w:r>
+      <w:r>
+        <w:t>DREQ</w:t>
+      </w:r>
+      <w:r>
+        <w:t xml:space="preserve"> inconsistency error, </w:t>
+      </w:r>
+      <w:proofErr w:type="spellStart"/>
+      <w:r>
+        <w:t>ie</w:t>
+      </w:r>
+      <w:proofErr w:type="spellEnd"/>
+      <w:r>
+        <w:t xml:space="preserve"> the tag passed in the </w:t>
+      </w:r>
+      <w:r>
+        <w:t>Data Request</w:t>
+      </w:r>
+      <w:r>
+        <w:t xml:space="preserve"> packet does not agree with the tag </w:t>
+      </w:r>
+      <w:r>
+        <w:t>saved for the event in the DDR header words</w:t>
+      </w:r>
+    </w:p>
+    <w:p>
+      <w:pPr>
+        <w:rPr>
+          <w:b/>
+          <w:bCs/>
+        </w:rPr>
+      </w:pPr>
+      <w:r>
+        <w:rPr>
+          <w:b/>
+          <w:bCs/>
+        </w:rPr>
+        <w:t>STATUS[7]:</w:t>
+      </w:r>
+      <w:r>
+        <w:t xml:space="preserve">  if 1, event has </w:t>
+      </w:r>
+      <w:r>
+        <w:t xml:space="preserve">unexpected request type, </w:t>
+      </w:r>
+      <w:proofErr w:type="spellStart"/>
+      <w:r>
+        <w:t>ie</w:t>
+      </w:r>
+      <w:proofErr w:type="spellEnd"/>
+      <w:r>
+        <w:t xml:space="preserve"> neither 2 (Data Request) or 3 (Prefetch). This might indicate a fiber corruption.</w:t>
+      </w:r>
+      <w:r>
+        <w:t xml:space="preserve"> </w:t>
+      </w:r>
+    </w:p>
+    <w:p>
+      <w:pPr>
+        <w:ind w:firstLine="720"/>
+        <w:rPr>
+          <w:b/>
+          <w:bCs/>
+        </w:rPr>
+      </w:pPr>
+    </w:p>
+    <w:p>
+      <w:pPr>
+        <w:rPr>
+          <w:b/>
+          <w:bCs/>
+        </w:rPr>
+      </w:pPr>
+    </w:p>
+    <w:bookmarkStart w:id="3" w:name="remote_prog"/>
+    <w:p>
+      <w:pPr>
+        <w:rPr>
+          <w:rFonts w:cstheme="minorHAnsi"/>
+        </w:rPr>
+      </w:pPr>
+      <w:r>
+        <w:rPr>
+          <w:b/>
+          <w:bCs/>
+        </w:rPr>
+        <w:fldChar w:fldCharType="begin"/>
+      </w:r>
+      <w:r>
+        <w:rPr>
+          <w:b/>
+          <w:bCs/>
+        </w:rPr>
+        <w:instrText>HYPERLINK  \l "_top"</w:instrText>
+      </w:r>
+      <w:r>
+        <w:rPr>
+          <w:b/>
+          <w:bCs/>
+        </w:rPr>
+      </w:r>
+      <w:r>
+        <w:rPr>
+          <w:b/>
+          <w:bCs/>
+        </w:rPr>
+        <w:fldChar w:fldCharType="separate"/>
+      </w:r>
+      <w:r>
+        <w:rPr>
+          <w:rStyle w:val="Hyperlink"/>
+          <w:b/>
+          <w:bCs/>
+        </w:rPr>
+        <w:t>Remot</w:t>
+      </w:r>
+      <w:r>
+        <w:rPr>
+          <w:rStyle w:val="Hyperlink"/>
+          <w:b/>
+          <w:bCs/>
+        </w:rPr>
+        <w:t>e</w:t>
+      </w:r>
+      <w:r>
+        <w:rPr>
+          <w:rStyle w:val="Hyperlink"/>
+          <w:b/>
+          <w:bCs/>
+        </w:rPr>
+        <w:t xml:space="preserve"> progra</w:t>
+      </w:r>
+      <w:r>
+        <w:rPr>
+          <w:rStyle w:val="Hyperlink"/>
+          <w:b/>
+          <w:bCs/>
+        </w:rPr>
+        <w:t>m</w:t>
+      </w:r>
+      <w:r>
+        <w:rPr>
+          <w:rStyle w:val="Hyperlink"/>
+          <w:b/>
+          <w:bCs/>
+        </w:rPr>
+        <w:t>mability function</w:t>
+      </w:r>
+      <w:bookmarkEnd w:id="3"/>
+      <w:r>
+        <w:rPr>
+          <w:b/>
+          <w:bCs/>
+        </w:rPr>
+        <w:fldChar w:fldCharType="end"/>
+      </w:r>
+      <w:r>
+        <w:rPr>
+          <w:b/>
+          <w:bCs/>
+        </w:rPr>
+        <w:t>:</w:t>
+      </w:r>
+      <w:r>
+        <w:t xml:space="preserve"> via fiber commands from the DTC we can execute remote programmability functions like </w:t>
+      </w:r>
+      <w:r>
+        <w:rPr>
+          <w:rFonts w:cstheme="minorHAnsi"/>
+        </w:rPr>
+        <w:t>writ</w:t>
+      </w:r>
+      <w:r>
+        <w:rPr>
+          <w:rFonts w:cstheme="minorHAnsi"/>
+        </w:rPr>
+        <w:t>ing</w:t>
+      </w:r>
+      <w:r>
+        <w:rPr>
+          <w:rFonts w:cstheme="minorHAnsi"/>
+        </w:rPr>
+        <w:t xml:space="preserve"> </w:t>
+      </w:r>
+      <w:r>
+        <w:rPr>
+          <w:rFonts w:cstheme="minorHAnsi"/>
+        </w:rPr>
+        <w:t>to</w:t>
+      </w:r>
+      <w:r>
+        <w:rPr>
+          <w:rFonts w:cstheme="minorHAnsi"/>
+        </w:rPr>
+        <w:t xml:space="preserve"> the</w:t>
+      </w:r>
+      <w:r>
+        <w:rPr>
+          <w:rFonts w:cstheme="minorHAnsi"/>
+        </w:rPr>
+        <w:t xml:space="preserve"> SPI FLASH directory, read</w:t>
+      </w:r>
+      <w:r>
+        <w:rPr>
+          <w:rFonts w:cstheme="minorHAnsi"/>
+        </w:rPr>
+        <w:t>ing</w:t>
+      </w:r>
+      <w:r>
+        <w:rPr>
+          <w:rFonts w:cstheme="minorHAnsi"/>
+        </w:rPr>
+        <w:t xml:space="preserve"> the SPI FLASH content, loading of programming bitstream</w:t>
+      </w:r>
+      <w:r>
+        <w:rPr>
+          <w:rFonts w:cstheme="minorHAnsi"/>
+        </w:rPr>
+        <w:t xml:space="preserve"> (images)</w:t>
+      </w:r>
+      <w:r>
+        <w:rPr>
+          <w:rFonts w:cstheme="minorHAnsi"/>
+        </w:rPr>
+        <w:t xml:space="preserve"> to the SPI</w:t>
+      </w:r>
+      <w:r>
+        <w:rPr>
+          <w:rFonts w:cstheme="minorHAnsi"/>
+        </w:rPr>
+        <w:t>,</w:t>
+      </w:r>
+      <w:r>
+        <w:rPr>
+          <w:rFonts w:cstheme="minorHAnsi"/>
+        </w:rPr>
+        <w:t xml:space="preserve"> and IAP programming of the device using </w:t>
+      </w:r>
+      <w:r>
+        <w:rPr>
+          <w:rFonts w:cstheme="minorHAnsi"/>
+        </w:rPr>
+        <w:t>images loaded</w:t>
+      </w:r>
+      <w:r>
+        <w:rPr>
+          <w:rFonts w:cstheme="minorHAnsi"/>
+        </w:rPr>
+        <w:t xml:space="preserve"> in SPI FLASH</w:t>
+      </w:r>
+      <w:r>
+        <w:rPr>
+          <w:rFonts w:cstheme="minorHAnsi"/>
+        </w:rPr>
+        <w:t xml:space="preserve">. A detailed </w:t>
+      </w:r>
+      <w:r>
+        <w:rPr>
+          <w:rFonts w:cstheme="minorHAnsi"/>
+        </w:rPr>
+        <w:t xml:space="preserve">documentation of these function is included in the “ROC Remote Programmability register” document. </w:t>
+      </w:r>
+    </w:p>
+    <w:p>
+      <w:pPr>
+        <w:rPr>
+          <w:rFonts w:cstheme="minorHAnsi"/>
+          <w:sz w:val="21"/>
+          <w:szCs w:val="21"/>
+        </w:rPr>
+      </w:pPr>
+    </w:p>
+    <w:p>
+      <w:pPr>
+        <w:rPr>
+          <w:rFonts w:cstheme="minorHAnsi"/>
+        </w:rPr>
+      </w:pPr>
+      <w:r>
+        <w:rPr>
+          <w:rFonts w:cstheme="minorHAnsi"/>
+        </w:rPr>
+        <w:t xml:space="preserve">All remote programmability functions are executed via a </w:t>
+      </w:r>
+      <w:r>
+        <w:rPr>
+          <w:rFonts w:cstheme="minorHAnsi"/>
+          <w:b/>
+          <w:bCs/>
+        </w:rPr>
+        <w:t>DCS block write</w:t>
+      </w:r>
+      <w:r>
+        <w:rPr>
+          <w:rFonts w:cstheme="minorHAnsi"/>
+        </w:rPr>
+        <w:t xml:space="preserve"> command to register </w:t>
+      </w:r>
+      <w:r>
+        <w:rPr>
+          <w:rFonts w:cstheme="minorHAnsi"/>
+          <w:b/>
+          <w:bCs/>
+        </w:rPr>
+        <w:t>384</w:t>
+      </w:r>
+      <w:r>
+        <w:rPr>
+          <w:rFonts w:cstheme="minorHAnsi"/>
+        </w:rPr>
+        <w:t xml:space="preserve">.  </w:t>
+      </w:r>
+    </w:p>
+    <w:p>
+      <w:pPr>
+        <w:rPr>
+          <w:rFonts w:cstheme="minorHAnsi"/>
+        </w:rPr>
+      </w:pPr>
+    </w:p>
+    <w:p>
+      <w:pPr>
+        <w:rPr>
+          <w:rFonts w:cstheme="minorHAnsi"/>
+        </w:rPr>
+      </w:pPr>
+      <w:r>
+        <w:rPr>
+          <w:rFonts w:cstheme="minorHAnsi"/>
+        </w:rPr>
+        <w:t xml:space="preserve">The block write payload has a </w:t>
+      </w:r>
+      <w:r>
+        <w:rPr>
+          <w:rFonts w:cstheme="minorHAnsi"/>
+          <w:u w:val="single"/>
+        </w:rPr>
+        <w:t>minimum of 5 payload words</w:t>
+      </w:r>
+      <w:r>
+        <w:rPr>
+          <w:rFonts w:cstheme="minorHAnsi"/>
+        </w:rPr>
+        <w:t xml:space="preserve">, which in the following will be referred as the </w:t>
+      </w:r>
+      <w:r>
+        <w:rPr>
+          <w:rFonts w:cstheme="minorHAnsi"/>
+          <w:i/>
+          <w:iCs/>
+        </w:rPr>
+        <w:t>common words</w:t>
+      </w:r>
+      <w:r>
+        <w:rPr>
+          <w:rFonts w:cstheme="minorHAnsi"/>
+        </w:rPr>
+        <w:t xml:space="preserve">. Some programming commands requires added payload words, which will be referred to as </w:t>
+      </w:r>
+      <w:r>
+        <w:rPr>
+          <w:rFonts w:cstheme="minorHAnsi"/>
+          <w:i/>
+          <w:iCs/>
+        </w:rPr>
+        <w:t>programming words</w:t>
+      </w:r>
+      <w:r>
+        <w:rPr>
+          <w:rFonts w:cstheme="minorHAnsi"/>
+        </w:rPr>
+        <w:t xml:space="preserve">. Details on the </w:t>
+      </w:r>
+      <w:r>
+        <w:rPr>
+          <w:rFonts w:cstheme="minorHAnsi"/>
+        </w:rPr>
+        <w:t>common</w:t>
+      </w:r>
+      <w:r>
+        <w:rPr>
+          <w:rFonts w:cstheme="minorHAnsi"/>
+        </w:rPr>
+        <w:t xml:space="preserve"> and programming words are listed in the remote programmability command parameter section below. </w:t>
+      </w:r>
+    </w:p>
+    <w:p>
+      <w:pPr>
+        <w:rPr>
+          <w:rFonts w:cstheme="minorHAnsi"/>
+        </w:rPr>
+      </w:pPr>
+    </w:p>
+    <w:p>
+      <w:pPr>
+        <w:rPr>
+          <w:rFonts w:cstheme="minorHAnsi"/>
+        </w:rPr>
+      </w:pPr>
+      <w:r>
+        <w:rPr>
+          <w:rFonts w:cstheme="minorHAnsi"/>
+        </w:rPr>
+        <w:t xml:space="preserve">The </w:t>
+      </w:r>
+      <w:r>
+        <w:rPr>
+          <w:rFonts w:cstheme="minorHAnsi"/>
+          <w:b/>
+          <w:bCs/>
+        </w:rPr>
+        <w:t>common words</w:t>
+      </w:r>
+      <w:r>
+        <w:rPr>
+          <w:rFonts w:cstheme="minorHAnsi"/>
+        </w:rPr>
+        <w:t xml:space="preserve"> are defined as follow:</w:t>
+      </w:r>
+    </w:p>
+    <w:p>
+      <w:pPr>
+        <w:pStyle w:val="ListParagraph"/>
+        <w:numPr>
+          <w:ilvl w:val="0"/>
+          <w:numId w:val="30"/>
+        </w:numPr>
+        <w:rPr>
+          <w:rFonts w:cstheme="minorHAnsi"/>
+        </w:rPr>
+      </w:pPr>
+      <w:r>
+        <w:rPr>
+          <w:rFonts w:cstheme="minorHAnsi"/>
+          <w:i/>
+          <w:iCs/>
+        </w:rPr>
+        <w:t>action word</w:t>
+      </w:r>
+      <w:r>
+        <w:rPr>
+          <w:rFonts w:cstheme="minorHAnsi"/>
+        </w:rPr>
+        <w:t>,</w:t>
+      </w:r>
+      <w:r>
+        <w:rPr>
+          <w:rFonts w:cstheme="minorHAnsi"/>
+        </w:rPr>
+        <w:t xml:space="preserve"> passed via first </w:t>
+      </w:r>
+      <w:r>
+        <w:rPr>
+          <w:rFonts w:cstheme="minorHAnsi"/>
+        </w:rPr>
+        <w:t>command word</w:t>
+      </w:r>
+      <w:r>
+        <w:rPr>
+          <w:rFonts w:cstheme="minorHAnsi"/>
+        </w:rPr>
+        <w:t>,</w:t>
+      </w:r>
+      <w:r>
+        <w:rPr>
+          <w:rFonts w:cstheme="minorHAnsi"/>
+        </w:rPr>
+        <w:t xml:space="preserve"> </w:t>
+      </w:r>
+      <w:r>
+        <w:rPr>
+          <w:rFonts w:cstheme="minorHAnsi"/>
+        </w:rPr>
+        <w:t>specify</w:t>
+      </w:r>
+      <w:r>
+        <w:rPr>
+          <w:rFonts w:cstheme="minorHAnsi"/>
+        </w:rPr>
+        <w:t xml:space="preserve"> the programming action</w:t>
+      </w:r>
+    </w:p>
+    <w:p>
+      <w:pPr>
+        <w:pStyle w:val="ListParagraph"/>
+        <w:numPr>
+          <w:ilvl w:val="0"/>
+          <w:numId w:val="30"/>
+        </w:numPr>
+        <w:rPr>
+          <w:rFonts w:cstheme="minorHAnsi"/>
+        </w:rPr>
+      </w:pPr>
+      <w:r>
+        <w:rPr>
+          <w:rFonts w:cstheme="minorHAnsi"/>
+          <w:i/>
+          <w:iCs/>
+        </w:rPr>
+        <w:t>1</w:t>
+      </w:r>
+      <w:r>
+        <w:rPr>
+          <w:rFonts w:cstheme="minorHAnsi"/>
+          <w:i/>
+          <w:iCs/>
+          <w:vertAlign w:val="superscript"/>
+        </w:rPr>
+        <w:t>st</w:t>
+      </w:r>
+      <w:r>
+        <w:rPr>
+          <w:rFonts w:cstheme="minorHAnsi"/>
+          <w:i/>
+          <w:iCs/>
+        </w:rPr>
+        <w:t xml:space="preserve">  command word</w:t>
+      </w:r>
+      <w:r>
+        <w:rPr>
+          <w:rFonts w:cstheme="minorHAnsi"/>
+        </w:rPr>
+        <w:t>,</w:t>
+      </w:r>
+      <w:r>
+        <w:rPr>
+          <w:rFonts w:cstheme="minorHAnsi"/>
+        </w:rPr>
+        <w:t xml:space="preserve"> is a 32-bit parameter passed via the second (16 LSB) and third (16 MSB) </w:t>
+      </w:r>
+      <w:r>
+        <w:rPr>
+          <w:rFonts w:cstheme="minorHAnsi"/>
+        </w:rPr>
+        <w:t>command word</w:t>
+      </w:r>
+      <w:r>
+        <w:rPr>
+          <w:rFonts w:cstheme="minorHAnsi"/>
+        </w:rPr>
+        <w:t>s</w:t>
+      </w:r>
+    </w:p>
+    <w:p>
+      <w:pPr>
+        <w:pStyle w:val="ListParagraph"/>
+        <w:numPr>
+          <w:ilvl w:val="0"/>
+          <w:numId w:val="30"/>
+        </w:numPr>
+        <w:rPr>
+          <w:rFonts w:cstheme="minorHAnsi"/>
+        </w:rPr>
+      </w:pPr>
+      <w:r>
+        <w:rPr>
+          <w:rFonts w:cstheme="minorHAnsi"/>
+          <w:i/>
+          <w:iCs/>
+        </w:rPr>
+        <w:lastRenderedPageBreak/>
+        <w:t>2</w:t>
+      </w:r>
+      <w:r>
+        <w:rPr>
+          <w:rFonts w:cstheme="minorHAnsi"/>
+          <w:i/>
+          <w:iCs/>
+          <w:vertAlign w:val="superscript"/>
+        </w:rPr>
+        <w:t>nd</w:t>
+      </w:r>
+      <w:r>
+        <w:rPr>
+          <w:rFonts w:cstheme="minorHAnsi"/>
+          <w:i/>
+          <w:iCs/>
+        </w:rPr>
+        <w:t xml:space="preserve"> </w:t>
+      </w:r>
+      <w:r>
+        <w:rPr>
+          <w:rFonts w:cstheme="minorHAnsi"/>
+          <w:i/>
+          <w:iCs/>
+        </w:rPr>
+        <w:t>command</w:t>
+      </w:r>
+      <w:r>
+        <w:rPr>
+          <w:rFonts w:cstheme="minorHAnsi"/>
+          <w:i/>
+          <w:iCs/>
+        </w:rPr>
+        <w:t xml:space="preserve"> word</w:t>
+      </w:r>
+      <w:r>
+        <w:rPr>
+          <w:rFonts w:cstheme="minorHAnsi"/>
+        </w:rPr>
+        <w:t xml:space="preserve">, is a 32-bit parameter passed via the </w:t>
+      </w:r>
+      <w:r>
+        <w:rPr>
+          <w:rFonts w:cstheme="minorHAnsi"/>
+        </w:rPr>
+        <w:t>fourth</w:t>
+      </w:r>
+      <w:r>
+        <w:rPr>
+          <w:rFonts w:cstheme="minorHAnsi"/>
+        </w:rPr>
+        <w:t xml:space="preserve"> (16</w:t>
+      </w:r>
+      <w:r>
+        <w:rPr>
+          <w:rFonts w:cstheme="minorHAnsi"/>
+        </w:rPr>
+        <w:t xml:space="preserve"> </w:t>
+      </w:r>
+      <w:r>
+        <w:rPr>
+          <w:rFonts w:cstheme="minorHAnsi"/>
+        </w:rPr>
+        <w:t xml:space="preserve">LSB) and </w:t>
+      </w:r>
+      <w:r>
+        <w:rPr>
+          <w:rFonts w:cstheme="minorHAnsi"/>
+        </w:rPr>
+        <w:t>fifth</w:t>
+      </w:r>
+      <w:r>
+        <w:rPr>
+          <w:rFonts w:cstheme="minorHAnsi"/>
+        </w:rPr>
+        <w:t xml:space="preserve"> (16</w:t>
+      </w:r>
+      <w:r>
+        <w:rPr>
+          <w:rFonts w:cstheme="minorHAnsi"/>
+        </w:rPr>
+        <w:t xml:space="preserve"> </w:t>
+      </w:r>
+      <w:r>
+        <w:rPr>
+          <w:rFonts w:cstheme="minorHAnsi"/>
+        </w:rPr>
+        <w:t>MSB) command words</w:t>
+      </w:r>
+    </w:p>
+    <w:p>
+      <w:pPr>
+        <w:rPr>
+          <w:rFonts w:cstheme="minorHAnsi"/>
+        </w:rPr>
+      </w:pPr>
+    </w:p>
+    <w:p>
+      <w:pPr>
+        <w:rPr>
+          <w:rFonts w:cstheme="minorHAnsi"/>
+        </w:rPr>
+      </w:pPr>
+      <w:r>
+        <w:rPr>
+          <w:rFonts w:cstheme="minorHAnsi"/>
+        </w:rPr>
+        <w:t>Two ROC registers reports on the BUSY/DONE and RETURN_STATUS for any command and can be accessed vi</w:t>
+      </w:r>
+      <w:r>
+        <w:rPr>
+          <w:rFonts w:cstheme="minorHAnsi"/>
+        </w:rPr>
+        <w:t>a DCS read</w:t>
+      </w:r>
+      <w:r>
+        <w:rPr>
+          <w:rFonts w:cstheme="minorHAnsi"/>
+        </w:rPr>
+        <w:t>:</w:t>
+      </w:r>
+    </w:p>
+    <w:p>
+      <w:pPr>
+        <w:pStyle w:val="ListParagraph"/>
+        <w:numPr>
+          <w:ilvl w:val="0"/>
+          <w:numId w:val="29"/>
+        </w:numPr>
+        <w:rPr>
+          <w:rFonts w:cstheme="minorHAnsi"/>
+        </w:rPr>
+      </w:pPr>
+      <w:r>
+        <w:rPr>
+          <w:rFonts w:cstheme="minorHAnsi"/>
+        </w:rPr>
+        <w:t>BUSY/DONE</w:t>
+      </w:r>
+      <w:r>
+        <w:rPr>
+          <w:rFonts w:cstheme="minorHAnsi"/>
+        </w:rPr>
+        <w:t xml:space="preserve"> = </w:t>
+      </w:r>
+      <w:r>
+        <w:rPr>
+          <w:rFonts w:cstheme="minorHAnsi"/>
+        </w:rPr>
+        <w:t>bit[15]</w:t>
+      </w:r>
+      <w:r>
+        <w:rPr>
+          <w:rFonts w:cstheme="minorHAnsi"/>
+        </w:rPr>
+        <w:t xml:space="preserve"> of register 128</w:t>
+      </w:r>
+      <w:r>
+        <w:rPr>
+          <w:rFonts w:cstheme="minorHAnsi"/>
+        </w:rPr>
+        <w:t xml:space="preserve">: </w:t>
+      </w:r>
+      <w:r>
+        <w:rPr>
+          <w:rFonts w:cstheme="minorHAnsi"/>
+        </w:rPr>
+        <w:t xml:space="preserve"> </w:t>
+      </w:r>
+    </w:p>
+    <w:p>
+      <w:pPr>
+        <w:pStyle w:val="ListParagraph"/>
+        <w:ind w:firstLine="720"/>
+        <w:rPr>
+          <w:rFonts w:cstheme="minorHAnsi"/>
+        </w:rPr>
+      </w:pPr>
+      <w:r>
+        <w:rPr>
+          <w:rFonts w:cstheme="minorHAnsi"/>
+        </w:rPr>
+        <w:t xml:space="preserve">if </w:t>
+      </w:r>
+      <w:r>
+        <w:rPr>
+          <w:rFonts w:cstheme="minorHAnsi"/>
+        </w:rPr>
+        <w:t>0</w:t>
+      </w:r>
+      <w:r>
+        <w:rPr>
+          <w:rFonts w:cstheme="minorHAnsi"/>
+        </w:rPr>
+        <w:t xml:space="preserve">, </w:t>
+      </w:r>
+      <w:r>
+        <w:rPr>
+          <w:rFonts w:cstheme="minorHAnsi"/>
+        </w:rPr>
+        <w:t xml:space="preserve">the microprocessor is still busy and the function is </w:t>
+      </w:r>
+      <w:r>
+        <w:rPr>
+          <w:rFonts w:cstheme="minorHAnsi"/>
+          <w:b/>
+          <w:bCs/>
+        </w:rPr>
+        <w:t>n</w:t>
+      </w:r>
+      <w:r>
+        <w:rPr>
+          <w:rFonts w:cstheme="minorHAnsi"/>
+          <w:b/>
+          <w:bCs/>
+        </w:rPr>
+        <w:t>ot</w:t>
+      </w:r>
+      <w:r>
+        <w:rPr>
+          <w:rFonts w:cstheme="minorHAnsi"/>
+        </w:rPr>
+        <w:t xml:space="preserve"> done</w:t>
+      </w:r>
+      <w:r>
+        <w:rPr>
+          <w:rFonts w:cstheme="minorHAnsi"/>
+        </w:rPr>
+        <w:t xml:space="preserve"> yet</w:t>
+      </w:r>
+    </w:p>
+    <w:p>
+      <w:pPr>
+        <w:pStyle w:val="ListParagraph"/>
+        <w:ind w:firstLine="720"/>
+        <w:rPr>
+          <w:rFonts w:cstheme="minorHAnsi"/>
+        </w:rPr>
+      </w:pPr>
+      <w:r>
+        <w:rPr>
+          <w:rFonts w:cstheme="minorHAnsi"/>
+        </w:rPr>
+        <w:t xml:space="preserve">if </w:t>
+      </w:r>
+      <w:r>
+        <w:rPr>
+          <w:rFonts w:cstheme="minorHAnsi"/>
+        </w:rPr>
+        <w:t>1 that the microprocessor is done</w:t>
+      </w:r>
+    </w:p>
+    <w:p>
+      <w:pPr>
+        <w:pStyle w:val="ListParagraph"/>
+        <w:numPr>
+          <w:ilvl w:val="0"/>
+          <w:numId w:val="29"/>
+        </w:numPr>
+        <w:rPr>
+          <w:rFonts w:cstheme="minorHAnsi"/>
+        </w:rPr>
+      </w:pPr>
+      <w:r>
+        <w:rPr>
+          <w:rFonts w:cstheme="minorHAnsi"/>
+        </w:rPr>
+        <w:t xml:space="preserve">RETURN_STATUS </w:t>
+      </w:r>
+      <w:r>
+        <w:rPr>
+          <w:rFonts w:cstheme="minorHAnsi"/>
+        </w:rPr>
+        <w:t>= bit[15:0]</w:t>
+      </w:r>
+      <w:r>
+        <w:rPr>
+          <w:rFonts w:cstheme="minorHAnsi"/>
+        </w:rPr>
+        <w:t xml:space="preserve"> </w:t>
+      </w:r>
+      <w:r>
+        <w:rPr>
+          <w:rFonts w:cstheme="minorHAnsi"/>
+        </w:rPr>
+        <w:t xml:space="preserve">of </w:t>
+      </w:r>
+      <w:r>
+        <w:rPr>
+          <w:rFonts w:cstheme="minorHAnsi"/>
+        </w:rPr>
+        <w:t>register 132</w:t>
+      </w:r>
+      <w:r>
+        <w:rPr>
+          <w:rFonts w:cstheme="minorHAnsi"/>
+        </w:rPr>
+        <w:t xml:space="preserve">: </w:t>
+      </w:r>
+      <w:r>
+        <w:rPr>
+          <w:rFonts w:cstheme="minorHAnsi"/>
+        </w:rPr>
+        <w:t xml:space="preserve"> read status returned by programming function</w:t>
+      </w:r>
+      <w:r>
+        <w:rPr>
+          <w:rFonts w:cstheme="minorHAnsi"/>
+        </w:rPr>
+        <w:t xml:space="preserve">. </w:t>
+      </w:r>
+      <w:r>
+        <w:rPr>
+          <w:rFonts w:cstheme="minorHAnsi"/>
+          <w:b/>
+          <w:bCs/>
+        </w:rPr>
+        <w:t xml:space="preserve">NB: The status is valid only after </w:t>
+      </w:r>
+      <w:r>
+        <w:rPr>
+          <w:rFonts w:cstheme="minorHAnsi"/>
+          <w:b/>
+          <w:bCs/>
+        </w:rPr>
+        <w:t>BUSY</w:t>
+      </w:r>
+      <w:r>
+        <w:rPr>
+          <w:rFonts w:cstheme="minorHAnsi"/>
+          <w:b/>
+          <w:bCs/>
+        </w:rPr>
+        <w:t>/DONE = 1</w:t>
+      </w:r>
+    </w:p>
+    <w:p>
+      <w:pPr>
+        <w:rPr>
+          <w:b/>
+          <w:bCs/>
+        </w:rPr>
+      </w:pPr>
+    </w:p>
+    <w:p>
+      <w:pPr>
+        <w:rPr>
+          <w:b/>
+          <w:bCs/>
+        </w:rPr>
+      </w:pPr>
+    </w:p>
+    <w:bookmarkStart w:id="4" w:name="timeout"/>
+    <w:p>
+      <w:r>
+        <w:rPr>
+          <w:b/>
+          <w:bCs/>
+        </w:rPr>
+        <w:fldChar w:fldCharType="begin"/>
+      </w:r>
+      <w:r>
+        <w:rPr>
+          <w:b/>
+          <w:bCs/>
+        </w:rPr>
+        <w:instrText>HYPERLINK  \l "_top"</w:instrText>
+      </w:r>
+      <w:r>
+        <w:rPr>
+          <w:b/>
+          <w:bCs/>
+        </w:rPr>
+      </w:r>
+      <w:r>
+        <w:rPr>
+          <w:b/>
+          <w:bCs/>
+        </w:rPr>
+        <w:fldChar w:fldCharType="separate"/>
+      </w:r>
+      <w:r>
+        <w:rPr>
+          <w:rStyle w:val="Hyperlink"/>
           <w:b/>
           <w:bCs/>
         </w:rPr>
@@ -520,12 +2039,20 @@
       </w:r>
       <w:r>
         <w:rPr>
+          <w:rStyle w:val="Hyperlink"/>
           <w:b/>
           <w:bCs/>
         </w:rPr>
         <w:t>t</w:t>
       </w:r>
-      <w:bookmarkEnd w:id="1"/>
+      <w:bookmarkEnd w:id="4"/>
+      <w:r>
+        <w:rPr>
+          <w:b/>
+          <w:bCs/>
+        </w:rPr>
+        <w:fldChar w:fldCharType="end"/>
+      </w:r>
       <w:r>
         <w:rPr>
           <w:b/>
@@ -534,181 +2061,231 @@
         <w:t>:</w:t>
       </w:r>
       <w:r>
+        <w:t xml:space="preserve"> the readout timeout is the </w:t>
+      </w:r>
+      <w:r>
+        <w:rPr>
+          <w:u w:val="single"/>
+        </w:rPr>
+        <w:t xml:space="preserve">maximum time allowed </w:t>
+      </w:r>
+      <w:r>
+        <w:rPr>
+          <w:u w:val="single"/>
+        </w:rPr>
+        <w:t xml:space="preserve">to service a </w:t>
+      </w:r>
+      <w:r>
+        <w:rPr>
+          <w:u w:val="single"/>
+        </w:rPr>
+        <w:t>Data Request (DREQ)</w:t>
+      </w:r>
+      <w:r>
+        <w:t xml:space="preserve"> from the DTC</w:t>
+      </w:r>
+      <w:r>
+        <w:t xml:space="preserve">, </w:t>
+      </w:r>
+      <w:proofErr w:type="spellStart"/>
+      <w:r>
+        <w:t>ie</w:t>
+      </w:r>
+      <w:proofErr w:type="spellEnd"/>
+      <w:r>
+        <w:t xml:space="preserve"> the time from the DREQ being received</w:t>
+      </w:r>
+      <w:r>
+        <w:t xml:space="preserve"> and the data </w:t>
+      </w:r>
+      <w:r>
+        <w:t>being fully read from</w:t>
+      </w:r>
+      <w:r>
+        <w:t xml:space="preserve"> the D</w:t>
+      </w:r>
+      <w:r>
+        <w:t>DR and dumped in one of the two EVT_FIFOs</w:t>
+      </w:r>
+      <w:r>
+        <w:t xml:space="preserve"> to be </w:t>
+      </w:r>
+      <w:r>
+        <w:t>sent back to the DTC</w:t>
+      </w:r>
+      <w:r>
+        <w:t xml:space="preserve">. </w:t>
+      </w:r>
+    </w:p>
+    <w:p>
+      <w:r>
+        <w:t>For an event with a large number of hits, this time can be very long as it requires the DIGI data to arrive at the RO</w:t>
+      </w:r>
+      <w:r>
+        <w:t>C and</w:t>
+      </w:r>
+      <w:r>
+        <w:t xml:space="preserve"> be completely flushed from all of the 4 lanes, even if the data saved for the event is only the first 8kB received. Only then the event is written to DDR, recorded in the DREQ_FIFO</w:t>
+      </w:r>
+      <w:r>
+        <w:t>,</w:t>
+      </w:r>
+      <w:r>
         <w:t xml:space="preserve"> </w:t>
       </w:r>
       <w:r>
-        <w:t xml:space="preserve">the readout timeout is the </w:t>
+        <w:t xml:space="preserve">and finally </w:t>
+      </w:r>
+      <w:r>
+        <w:t xml:space="preserve">read back from DDR into one of the two EVT_FIFOs. </w:t>
+      </w:r>
+    </w:p>
+    <w:p/>
+    <w:p>
+      <w:r>
+        <w:t>T</w:t>
+      </w:r>
+      <w:r>
+        <w:t>his readout timeout, EVENT_TIMEOUT[19:0], is in units of 12.5 ns (or 80 MHz clock ticks) and</w:t>
+      </w:r>
+      <w:r>
+        <w:t xml:space="preserve"> </w:t>
+      </w:r>
+      <w:r>
+        <w:t>is</w:t>
+      </w:r>
+      <w:r>
+        <w:t xml:space="preserve"> </w:t>
+      </w:r>
+      <w:r>
+        <w:t xml:space="preserve">set by a DCS write to address=60 (for EVENT_TIMEOUT[15:0]) and address=61 (for EVENT_TIMEOUT[19:0]). Its default value at power up is 0xFFFF, or </w:t>
+      </w:r>
+      <w:r>
+        <w:t>820us.</w:t>
+      </w:r>
+    </w:p>
+    <w:p>
+      <w:r>
+        <w:t>It can be read via a DCS read of address=60 (for EVENT_TIMEOUT[15:0]) and address=61 (for EVENT_TIMEOUT[19:0]).</w:t>
+      </w:r>
+    </w:p>
+    <w:p/>
+    <w:p>
+      <w:pPr>
+        <w:rPr>
+          <w:i/>
+          <w:iCs/>
+        </w:rPr>
+      </w:pPr>
+      <w:r>
+        <w:rPr>
+          <w:i/>
+          <w:iCs/>
+        </w:rPr>
+        <w:t>NB: In</w:t>
+      </w:r>
+      <w:r>
+        <w:rPr>
+          <w:i/>
+          <w:iCs/>
+        </w:rPr>
+        <w:t xml:space="preserve"> </w:t>
+      </w:r>
+      <w:r>
+        <w:rPr>
+          <w:i/>
+          <w:iCs/>
+        </w:rPr>
+        <w:t>version</w:t>
+      </w:r>
+      <w:r>
+        <w:rPr>
+          <w:i/>
+          <w:iCs/>
+        </w:rPr>
+        <w:t>s</w:t>
+      </w:r>
+      <w:r>
+        <w:rPr>
+          <w:i/>
+          <w:iCs/>
+        </w:rPr>
+        <w:t xml:space="preserve"> of the ROC firmware </w:t>
+      </w:r>
+      <w:r>
+        <w:rPr>
+          <w:i/>
+          <w:iCs/>
+        </w:rPr>
+        <w:t xml:space="preserve">earlier than May 5 2025, </w:t>
+      </w:r>
+      <w:r>
+        <w:rPr>
+          <w:i/>
+          <w:iCs/>
+        </w:rPr>
+        <w:t>this timeout was hardwired to a value of 0x3FFF or 205us.</w:t>
+      </w:r>
+    </w:p>
+    <w:p/>
+    <w:p/>
+    <w:bookmarkStart w:id="5" w:name="ddr_dump"/>
+    <w:p>
+      <w:pPr>
+        <w:rPr>
+          <w:b/>
+          <w:bCs/>
+        </w:rPr>
+      </w:pPr>
+      <w:r>
+        <w:rPr>
+          <w:b/>
+          <w:bCs/>
+        </w:rPr>
+        <w:fldChar w:fldCharType="begin"/>
+      </w:r>
+      <w:r>
+        <w:rPr>
+          <w:b/>
+          <w:bCs/>
+        </w:rPr>
+        <w:instrText>HYPERLINK  \l "_top"</w:instrText>
+      </w:r>
+      <w:r>
+        <w:rPr>
+          <w:b/>
+          <w:bCs/>
+        </w:rPr>
+      </w:r>
+      <w:r>
+        <w:rPr>
+          <w:b/>
+          <w:bCs/>
+        </w:rPr>
+        <w:fldChar w:fldCharType="separate"/>
+      </w:r>
+      <w:r>
+        <w:rPr>
+          <w:rStyle w:val="Hyperlink"/>
+          <w:b/>
+          <w:bCs/>
+        </w:rPr>
+        <w:t>DDR Dump</w:t>
+      </w:r>
+      <w:bookmarkEnd w:id="5"/>
+      <w:r>
+        <w:rPr>
+          <w:b/>
+          <w:bCs/>
+        </w:rPr>
+        <w:fldChar w:fldCharType="end"/>
       </w:r>
       <w:r>
         <w:rPr>
           <w:u w:val="single"/>
         </w:rPr>
-        <w:t xml:space="preserve">maximum time allowed </w:t>
-      </w:r>
-      <w:r>
-        <w:rPr>
-          <w:u w:val="single"/>
-        </w:rPr>
-        <w:t xml:space="preserve">to service a </w:t>
-      </w:r>
-      <w:r>
-        <w:rPr>
-          <w:u w:val="single"/>
-        </w:rPr>
-        <w:t>Data Request (DREQ)</w:t>
-      </w:r>
-      <w:r>
-        <w:t xml:space="preserve"> from the DTC</w:t>
-      </w:r>
-      <w:r>
-        <w:t xml:space="preserve">, </w:t>
-      </w:r>
-      <w:proofErr w:type="spellStart"/>
-      <w:r>
-        <w:t>ie</w:t>
-      </w:r>
-      <w:proofErr w:type="spellEnd"/>
-      <w:r>
-        <w:t xml:space="preserve"> the time from the DREQ being received</w:t>
-      </w:r>
-      <w:r>
-        <w:t xml:space="preserve"> and the data </w:t>
-      </w:r>
-      <w:r>
-        <w:t>being fully read from</w:t>
-      </w:r>
-      <w:r>
-        <w:t xml:space="preserve"> the D</w:t>
-      </w:r>
-      <w:r>
-        <w:t>DR and dumped in one of the two EVT_FIFOs</w:t>
-      </w:r>
-      <w:r>
-        <w:t xml:space="preserve"> to be </w:t>
-      </w:r>
-      <w:r>
-        <w:t>sent back to the DTC</w:t>
-      </w:r>
-      <w:r>
-        <w:t xml:space="preserve">. </w:t>
-      </w:r>
-    </w:p>
-    <w:p>
-      <w:r>
-        <w:t>For an event with a large number of hits, this time can be very long as it requires the DIGI data to arrive at the RO</w:t>
-      </w:r>
-      <w:r>
-        <w:t>C and</w:t>
-      </w:r>
-      <w:r>
-        <w:t xml:space="preserve"> be completely flushed from all of the 4 lanes, even if the data saved for the event is only the first 8kB received. Only then the event is written to DDR, recorded in the DREQ_FIFO</w:t>
-      </w:r>
-      <w:r>
-        <w:t>,</w:t>
-      </w:r>
-      <w:r>
-        <w:t xml:space="preserve"> </w:t>
-      </w:r>
-      <w:r>
-        <w:t xml:space="preserve">and finally </w:t>
-      </w:r>
-      <w:r>
-        <w:t xml:space="preserve">read back from DDR into one of the two EVT_FIFOs. </w:t>
-      </w:r>
-    </w:p>
-    <w:p/>
-    <w:p>
-      <w:r>
-        <w:t>T</w:t>
-      </w:r>
-      <w:r>
-        <w:t>his readout timeout, EVENT_TIMEOUT[19:0], is in units of 12.5 ns (or 80 MHz clock ticks) and</w:t>
-      </w:r>
-      <w:r>
-        <w:t xml:space="preserve"> </w:t>
-      </w:r>
-      <w:r>
-        <w:t>is</w:t>
-      </w:r>
-      <w:r>
-        <w:t xml:space="preserve"> </w:t>
-      </w:r>
-      <w:r>
-        <w:t xml:space="preserve">set by a DCS write to address=60 (for </w:t>
-      </w:r>
-      <w:r>
-        <w:t>EVENT_TIMEOUT[1</w:t>
-      </w:r>
-      <w:r>
-        <w:t>5</w:t>
-      </w:r>
-      <w:r>
-        <w:t>:0]</w:t>
-      </w:r>
-      <w:r>
-        <w:t>) and address=61</w:t>
-      </w:r>
-      <w:r>
-        <w:t xml:space="preserve"> (for EVENT_TIMEOUT[1</w:t>
-      </w:r>
-      <w:r>
-        <w:t>9</w:t>
-      </w:r>
-      <w:r>
-        <w:t>:0])</w:t>
-      </w:r>
-      <w:r>
-        <w:t xml:space="preserve">. Its default value at power up is 0xFFFF, or </w:t>
-      </w:r>
-      <w:r>
-        <w:t>820us.</w:t>
-      </w:r>
-    </w:p>
-    <w:p>
-      <w:r>
-        <w:t xml:space="preserve">It can be read via a DCS read of address=60 </w:t>
-      </w:r>
-      <w:r>
-        <w:t>(for EVENT_TIMEOUT[15:0]) and address=61 (for EVENT_TIMEOUT[19:0]).</w:t>
-      </w:r>
-    </w:p>
-    <w:p/>
-    <w:p>
-      <w:r>
-        <w:t>NB: In previous version of the ROC firmware this timeout was hardwired to a value of 0x3FFF or 205us.</w:t>
-      </w:r>
-    </w:p>
-    <w:p>
-      <w:pPr>
-        <w:rPr>
-          <w:b/>
-          <w:bCs/>
-        </w:rPr>
-      </w:pPr>
-      <w:r>
-        <w:rPr>
-          <w:b/>
-          <w:bCs/>
-        </w:rPr>
-        <w:br w:type="page"/>
-      </w:r>
-      <w:bookmarkStart w:id="2" w:name="ddr_dump"/>
-      <w:bookmarkEnd w:id="0"/>
-      <w:r>
-        <w:rPr>
-          <w:b/>
-          <w:bCs/>
-        </w:rPr>
-        <w:lastRenderedPageBreak/>
-        <w:t>DDR Dump</w:t>
-      </w:r>
-      <w:r>
-        <w:rPr>
-          <w:u w:val="single"/>
-        </w:rPr>
         <w:t>:</w:t>
       </w:r>
-      <w:bookmarkEnd w:id="2"/>
       <w:r>
         <w:t xml:space="preserve">  Ability to access DDR memory content at a programmable MEM_OFFSET</w:t>
       </w:r>
@@ -894,37 +2471,13 @@
         <w:t xml:space="preserve"> </w:t>
       </w:r>
       <w:r>
-        <w:t xml:space="preserve">that a </w:t>
-      </w:r>
-      <w:r>
-        <w:t xml:space="preserve">DCS read of address=20 </w:t>
-      </w:r>
-      <w:r>
-        <w:t>returns</w:t>
-      </w:r>
-      <w:r>
-        <w:t xml:space="preserve"> 0x</w:t>
-      </w:r>
-      <w:r>
-        <w:t xml:space="preserve">0 </w:t>
-      </w:r>
-      <w:r>
-        <w:t>(where bit[15]=DUMP_FIFO full; bit[7</w:t>
+        <w:t>that a DCS read of address=20 returns 0x0 (where bit[15]=DUMP_FIFO full; bit[7</w:t>
       </w:r>
       <w:r>
         <w:t>:0]=DUMP</w:t>
       </w:r>
       <w:r>
-        <w:t>_FIFO WRCNT</w:t>
-      </w:r>
-      <w:r>
-        <w:t xml:space="preserve"> in units of 64-bit words</w:t>
-      </w:r>
-      <w:r>
-        <w:t>)</w:t>
-      </w:r>
-      <w:r>
-        <w:t xml:space="preserve"> and a</w:t>
+        <w:t>_FIFO WRCNT in units of 64-bit words) and a</w:t>
       </w:r>
       <w:r>
         <w:t xml:space="preserve"> </w:t>
@@ -978,6 +2531,7 @@
         </w:rPr>
       </w:pPr>
       <w:r>
+        <w:lastRenderedPageBreak/>
         <w:t xml:space="preserve">Set MEM_OFFSET </w:t>
       </w:r>
       <w:r>
@@ -1385,16 +2939,7 @@
         <w:t xml:space="preserve">[15:0]) and address=16 </w:t>
       </w:r>
       <w:r>
-        <w:t>(</w:t>
-      </w:r>
-      <w:r>
-        <w:t>DDR_READ_ADDR[19:16]</w:t>
-      </w:r>
-      <w:r>
-        <w:t>)</w:t>
-      </w:r>
-      <w:r>
-        <w:t>.</w:t>
+        <w:t>(DDR_READ_ADDR[19:16]).</w:t>
       </w:r>
     </w:p>
     <w:p>
@@ -1651,7 +3196,6 @@
         <w:rPr>
           <w:color w:val="FF0000"/>
         </w:rPr>
-        <w:lastRenderedPageBreak/>
         <w:t>1</w:t>
       </w:r>
       <w:r>
@@ -1684,73 +3228,48 @@
         <w:rPr>
           <w:u w:val="single"/>
         </w:rPr>
-        <w:t>bit[61]</w:t>
+        <w:t>bit[6</w:t>
       </w:r>
       <w:r>
         <w:rPr>
           <w:u w:val="single"/>
         </w:rPr>
+        <w:t>3</w:t>
+      </w:r>
+      <w:r>
+        <w:rPr>
+          <w:u w:val="single"/>
+        </w:rPr>
+        <w:t xml:space="preserve">] = event </w:t>
+      </w:r>
+      <w:r>
+        <w:rPr>
+          <w:u w:val="single"/>
+        </w:rPr>
+        <w:t xml:space="preserve">tag </w:t>
+      </w:r>
+      <w:r>
+        <w:rPr>
+          <w:u w:val="single"/>
+        </w:rPr>
+        <w:t>error</w:t>
+      </w:r>
+      <w:r>
+        <w:t xml:space="preserve"> (set to 1 if </w:t>
+      </w:r>
+      <w:r>
+        <w:t xml:space="preserve">tag passed by the DTC in the </w:t>
+      </w:r>
+      <w:proofErr w:type="spellStart"/>
+      <w:r>
+        <w:t>Heartbit</w:t>
+      </w:r>
+      <w:proofErr w:type="spellEnd"/>
+      <w:r>
+        <w:t xml:space="preserve"> DOES NOT agree with the local tag  reported by the DIGI data)</w:t>
+      </w:r>
+      <w:r>
         <w:t xml:space="preserve"> </w:t>
-      </w:r>
-      <w:r>
-        <w:rPr>
-          <w:u w:val="single"/>
-        </w:rPr>
-        <w:t>=</w:t>
-      </w:r>
-      <w:r>
-        <w:rPr>
-          <w:u w:val="single"/>
-        </w:rPr>
-        <w:t xml:space="preserve"> </w:t>
-      </w:r>
-      <w:r>
-        <w:rPr>
-          <w:u w:val="single"/>
-        </w:rPr>
-        <w:t>event error</w:t>
-      </w:r>
-      <w:r>
-        <w:t xml:space="preserve"> (set to 1 if any </w:t>
-      </w:r>
-      <w:r>
-        <w:t>S</w:t>
-      </w:r>
-      <w:r>
-        <w:t>er</w:t>
-      </w:r>
-      <w:r>
-        <w:t>D</w:t>
-      </w:r>
-      <w:r>
-        <w:t>es lane report data from different local tag</w:t>
-      </w:r>
-      <w:r>
-        <w:t xml:space="preserve"> </w:t>
-      </w:r>
-      <w:r>
-        <w:t xml:space="preserve"> </w:t>
-      </w:r>
-      <w:r>
-        <w:t>OR</w:t>
-      </w:r>
-      <w:r>
-        <w:t xml:space="preserve"> </w:t>
-      </w:r>
-      <w:r>
-        <w:t xml:space="preserve">if any SerDes lane report the </w:t>
-      </w:r>
-      <w:r>
-        <w:t>TAG_SYNC error</w:t>
-      </w:r>
-      <w:r>
-        <w:t xml:space="preserve"> bit</w:t>
-      </w:r>
-      <w:r>
-        <w:t>. Such error happens when the SYNC_BIT signals sent by the ROC to the DIGI, indicating that the local tag counter rolls over the 2**14=8192 count, does not agree with the local tag counter in the DIGI</w:t>
-      </w:r>
-      <w:r>
-        <w:t>)</w:t>
       </w:r>
     </w:p>
     <w:p>
@@ -1766,7 +3285,7 @@
         <w:rPr>
           <w:u w:val="single"/>
         </w:rPr>
-        <w:t>bit[60]</w:t>
+        <w:t>bit[61]</w:t>
       </w:r>
       <w:r>
         <w:rPr>
@@ -1790,50 +3309,64 @@
         <w:rPr>
           <w:u w:val="single"/>
         </w:rPr>
-        <w:t>event overflow</w:t>
-      </w:r>
-      <w:r>
-        <w:t xml:space="preserve"> (set to 1 if event has </w:t>
-      </w:r>
-      <w:r>
-        <w:rPr>
-          <w:b/>
-          <w:bCs/>
-        </w:rPr>
-        <w:t>more than</w:t>
-      </w:r>
-      <w:r>
-        <w:t xml:space="preserve"> maximum allowed </w:t>
-      </w:r>
-      <w:r>
-        <w:t xml:space="preserve">size of 8KB. </w:t>
-      </w:r>
-      <w:r>
-        <w:t xml:space="preserve">When this happen, the ROC firmware writes to DDR </w:t>
-      </w:r>
-      <w:r>
-        <w:t xml:space="preserve">first the full data reported by the DIGI CAL0 lane, </w:t>
-      </w:r>
-      <w:r>
-        <w:t>followed by CAL1, HV0 and HV1</w:t>
-      </w:r>
-      <w:r>
-        <w:t xml:space="preserve"> lane, respectively</w:t>
-      </w:r>
-      <w:r>
-        <w:t xml:space="preserve">. Once the maximum </w:t>
-      </w:r>
-      <w:r>
-        <w:t>size</w:t>
-      </w:r>
-      <w:r>
-        <w:t xml:space="preserve"> is reached, </w:t>
-      </w:r>
-      <w:r>
-        <w:t>data</w:t>
-      </w:r>
-      <w:r>
-        <w:t xml:space="preserve"> from the current and any remaining lanes are dropped.</w:t>
+        <w:t xml:space="preserve">event </w:t>
+      </w:r>
+      <w:r>
+        <w:rPr>
+          <w:u w:val="single"/>
+        </w:rPr>
+        <w:t xml:space="preserve">sync </w:t>
+      </w:r>
+      <w:r>
+        <w:rPr>
+          <w:u w:val="single"/>
+        </w:rPr>
+        <w:t>error</w:t>
+      </w:r>
+      <w:r>
+        <w:t xml:space="preserve"> (set to 1 if any </w:t>
+      </w:r>
+      <w:r>
+        <w:t>S</w:t>
+      </w:r>
+      <w:r>
+        <w:t>er</w:t>
+      </w:r>
+      <w:r>
+        <w:t>D</w:t>
+      </w:r>
+      <w:r>
+        <w:t>es lane report</w:t>
+      </w:r>
+      <w:r>
+        <w:t>s</w:t>
+      </w:r>
+      <w:r>
+        <w:t xml:space="preserve"> data from different local tag</w:t>
+      </w:r>
+      <w:r>
+        <w:t xml:space="preserve"> </w:t>
+      </w:r>
+      <w:r>
+        <w:t xml:space="preserve"> </w:t>
+      </w:r>
+      <w:r>
+        <w:t>OR</w:t>
+      </w:r>
+      <w:r>
+        <w:t xml:space="preserve"> </w:t>
+      </w:r>
+      <w:r>
+        <w:t xml:space="preserve">if any SerDes lane report the </w:t>
+      </w:r>
+      <w:r>
+        <w:t>TAG_SYNC error</w:t>
+      </w:r>
+      <w:r>
+        <w:t xml:space="preserve"> bit</w:t>
+      </w:r>
+      <w:r>
+        <w:t>. Such error happens when the SYNC_BIT signals sent by the ROC to the DIGI, indicating that the local tag counter rolls over the 2**14=8192 count, does not agree with the local tag counter in the DIGI</w:t>
       </w:r>
       <w:r>
         <w:t>)</w:t>
@@ -1852,7 +3385,7 @@
         <w:rPr>
           <w:u w:val="single"/>
         </w:rPr>
-        <w:t>bit[58:48]</w:t>
+        <w:t>bit[60]</w:t>
       </w:r>
       <w:r>
         <w:rPr>
@@ -1876,69 +3409,50 @@
         <w:rPr>
           <w:u w:val="single"/>
         </w:rPr>
-        <w:t xml:space="preserve">remaining </w:t>
-      </w:r>
-      <w:r>
-        <w:rPr>
-          <w:u w:val="single"/>
-        </w:rPr>
-        <w:t>event size</w:t>
-      </w:r>
-      <w:r>
-        <w:t xml:space="preserve">, </w:t>
-      </w:r>
-      <w:proofErr w:type="spellStart"/>
-      <w:r>
-        <w:t>ie</w:t>
-      </w:r>
-      <w:proofErr w:type="spellEnd"/>
-      <w:r>
-        <w:t xml:space="preserve"> number of words still to be written for the event, </w:t>
-      </w:r>
-      <w:r>
-        <w:t>in unit of</w:t>
-      </w:r>
-      <w:r>
-        <w:t xml:space="preserve"> </w:t>
-      </w:r>
-      <w:r>
-        <w:t>64-b</w:t>
-      </w:r>
-      <w:r>
-        <w:t xml:space="preserve">it (where 64-bit </w:t>
-      </w:r>
-      <w:r>
-        <w:t>correspond</w:t>
-      </w:r>
-      <w:r>
-        <w:t>s</w:t>
-      </w:r>
-      <w:r>
-        <w:t xml:space="preserve"> to</w:t>
-      </w:r>
-      <w:r>
-        <w:t xml:space="preserve"> ¼ of a hit</w:t>
-      </w:r>
-      <w:r>
-        <w:t xml:space="preserve"> size </w:t>
-      </w:r>
-      <w:r>
-        <w:t xml:space="preserve"> or ½ of a </w:t>
-      </w:r>
-      <w:r>
-        <w:t xml:space="preserve">DTC </w:t>
-      </w:r>
-      <w:r>
-        <w:t>D</w:t>
-      </w:r>
-      <w:r>
-        <w:t xml:space="preserve">ata Request </w:t>
-      </w:r>
-      <w:r>
-        <w:t>packet</w:t>
-      </w:r>
-      <w:r>
-        <w:t xml:space="preserve"> size</w:t>
+        <w:t>event overflow</w:t>
+      </w:r>
+      <w:r>
+        <w:t xml:space="preserve"> (set to 1 if event has </w:t>
+      </w:r>
+      <w:r>
+        <w:rPr>
+          <w:b/>
+          <w:bCs/>
+        </w:rPr>
+        <w:t>more than</w:t>
+      </w:r>
+      <w:r>
+        <w:t xml:space="preserve"> maximum allowed </w:t>
+      </w:r>
+      <w:r>
+        <w:t xml:space="preserve">size of 8KB. </w:t>
+      </w:r>
+      <w:r>
+        <w:t xml:space="preserve">When this happen, the ROC firmware writes to DDR </w:t>
+      </w:r>
+      <w:r>
+        <w:t xml:space="preserve">first the full data reported by the DIGI CAL0 lane, </w:t>
+      </w:r>
+      <w:r>
+        <w:t>followed by CAL1, HV0 and HV1</w:t>
+      </w:r>
+      <w:r>
+        <w:t xml:space="preserve"> lane, respectively</w:t>
+      </w:r>
+      <w:r>
+        <w:t xml:space="preserve">. Once the maximum </w:t>
+      </w:r>
+      <w:r>
+        <w:t>size</w:t>
+      </w:r>
+      <w:r>
+        <w:t xml:space="preserve"> is reached, </w:t>
+      </w:r>
+      <w:r>
+        <w:t>data</w:t>
+      </w:r>
+      <w:r>
+        <w:t xml:space="preserve"> from the current and any remaining lanes are dropped.</w:t>
       </w:r>
       <w:r>
         <w:t>)</w:t>
@@ -1957,7 +3471,7 @@
         <w:rPr>
           <w:u w:val="single"/>
         </w:rPr>
-        <w:t>bit[47:0]</w:t>
+        <w:t>bit[58:48]</w:t>
       </w:r>
       <w:r>
         <w:rPr>
@@ -1981,16 +3495,16 @@
         <w:rPr>
           <w:u w:val="single"/>
         </w:rPr>
-        <w:t xml:space="preserve">local </w:t>
+        <w:t xml:space="preserve">remaining </w:t>
       </w:r>
       <w:r>
         <w:rPr>
           <w:u w:val="single"/>
         </w:rPr>
-        <w:t>event tag</w:t>
-      </w:r>
-      <w:r>
-        <w:t xml:space="preserve"> as offset tag (</w:t>
+        <w:t>event size</w:t>
+      </w:r>
+      <w:r>
+        <w:t xml:space="preserve">, </w:t>
       </w:r>
       <w:proofErr w:type="spellStart"/>
       <w:r>
@@ -1998,60 +3512,55 @@
       </w:r>
       <w:proofErr w:type="spellEnd"/>
       <w:r>
-        <w:t xml:space="preserve"> first tag of </w:t>
-      </w:r>
-      <w:r>
-        <w:t xml:space="preserve">a new </w:t>
-      </w:r>
-      <w:r>
-        <w:t>run</w:t>
-      </w:r>
-      <w:r>
-        <w:t xml:space="preserve"> after a null HB</w:t>
-      </w:r>
-      <w:r>
-        <w:t>) plus local tag sent by DIGI</w:t>
-      </w:r>
-      <w:r>
-        <w:t>.</w:t>
-      </w:r>
-    </w:p>
-    <w:p>
-      <w:pPr>
-        <w:pStyle w:val="ListParagraph"/>
-        <w:ind w:left="360"/>
-        <w:rPr>
-          <w:u w:val="single"/>
-        </w:rPr>
-      </w:pPr>
-    </w:p>
-    <w:p>
-      <w:pPr>
-        <w:rPr>
-          <w:u w:val="single"/>
-        </w:rPr>
-      </w:pPr>
-      <w:r>
-        <w:rPr>
-          <w:color w:val="FF0000"/>
-        </w:rPr>
-        <w:t>2</w:t>
-      </w:r>
-      <w:r>
-        <w:rPr>
-          <w:color w:val="FF0000"/>
-          <w:vertAlign w:val="superscript"/>
-        </w:rPr>
-        <w:t>nd</w:t>
-      </w:r>
-      <w:r>
-        <w:rPr>
-          <w:color w:val="FF0000"/>
-        </w:rPr>
-        <w:t xml:space="preserve"> header word </w:t>
-      </w:r>
-      <w:r>
-        <w:t>:</w:t>
+        <w:t xml:space="preserve"> number of words still to be written for the event, </w:t>
+      </w:r>
+      <w:r>
+        <w:t>in unit of</w:t>
+      </w:r>
+      <w:r>
+        <w:t xml:space="preserve"> </w:t>
+      </w:r>
+      <w:r>
+        <w:t>64-b</w:t>
+      </w:r>
+      <w:r>
+        <w:t xml:space="preserve">it (where 64-bit </w:t>
+      </w:r>
+      <w:r>
+        <w:t>correspond</w:t>
+      </w:r>
+      <w:r>
+        <w:t>s</w:t>
+      </w:r>
+      <w:r>
+        <w:t xml:space="preserve"> to</w:t>
+      </w:r>
+      <w:r>
+        <w:t xml:space="preserve"> ¼ of a hit</w:t>
+      </w:r>
+      <w:r>
+        <w:t xml:space="preserve"> size </w:t>
+      </w:r>
+      <w:r>
+        <w:t xml:space="preserve"> or ½ of a </w:t>
+      </w:r>
+      <w:r>
+        <w:t xml:space="preserve">DTC </w:t>
+      </w:r>
+      <w:r>
+        <w:t>D</w:t>
+      </w:r>
+      <w:r>
+        <w:t xml:space="preserve">ata Request </w:t>
+      </w:r>
+      <w:r>
+        <w:t>packet</w:t>
+      </w:r>
+      <w:r>
+        <w:t xml:space="preserve"> size</w:t>
+      </w:r>
+      <w:r>
+        <w:t>)</w:t>
       </w:r>
     </w:p>
     <w:p>
@@ -2062,89 +3571,106 @@
           <w:numId w:val="19"/>
         </w:numPr>
         <w:ind w:left="360"/>
+      </w:pPr>
+      <w:r>
         <w:rPr>
           <w:u w:val="single"/>
         </w:rPr>
-      </w:pPr>
+        <w:t>bit[47:0]</w:t>
+      </w:r>
       <w:r>
         <w:rPr>
           <w:u w:val="single"/>
         </w:rPr>
-        <w:t>bit[6</w:t>
+        <w:t xml:space="preserve"> </w:t>
       </w:r>
       <w:r>
         <w:rPr>
           <w:u w:val="single"/>
         </w:rPr>
-        <w:t>3:56</w:t>
+        <w:t>=</w:t>
       </w:r>
       <w:r>
         <w:rPr>
           <w:u w:val="single"/>
         </w:rPr>
-        <w:t>]</w:t>
+        <w:t xml:space="preserve"> </w:t>
       </w:r>
       <w:r>
         <w:rPr>
           <w:u w:val="single"/>
         </w:rPr>
-        <w:t xml:space="preserve"> </w:t>
+        <w:t xml:space="preserve">local </w:t>
       </w:r>
       <w:r>
         <w:rPr>
           <w:u w:val="single"/>
         </w:rPr>
-        <w:t>=</w:t>
-      </w:r>
-      <w:r>
+        <w:t>event tag</w:t>
+      </w:r>
+      <w:r>
+        <w:t xml:space="preserve"> as offset tag (</w:t>
+      </w:r>
+      <w:proofErr w:type="spellStart"/>
+      <w:r>
+        <w:t>ie</w:t>
+      </w:r>
+      <w:proofErr w:type="spellEnd"/>
+      <w:r>
+        <w:t xml:space="preserve"> first tag of </w:t>
+      </w:r>
+      <w:r>
+        <w:t xml:space="preserve">a new </w:t>
+      </w:r>
+      <w:r>
+        <w:t>run</w:t>
+      </w:r>
+      <w:r>
+        <w:t xml:space="preserve"> after a null HB</w:t>
+      </w:r>
+      <w:r>
+        <w:t>) plus local tag sent by DIGI</w:t>
+      </w:r>
+      <w:r>
+        <w:t>.</w:t>
+      </w:r>
+    </w:p>
+    <w:p>
+      <w:pPr>
+        <w:pStyle w:val="ListParagraph"/>
+        <w:ind w:left="360"/>
         <w:rPr>
           <w:u w:val="single"/>
         </w:rPr>
-        <w:t xml:space="preserve"> </w:t>
-      </w:r>
-      <w:r>
+      </w:pPr>
+    </w:p>
+    <w:p>
+      <w:pPr>
         <w:rPr>
           <w:u w:val="single"/>
         </w:rPr>
-        <w:t xml:space="preserve">number of 64-bit words in </w:t>
-      </w:r>
-      <w:r>
-        <w:rPr>
-          <w:u w:val="single"/>
-        </w:rPr>
-        <w:t xml:space="preserve">current </w:t>
-      </w:r>
-      <w:r>
-        <w:rPr>
-          <w:u w:val="single"/>
-        </w:rPr>
-        <w:t>block</w:t>
-      </w:r>
-      <w:r>
-        <w:t xml:space="preserve">, </w:t>
-      </w:r>
-      <w:proofErr w:type="spellStart"/>
-      <w:r>
-        <w:t>ie</w:t>
-      </w:r>
-      <w:proofErr w:type="spellEnd"/>
-      <w:r>
-        <w:t xml:space="preserve"> a number from 0, when event has no hits, to maximum allowed of 126</w:t>
-      </w:r>
-      <w:r>
-        <w:t xml:space="preserve"> (for instance if </w:t>
-      </w:r>
-      <w:r>
-        <w:t xml:space="preserve">event has more than 31 </w:t>
-      </w:r>
-      <w:r>
-        <w:t xml:space="preserve">x 256b </w:t>
-      </w:r>
-      <w:r>
-        <w:t>hits</w:t>
-      </w:r>
-      <w:r>
-        <w:t>)</w:t>
+      </w:pPr>
+      <w:r>
+        <w:rPr>
+          <w:color w:val="FF0000"/>
+        </w:rPr>
+        <w:t>2</w:t>
+      </w:r>
+      <w:r>
+        <w:rPr>
+          <w:color w:val="FF0000"/>
+          <w:vertAlign w:val="superscript"/>
+        </w:rPr>
+        <w:t>nd</w:t>
+      </w:r>
+      <w:r>
+        <w:rPr>
+          <w:color w:val="FF0000"/>
+        </w:rPr>
+        <w:t xml:space="preserve"> header word </w:t>
+      </w:r>
+      <w:r>
+        <w:t>:</w:t>
       </w:r>
     </w:p>
     <w:p>
@@ -2156,32 +3682,31 @@
         </w:numPr>
         <w:ind w:left="360"/>
         <w:rPr>
-          <w:b/>
-          <w:bCs/>
-        </w:rPr>
-      </w:pPr>
-      <w:r>
-        <w:rPr>
           <w:u w:val="single"/>
         </w:rPr>
-        <w:t>bit[5</w:t>
-      </w:r>
+      </w:pPr>
       <w:r>
         <w:rPr>
           <w:u w:val="single"/>
         </w:rPr>
-        <w:t>5</w:t>
+        <w:t>bit[6</w:t>
       </w:r>
       <w:r>
         <w:rPr>
           <w:u w:val="single"/>
         </w:rPr>
-        <w:t>:48]</w:t>
+        <w:t>3:56</w:t>
       </w:r>
       <w:r>
         <w:rPr>
           <w:u w:val="single"/>
         </w:rPr>
+        <w:t>]</w:t>
+      </w:r>
+      <w:r>
+        <w:rPr>
+          <w:u w:val="single"/>
+        </w:rPr>
         <w:t xml:space="preserve"> </w:t>
       </w:r>
       <w:r>
@@ -2200,28 +3725,22 @@
         <w:rPr>
           <w:u w:val="single"/>
         </w:rPr>
-        <w:t xml:space="preserve">block </w:t>
+        <w:t xml:space="preserve">number of 64-bit words in </w:t>
       </w:r>
       <w:r>
         <w:rPr>
           <w:u w:val="single"/>
         </w:rPr>
-        <w:t>number</w:t>
+        <w:t xml:space="preserve">current </w:t>
       </w:r>
       <w:r>
         <w:rPr>
           <w:u w:val="single"/>
         </w:rPr>
-        <w:t xml:space="preserve"> in</w:t>
-      </w:r>
-      <w:r>
-        <w:rPr>
-          <w:u w:val="single"/>
-        </w:rPr>
-        <w:t xml:space="preserve"> event</w:t>
-      </w:r>
-      <w:r>
-        <w:t xml:space="preserve"> </w:t>
+        <w:t>block</w:t>
+      </w:r>
+      <w:r>
+        <w:t xml:space="preserve">, </w:t>
       </w:r>
       <w:proofErr w:type="spellStart"/>
       <w:r>
@@ -2229,33 +3748,22 @@
       </w:r>
       <w:proofErr w:type="spellEnd"/>
       <w:r>
-        <w:t xml:space="preserve"> current </w:t>
-      </w:r>
-      <w:r>
-        <w:t xml:space="preserve">1kB </w:t>
-      </w:r>
-      <w:r>
-        <w:t>block for event</w:t>
-      </w:r>
-      <w:r>
-        <w:t xml:space="preserve"> </w:t>
-      </w:r>
-      <w:proofErr w:type="spellStart"/>
-      <w:r>
-        <w:t>reuiring</w:t>
-      </w:r>
-      <w:proofErr w:type="spellEnd"/>
-      <w:r>
-        <w:t xml:space="preserve"> more than multiple blocks</w:t>
-      </w:r>
-      <w:r>
-        <w:t xml:space="preserve">, </w:t>
-      </w:r>
-      <w:r>
-        <w:t xml:space="preserve">starting </w:t>
-      </w:r>
-      <w:r>
-        <w:t>from 1</w:t>
+        <w:t xml:space="preserve"> a number from 0, when event has no hits, to maximum allowed of 126</w:t>
+      </w:r>
+      <w:r>
+        <w:t xml:space="preserve"> (for instance if </w:t>
+      </w:r>
+      <w:r>
+        <w:t xml:space="preserve">event has more than 31 </w:t>
+      </w:r>
+      <w:r>
+        <w:t xml:space="preserve">x 256b </w:t>
+      </w:r>
+      <w:r>
+        <w:t>hits</w:t>
+      </w:r>
+      <w:r>
+        <w:t>)</w:t>
       </w:r>
     </w:p>
     <w:p>
@@ -2267,6 +3775,117 @@
         </w:numPr>
         <w:ind w:left="360"/>
         <w:rPr>
+          <w:b/>
+          <w:bCs/>
+        </w:rPr>
+      </w:pPr>
+      <w:r>
+        <w:rPr>
+          <w:u w:val="single"/>
+        </w:rPr>
+        <w:t>bit[5</w:t>
+      </w:r>
+      <w:r>
+        <w:rPr>
+          <w:u w:val="single"/>
+        </w:rPr>
+        <w:t>5</w:t>
+      </w:r>
+      <w:r>
+        <w:rPr>
+          <w:u w:val="single"/>
+        </w:rPr>
+        <w:t>:48]</w:t>
+      </w:r>
+      <w:r>
+        <w:rPr>
+          <w:u w:val="single"/>
+        </w:rPr>
+        <w:t xml:space="preserve"> </w:t>
+      </w:r>
+      <w:r>
+        <w:rPr>
+          <w:u w:val="single"/>
+        </w:rPr>
+        <w:t>=</w:t>
+      </w:r>
+      <w:r>
+        <w:rPr>
+          <w:u w:val="single"/>
+        </w:rPr>
+        <w:t xml:space="preserve"> </w:t>
+      </w:r>
+      <w:r>
+        <w:rPr>
+          <w:u w:val="single"/>
+        </w:rPr>
+        <w:t xml:space="preserve">block </w:t>
+      </w:r>
+      <w:r>
+        <w:rPr>
+          <w:u w:val="single"/>
+        </w:rPr>
+        <w:t>number</w:t>
+      </w:r>
+      <w:r>
+        <w:rPr>
+          <w:u w:val="single"/>
+        </w:rPr>
+        <w:t xml:space="preserve"> in</w:t>
+      </w:r>
+      <w:r>
+        <w:rPr>
+          <w:u w:val="single"/>
+        </w:rPr>
+        <w:t xml:space="preserve"> event</w:t>
+      </w:r>
+      <w:r>
+        <w:t xml:space="preserve"> </w:t>
+      </w:r>
+      <w:proofErr w:type="spellStart"/>
+      <w:r>
+        <w:t>ie</w:t>
+      </w:r>
+      <w:proofErr w:type="spellEnd"/>
+      <w:r>
+        <w:t xml:space="preserve"> current </w:t>
+      </w:r>
+      <w:r>
+        <w:t xml:space="preserve">1kB </w:t>
+      </w:r>
+      <w:r>
+        <w:t>block for event</w:t>
+      </w:r>
+      <w:r>
+        <w:t xml:space="preserve"> </w:t>
+      </w:r>
+      <w:proofErr w:type="spellStart"/>
+      <w:r>
+        <w:t>reuiring</w:t>
+      </w:r>
+      <w:proofErr w:type="spellEnd"/>
+      <w:r>
+        <w:t xml:space="preserve"> more than multiple blocks</w:t>
+      </w:r>
+      <w:r>
+        <w:t xml:space="preserve">, </w:t>
+      </w:r>
+      <w:r>
+        <w:t xml:space="preserve">starting </w:t>
+      </w:r>
+      <w:r>
+        <w:t>from 1</w:t>
+      </w:r>
+    </w:p>
+    <w:p>
+      <w:pPr>
+        <w:pStyle w:val="ListParagraph"/>
+        <w:numPr>
+          <w:ilvl w:val="0"/>
+          <w:numId w:val="19"/>
+        </w:numPr>
+        <w:ind w:left="360"/>
+        <w:rPr>
           <w:u w:val="single"/>
         </w:rPr>
       </w:pPr>
@@ -2643,194 +4262,219 @@
     </w:p>
     <w:p>
       <w:r>
+        <w:t>Using this information, the user know</w:t>
+      </w:r>
+      <w:r>
+        <w:t>s</w:t>
+      </w:r>
+      <w:r>
+        <w:t xml:space="preserve"> how many 64-bit word read back by the DCS Block contain true hit information, the remaining in the block just reporting stale data filled up in previous events.</w:t>
+      </w:r>
+    </w:p>
+    <w:p/>
+    <w:p>
+      <w:r>
+        <w:t xml:space="preserve">The </w:t>
+      </w:r>
+      <w:r>
+        <w:t xml:space="preserve">48 </w:t>
+      </w:r>
+      <w:r>
+        <w:t>LSB bit</w:t>
+      </w:r>
+      <w:r>
+        <w:t>s</w:t>
+      </w:r>
+      <w:r>
+        <w:t xml:space="preserve"> </w:t>
+      </w:r>
+      <w:r>
+        <w:t>of</w:t>
+      </w:r>
+      <w:r>
+        <w:t xml:space="preserve"> the second</w:t>
+      </w:r>
+      <w:r>
+        <w:t xml:space="preserve"> header word are used </w:t>
+      </w:r>
+      <w:r>
+        <w:t xml:space="preserve">for </w:t>
+      </w:r>
+      <w:r>
+        <w:t xml:space="preserve">some </w:t>
+      </w:r>
+      <w:r>
+        <w:t>sanity check</w:t>
+      </w:r>
+      <w:r>
+        <w:t xml:space="preserve">s. During a memory write, </w:t>
+      </w:r>
+      <w:r>
+        <w:t xml:space="preserve">they are compared with the 48 LSB of the first header word, and the number of times they do not agree </w:t>
+      </w:r>
+      <w:r>
+        <w:t xml:space="preserve">is </w:t>
+      </w:r>
+      <w:r>
+        <w:t>saved to a counter read via</w:t>
+      </w:r>
+      <w:r>
+        <w:t xml:space="preserve"> address</w:t>
+      </w:r>
+      <w:r>
+        <w:t>=</w:t>
+      </w:r>
+      <w:r>
+        <w:t xml:space="preserve">72. </w:t>
+      </w:r>
+      <w:r>
+        <w:t>During a memory read, they are compared to the Data Request event tag, and the number of times they do not agree is saved to a counter read via</w:t>
+      </w:r>
+      <w:r>
+        <w:t xml:space="preserve"> address=</w:t>
+      </w:r>
+      <w:r>
+        <w:t>73.</w:t>
+      </w:r>
+    </w:p>
+    <w:p/>
+    <w:p>
+      <w:r>
+        <w:t xml:space="preserve">To have an idea of </w:t>
+      </w:r>
+      <w:r>
+        <w:t xml:space="preserve">the memory location </w:t>
+      </w:r>
+      <w:r>
+        <w:t>we are currently</w:t>
+      </w:r>
+      <w:r>
+        <w:t xml:space="preserve"> at, one can use a DCS read of address 15</w:t>
+      </w:r>
+      <w:r>
+        <w:t>&amp;</w:t>
+      </w:r>
+      <w:r>
+        <w:t>16</w:t>
+      </w:r>
+      <w:r>
+        <w:t>, which report</w:t>
+      </w:r>
+      <w:r>
+        <w:t xml:space="preserve"> the starting memory address for the last even</w:t>
+      </w:r>
+      <w:r>
+        <w:t>t</w:t>
+      </w:r>
+      <w:r>
+        <w:t xml:space="preserve"> </w:t>
+      </w:r>
+      <w:r>
+        <w:t>read from DDR memory and sent to the DTC.</w:t>
+      </w:r>
+      <w:r>
+        <w:t xml:space="preserve"> </w:t>
+      </w:r>
+    </w:p>
+    <w:p/>
+    <w:bookmarkStart w:id="6" w:name="RS485"/>
+    <w:p>
+      <w:pPr>
+        <w:rPr>
+          <w:b/>
+          <w:bCs/>
+        </w:rPr>
+      </w:pPr>
+      <w:r>
+        <w:rPr>
+          <w:b/>
+          <w:bCs/>
+        </w:rPr>
+        <w:fldChar w:fldCharType="begin"/>
+      </w:r>
+      <w:r>
+        <w:rPr>
+          <w:b/>
+          <w:bCs/>
+        </w:rPr>
+        <w:instrText>HYPERLINK  \l "_top"</w:instrText>
+      </w:r>
+      <w:r>
+        <w:rPr>
+          <w:b/>
+          <w:bCs/>
+        </w:rPr>
+      </w:r>
+      <w:r>
+        <w:rPr>
+          <w:b/>
+          <w:bCs/>
+        </w:rPr>
+        <w:fldChar w:fldCharType="separate"/>
+      </w:r>
+      <w:r>
+        <w:rPr>
+          <w:rStyle w:val="Hyperlink"/>
+          <w:b/>
+          <w:bCs/>
+        </w:rPr>
+        <w:t>RS</w:t>
+      </w:r>
+      <w:r>
+        <w:rPr>
+          <w:rStyle w:val="Hyperlink"/>
+          <w:b/>
+          <w:bCs/>
+        </w:rPr>
+        <w:t>485 Interface</w:t>
+      </w:r>
+      <w:bookmarkEnd w:id="6"/>
+      <w:r>
+        <w:rPr>
+          <w:b/>
+          <w:bCs/>
+        </w:rPr>
+        <w:fldChar w:fldCharType="end"/>
+      </w:r>
+      <w:r>
+        <w:t xml:space="preserve">: </w:t>
+      </w:r>
+      <w:r>
+        <w:rPr>
+          <w:rFonts w:cstheme="minorHAnsi"/>
+        </w:rPr>
+        <w:t>RS485 is a single master (</w:t>
+      </w:r>
+      <w:r>
+        <w:rPr>
+          <w:rFonts w:cstheme="minorHAnsi"/>
+        </w:rPr>
+        <w:t>computer</w:t>
+      </w:r>
+      <w:r>
+        <w:rPr>
+          <w:rFonts w:cstheme="minorHAnsi"/>
+        </w:rPr>
+        <w:t>) multi-slaves serial communication protocol</w:t>
+      </w:r>
+      <w:r>
+        <w:rPr>
+          <w:rFonts w:cstheme="minorHAnsi"/>
+        </w:rPr>
+        <w:t xml:space="preserve">. </w:t>
+      </w:r>
+      <w:r>
+        <w:rPr>
+          <w:rFonts w:cstheme="minorHAnsi"/>
+        </w:rPr>
+        <w:t xml:space="preserve">It uses balanced differential pair data transmission lines to provide a robust and </w:t>
+      </w:r>
+      <w:r>
+        <w:rPr>
+          <w:rFonts w:cstheme="minorHAnsi"/>
+        </w:rPr>
         <w:lastRenderedPageBreak/>
-        <w:t>Using this information, the user know</w:t>
-      </w:r>
-      <w:r>
-        <w:t>s</w:t>
-      </w:r>
-      <w:r>
-        <w:t xml:space="preserve"> how many 64-bit word read back by the DCS Block contain true hit information, the remaining in the block just reporting stale data filled up in previous events.</w:t>
-      </w:r>
-    </w:p>
-    <w:p/>
-    <w:p>
-      <w:r>
-        <w:t xml:space="preserve">The </w:t>
-      </w:r>
-      <w:r>
-        <w:t xml:space="preserve">48 </w:t>
-      </w:r>
-      <w:r>
-        <w:t>LSB bit</w:t>
-      </w:r>
-      <w:r>
-        <w:t>s</w:t>
-      </w:r>
-      <w:r>
-        <w:t xml:space="preserve"> </w:t>
-      </w:r>
-      <w:r>
-        <w:t>of</w:t>
-      </w:r>
-      <w:r>
-        <w:t xml:space="preserve"> the second</w:t>
-      </w:r>
-      <w:r>
-        <w:t xml:space="preserve"> header word are used </w:t>
-      </w:r>
-      <w:r>
-        <w:t xml:space="preserve">for </w:t>
-      </w:r>
-      <w:r>
-        <w:t xml:space="preserve">some </w:t>
-      </w:r>
-      <w:r>
-        <w:t>sanity check</w:t>
-      </w:r>
-      <w:r>
-        <w:t xml:space="preserve">s. During a memory write, </w:t>
-      </w:r>
-      <w:r>
-        <w:t xml:space="preserve">they are compared with the 48 LSB of the first header word, and the number of times they do not agree </w:t>
-      </w:r>
-      <w:r>
-        <w:t xml:space="preserve">is </w:t>
-      </w:r>
-      <w:r>
-        <w:t>saved to a counter read via</w:t>
-      </w:r>
-      <w:r>
-        <w:t xml:space="preserve"> address</w:t>
-      </w:r>
-      <w:r>
-        <w:t>=</w:t>
-      </w:r>
-      <w:r>
-        <w:t xml:space="preserve">72. </w:t>
-      </w:r>
-      <w:r>
-        <w:t>During a memory read, they are compared to the Data Request event tag, and the number of times they do not agree is saved to a counter read via</w:t>
-      </w:r>
-      <w:r>
-        <w:t xml:space="preserve"> address=</w:t>
-      </w:r>
-      <w:r>
-        <w:t>73.</w:t>
-      </w:r>
-    </w:p>
-    <w:p/>
-    <w:p>
-      <w:r>
-        <w:t xml:space="preserve">To have an idea of </w:t>
-      </w:r>
-      <w:r>
-        <w:t xml:space="preserve">the memory location </w:t>
-      </w:r>
-      <w:r>
-        <w:t>we are currently</w:t>
-      </w:r>
-      <w:r>
-        <w:t xml:space="preserve"> at, one can use a DCS read of address 15</w:t>
-      </w:r>
-      <w:r>
-        <w:t>&amp;</w:t>
-      </w:r>
-      <w:r>
-        <w:t>16</w:t>
-      </w:r>
-      <w:r>
-        <w:t>, which report</w:t>
-      </w:r>
-      <w:r>
-        <w:t xml:space="preserve"> the starting memory address for the last even</w:t>
-      </w:r>
-      <w:r>
-        <w:t>t</w:t>
-      </w:r>
-      <w:r>
-        <w:t xml:space="preserve"> </w:t>
-      </w:r>
-      <w:r>
-        <w:t>read from DDR memory and sent to the DTC.</w:t>
-      </w:r>
-      <w:r>
-        <w:t xml:space="preserve"> </w:t>
-      </w:r>
-    </w:p>
-    <w:p/>
-    <w:p/>
-    <w:p>
-      <w:pPr>
-        <w:rPr>
-          <w:b/>
-          <w:bCs/>
-        </w:rPr>
-      </w:pPr>
-      <w:bookmarkStart w:id="3" w:name="RS485"/>
-    </w:p>
-    <w:p>
-      <w:pPr>
-        <w:rPr>
-          <w:b/>
-          <w:bCs/>
-        </w:rPr>
-      </w:pPr>
-    </w:p>
-    <w:p>
-      <w:pPr>
-        <w:rPr>
-          <w:b/>
-          <w:bCs/>
-        </w:rPr>
-      </w:pPr>
-      <w:r>
-        <w:rPr>
-          <w:b/>
-          <w:bCs/>
-        </w:rPr>
-        <w:t>RS</w:t>
-      </w:r>
-      <w:r>
-        <w:rPr>
-          <w:b/>
-          <w:bCs/>
-        </w:rPr>
-        <w:t>485 Interface</w:t>
-      </w:r>
-      <w:bookmarkEnd w:id="3"/>
-      <w:r>
-        <w:t xml:space="preserve">: </w:t>
-      </w:r>
-      <w:r>
-        <w:rPr>
-          <w:rFonts w:cstheme="minorHAnsi"/>
-        </w:rPr>
-        <w:t>RS485 is a single master (</w:t>
-      </w:r>
-      <w:r>
-        <w:rPr>
-          <w:rFonts w:cstheme="minorHAnsi"/>
-        </w:rPr>
-        <w:t>computer</w:t>
-      </w:r>
-      <w:r>
-        <w:rPr>
-          <w:rFonts w:cstheme="minorHAnsi"/>
-        </w:rPr>
-        <w:t>) multi-slaves serial communication protocol</w:t>
-      </w:r>
-      <w:r>
-        <w:rPr>
-          <w:rFonts w:cstheme="minorHAnsi"/>
-        </w:rPr>
-        <w:t xml:space="preserve">. </w:t>
-      </w:r>
-      <w:r>
-        <w:rPr>
-          <w:rFonts w:cstheme="minorHAnsi"/>
-        </w:rPr>
-        <w:t xml:space="preserve">It uses balanced differential pair data transmission lines to provide a robust and noise-immune communication. It is meant to be the last-resort path between the DRAC and the outside world in case the fiber is not responding. </w:t>
+        <w:t xml:space="preserve">noise-immune communication. It is meant to be the last-resort path between the DRAC and the outside world in case the fiber is not responding. </w:t>
       </w:r>
     </w:p>
     <w:p>
@@ -3533,16 +5177,7 @@
           <w:sz w:val="24"/>
           <w:szCs w:val="24"/>
         </w:rPr>
-        <w:t xml:space="preserve"> </w:t>
-      </w:r>
-      <w:r>
-        <w:rPr>
-          <w:rFonts w:asciiTheme="minorHAnsi" w:hAnsiTheme="minorHAnsi" w:cstheme="minorHAnsi"/>
-          <w:sz w:val="24"/>
-          <w:szCs w:val="24"/>
-        </w:rPr>
-        <w:lastRenderedPageBreak/>
-        <w:t>(default value=0)</w:t>
+        <w:t xml:space="preserve"> (default value=0)</w:t>
       </w:r>
       <w:r>
         <w:rPr>
@@ -4222,6 +5857,7 @@
         </w:rPr>
       </w:pPr>
     </w:p>
+    <w:bookmarkStart w:id="7" w:name="fine_fiber"/>
     <w:p>
       <w:pPr>
         <w:pStyle w:val="HTMLPreformatted"/>
@@ -4231,17 +5867,6 @@
           <w:szCs w:val="24"/>
         </w:rPr>
       </w:pPr>
-    </w:p>
-    <w:bookmarkStart w:id="4" w:name="fine_fiber"/>
-    <w:p>
-      <w:pPr>
-        <w:pStyle w:val="HTMLPreformatted"/>
-        <w:rPr>
-          <w:rFonts w:asciiTheme="minorHAnsi" w:hAnsiTheme="minorHAnsi" w:cstheme="minorHAnsi"/>
-          <w:sz w:val="24"/>
-          <w:szCs w:val="24"/>
-        </w:rPr>
-      </w:pPr>
       <w:r>
         <w:rPr>
           <w:rFonts w:asciiTheme="minorHAnsi" w:hAnsiTheme="minorHAnsi" w:cstheme="minorHAnsi"/>
@@ -4282,7 +5907,7 @@
         </w:rPr>
         <w:t>Fine Fiber synchronization</w:t>
       </w:r>
-      <w:bookmarkEnd w:id="4"/>
+      <w:bookmarkEnd w:id="7"/>
       <w:r>
         <w:rPr>
           <w:rFonts w:asciiTheme="minorHAnsi" w:hAnsiTheme="minorHAnsi" w:cstheme="minorHAnsi"/>
@@ -4633,7 +6258,7 @@
         <w:br w:type="page"/>
       </w:r>
     </w:p>
-    <w:bookmarkStart w:id="5" w:name="digi_rw"/>
+    <w:bookmarkStart w:id="8" w:name="digi_rw"/>
     <w:p>
       <w:r>
         <w:lastRenderedPageBreak/>
@@ -4654,7 +6279,7 @@
       <w:r>
         <w:fldChar w:fldCharType="end"/>
       </w:r>
-      <w:bookmarkEnd w:id="5"/>
+      <w:bookmarkEnd w:id="8"/>
       <w:r>
         <w:t xml:space="preserve">: this feature allows to send RD/WR commands </w:t>
       </w:r>
@@ -4894,7 +6519,7 @@
       <w:r>
         <w:t xml:space="preserve">: </w:t>
       </w:r>
-      <w:bookmarkStart w:id="6" w:name="rd_tag"/>
+      <w:bookmarkStart w:id="9" w:name="rd_tag"/>
       <w:r>
         <w:rPr>
           <w:b/>
@@ -4934,7 +6559,7 @@
         </w:rPr>
         <w:t>READ OF EVENT TAG in DIGI</w:t>
       </w:r>
-      <w:bookmarkEnd w:id="6"/>
+      <w:bookmarkEnd w:id="9"/>
       <w:r>
         <w:rPr>
           <w:b/>
@@ -5753,7 +7378,7 @@
         </w:rPr>
         <w:t xml:space="preserve"> commands, disable TWI by writing data = 0 to  reg = 6 </w:t>
       </w:r>
-      <w:bookmarkStart w:id="7" w:name="disables"/>
+      <w:bookmarkStart w:id="10" w:name="disables"/>
     </w:p>
     <w:p>
       <w:pPr>
@@ -6468,7 +8093,7 @@
           </w:rPr>
           <w:t>Disabled features:</w:t>
         </w:r>
-        <w:bookmarkEnd w:id="7"/>
+        <w:bookmarkEnd w:id="10"/>
       </w:hyperlink>
     </w:p>
     <w:p>
@@ -6478,7 +8103,7 @@
         </w:rPr>
       </w:pPr>
     </w:p>
-    <w:bookmarkStart w:id="8" w:name="error_counter"/>
+    <w:bookmarkStart w:id="11" w:name="error_counter"/>
     <w:p>
       <w:pPr>
         <w:pStyle w:val="ListParagraph"/>
@@ -6549,7 +8174,7 @@
         </w:rPr>
         <w:t>Error counters read</w:t>
       </w:r>
-      <w:bookmarkEnd w:id="8"/>
+      <w:bookmarkEnd w:id="11"/>
       <w:r>
         <w:rPr>
           <w:b/>
@@ -6940,7 +8565,7 @@
         </w:rPr>
       </w:pPr>
     </w:p>
-    <w:bookmarkStart w:id="9" w:name="DIGI_sim"/>
+    <w:bookmarkStart w:id="12" w:name="DIGI_sim"/>
     <w:p>
       <w:pPr>
         <w:pStyle w:val="ListParagraph"/>
@@ -7023,7 +8648,7 @@
         <w:fldChar w:fldCharType="end"/>
       </w:r>
     </w:p>
-    <w:bookmarkEnd w:id="9"/>
+    <w:bookmarkEnd w:id="12"/>
     <w:p>
       <w:pPr>
         <w:rPr>
@@ -7202,8 +8827,8 @@
         <w:br w:type="page"/>
       </w:r>
     </w:p>
-    <w:bookmarkStart w:id="10" w:name="old"/>
-    <w:bookmarkStart w:id="11" w:name="newrun"/>
+    <w:bookmarkStart w:id="13" w:name="old"/>
+    <w:bookmarkStart w:id="14" w:name="newrun"/>
     <w:p>
       <w:pPr>
         <w:rPr>
@@ -7264,7 +8889,7 @@
         <w:fldChar w:fldCharType="end"/>
       </w:r>
     </w:p>
-    <w:bookmarkEnd w:id="10"/>
+    <w:bookmarkEnd w:id="13"/>
     <w:p>
       <w:pPr>
         <w:rPr>
@@ -7291,7 +8916,7 @@
           </w:rPr>
           <w:t>concept and HALTRUN_EN option</w:t>
         </w:r>
-        <w:bookmarkEnd w:id="11"/>
+        <w:bookmarkEnd w:id="14"/>
       </w:hyperlink>
       <w:r>
         <w:rPr>
@@ -7581,7 +9206,7 @@
         </w:rPr>
       </w:pPr>
     </w:p>
-    <w:bookmarkStart w:id="12" w:name="loopback"/>
+    <w:bookmarkStart w:id="15" w:name="loopback"/>
     <w:p>
       <w:r>
         <w:rPr>
@@ -7630,7 +9255,7 @@
         </w:rPr>
         <w:t>logic</w:t>
       </w:r>
-      <w:bookmarkEnd w:id="12"/>
+      <w:bookmarkEnd w:id="15"/>
       <w:r>
         <w:rPr>
           <w:b/>
@@ -7675,7 +9300,7 @@
       </w:r>
     </w:p>
     <w:p/>
-    <w:bookmarkStart w:id="13" w:name="enables"/>
+    <w:bookmarkStart w:id="16" w:name="enables"/>
     <w:p>
       <w:r>
         <w:lastRenderedPageBreak/>
@@ -7693,7 +9318,7 @@
         </w:rPr>
         <w:t>Clock and Event Window controls via serial vs fiber</w:t>
       </w:r>
-      <w:bookmarkEnd w:id="13"/>
+      <w:bookmarkEnd w:id="16"/>
       <w:r>
         <w:fldChar w:fldCharType="end"/>
       </w:r>
@@ -7812,7 +9437,7 @@
       </w:pPr>
     </w:p>
     <w:p>
-      <w:bookmarkStart w:id="14" w:name="appendixA"/>
+      <w:bookmarkStart w:id="17" w:name="appendixA"/>
       <w:r>
         <w:t>At power up, by default</w:t>
       </w:r>
@@ -7993,7 +9618,7 @@
         </w:r>
       </w:hyperlink>
     </w:p>
-    <w:bookmarkEnd w:id="14"/>
+    <w:bookmarkEnd w:id="17"/>
     <w:p>
       <w:pPr>
         <w:rPr>
@@ -11326,6 +12951,118 @@
     </w:lvl>
   </w:abstractNum>
   <w:abstractNum w:abstractNumId="13" w15:restartNumberingAfterBreak="0">
+    <w:nsid w:val="2DA425C3"/>
+    <w:multiLevelType w:val="hybridMultilevel"/>
+    <w:tmpl w:val="E196EAB2"/>
+    <w:lvl w:ilvl="0" w:tplc="91642760">
+      <w:numFmt w:val="bullet"/>
+      <w:lvlText w:val="-"/>
+      <w:lvlJc w:val="left"/>
+      <w:pPr>
+        <w:ind w:left="720" w:hanging="360"/>
+      </w:pPr>
+      <w:rPr>
+        <w:rFonts w:ascii="Calibri" w:eastAsiaTheme="minorHAnsi" w:hAnsi="Calibri" w:cs="Calibri" w:hint="default"/>
+      </w:rPr>
+    </w:lvl>
+    <w:lvl w:ilvl="1" w:tplc="04090003" w:tentative="1">
+      <w:start w:val="1"/>
+      <w:numFmt w:val="bullet"/>
+      <w:lvlText w:val="o"/>
+      <w:lvlJc w:val="left"/>
+      <w:pPr>
+        <w:ind w:left="1440" w:hanging="360"/>
+      </w:pPr>
+      <w:rPr>
+        <w:rFonts w:ascii="Courier New" w:hAnsi="Courier New" w:cs="Courier New" w:hint="default"/>
+      </w:rPr>
+    </w:lvl>
+    <w:lvl w:ilvl="2" w:tplc="04090005" w:tentative="1">
+      <w:start w:val="1"/>
+      <w:numFmt w:val="bullet"/>
+      <w:lvlText w:val=""/>
+      <w:lvlJc w:val="left"/>
+      <w:pPr>
+        <w:ind w:left="2160" w:hanging="360"/>
+      </w:pPr>
+      <w:rPr>
+        <w:rFonts w:ascii="Wingdings" w:hAnsi="Wingdings" w:hint="default"/>
+      </w:rPr>
+    </w:lvl>
+    <w:lvl w:ilvl="3" w:tplc="04090001" w:tentative="1">
+      <w:start w:val="1"/>
+      <w:numFmt w:val="bullet"/>
+      <w:lvlText w:val=""/>
+      <w:lvlJc w:val="left"/>
+      <w:pPr>
+        <w:ind w:left="2880" w:hanging="360"/>
+      </w:pPr>
+      <w:rPr>
+        <w:rFonts w:ascii="Symbol" w:hAnsi="Symbol" w:hint="default"/>
+      </w:rPr>
+    </w:lvl>
+    <w:lvl w:ilvl="4" w:tplc="04090003" w:tentative="1">
+      <w:start w:val="1"/>
+      <w:numFmt w:val="bullet"/>
+      <w:lvlText w:val="o"/>
+      <w:lvlJc w:val="left"/>
+      <w:pPr>
+        <w:ind w:left="3600" w:hanging="360"/>
+      </w:pPr>
+      <w:rPr>
+        <w:rFonts w:ascii="Courier New" w:hAnsi="Courier New" w:cs="Courier New" w:hint="default"/>
+      </w:rPr>
+    </w:lvl>
+    <w:lvl w:ilvl="5" w:tplc="04090005" w:tentative="1">
+      <w:start w:val="1"/>
+      <w:numFmt w:val="bullet"/>
+      <w:lvlText w:val=""/>
+      <w:lvlJc w:val="left"/>
+      <w:pPr>
+        <w:ind w:left="4320" w:hanging="360"/>
+      </w:pPr>
+      <w:rPr>
+        <w:rFonts w:ascii="Wingdings" w:hAnsi="Wingdings" w:hint="default"/>
+      </w:rPr>
+    </w:lvl>
+    <w:lvl w:ilvl="6" w:tplc="04090001" w:tentative="1">
+      <w:start w:val="1"/>
+      <w:numFmt w:val="bullet"/>
+      <w:lvlText w:val=""/>
+      <w:lvlJc w:val="left"/>
+      <w:pPr>
+        <w:ind w:left="5040" w:hanging="360"/>
+      </w:pPr>
+      <w:rPr>
+        <w:rFonts w:ascii="Symbol" w:hAnsi="Symbol" w:hint="default"/>
+      </w:rPr>
+    </w:lvl>
+    <w:lvl w:ilvl="7" w:tplc="04090003" w:tentative="1">
+      <w:start w:val="1"/>
+      <w:numFmt w:val="bullet"/>
+      <w:lvlText w:val="o"/>
+      <w:lvlJc w:val="left"/>
+      <w:pPr>
+        <w:ind w:left="5760" w:hanging="360"/>
+      </w:pPr>
+      <w:rPr>
+        <w:rFonts w:ascii="Courier New" w:hAnsi="Courier New" w:cs="Courier New" w:hint="default"/>
+      </w:rPr>
+    </w:lvl>
+    <w:lvl w:ilvl="8" w:tplc="04090005" w:tentative="1">
+      <w:start w:val="1"/>
+      <w:numFmt w:val="bullet"/>
+      <w:lvlText w:val=""/>
+      <w:lvlJc w:val="left"/>
+      <w:pPr>
+        <w:ind w:left="6480" w:hanging="360"/>
+      </w:pPr>
+      <w:rPr>
+        <w:rFonts w:ascii="Wingdings" w:hAnsi="Wingdings" w:hint="default"/>
+      </w:rPr>
+    </w:lvl>
+  </w:abstractNum>
+  <w:abstractNum w:abstractNumId="14" w15:restartNumberingAfterBreak="0">
     <w:nsid w:val="367C64E3"/>
     <w:multiLevelType w:val="hybridMultilevel"/>
     <w:tmpl w:val="817E4AA6"/>
@@ -11413,7 +13150,7 @@
       </w:pPr>
     </w:lvl>
   </w:abstractNum>
-  <w:abstractNum w:abstractNumId="14" w15:restartNumberingAfterBreak="0">
+  <w:abstractNum w:abstractNumId="15" w15:restartNumberingAfterBreak="0">
     <w:nsid w:val="36CE2FB0"/>
     <w:multiLevelType w:val="hybridMultilevel"/>
     <w:tmpl w:val="C83415FA"/>
@@ -11526,7 +13263,7 @@
       </w:rPr>
     </w:lvl>
   </w:abstractNum>
-  <w:abstractNum w:abstractNumId="15" w15:restartNumberingAfterBreak="0">
+  <w:abstractNum w:abstractNumId="16" w15:restartNumberingAfterBreak="0">
     <w:nsid w:val="3AB565AE"/>
     <w:multiLevelType w:val="hybridMultilevel"/>
     <w:tmpl w:val="2F5A10C2"/>
@@ -11639,7 +13376,7 @@
       </w:rPr>
     </w:lvl>
   </w:abstractNum>
-  <w:abstractNum w:abstractNumId="16" w15:restartNumberingAfterBreak="0">
+  <w:abstractNum w:abstractNumId="17" w15:restartNumberingAfterBreak="0">
     <w:nsid w:val="4A9D219B"/>
     <w:multiLevelType w:val="hybridMultilevel"/>
     <w:tmpl w:val="C240A326"/>
@@ -11727,7 +13464,7 @@
       </w:pPr>
     </w:lvl>
   </w:abstractNum>
-  <w:abstractNum w:abstractNumId="17" w15:restartNumberingAfterBreak="0">
+  <w:abstractNum w:abstractNumId="18" w15:restartNumberingAfterBreak="0">
     <w:nsid w:val="4B5A77E8"/>
     <w:multiLevelType w:val="hybridMultilevel"/>
     <w:tmpl w:val="A3F8CD94"/>
@@ -11840,7 +13577,7 @@
       </w:rPr>
     </w:lvl>
   </w:abstractNum>
-  <w:abstractNum w:abstractNumId="18" w15:restartNumberingAfterBreak="0">
+  <w:abstractNum w:abstractNumId="19" w15:restartNumberingAfterBreak="0">
     <w:nsid w:val="4C4F2F4D"/>
     <w:multiLevelType w:val="hybridMultilevel"/>
     <w:tmpl w:val="A5AC478A"/>
@@ -11953,7 +13690,121 @@
       </w:rPr>
     </w:lvl>
   </w:abstractNum>
-  <w:abstractNum w:abstractNumId="19" w15:restartNumberingAfterBreak="0">
+  <w:abstractNum w:abstractNumId="20" w15:restartNumberingAfterBreak="0">
+    <w:nsid w:val="540C25C7"/>
+    <w:multiLevelType w:val="hybridMultilevel"/>
+    <w:tmpl w:val="A3F095F0"/>
+    <w:lvl w:ilvl="0" w:tplc="2520C3A8">
+      <w:start w:val="400"/>
+      <w:numFmt w:val="bullet"/>
+      <w:lvlText w:val="-"/>
+      <w:lvlJc w:val="left"/>
+      <w:pPr>
+        <w:ind w:left="720" w:hanging="360"/>
+      </w:pPr>
+      <w:rPr>
+        <w:rFonts w:ascii="Calibri" w:eastAsiaTheme="minorHAnsi" w:hAnsi="Calibri" w:cs="Calibri" w:hint="default"/>
+        <w:sz w:val="24"/>
+      </w:rPr>
+    </w:lvl>
+    <w:lvl w:ilvl="1" w:tplc="04090003">
+      <w:start w:val="1"/>
+      <w:numFmt w:val="bullet"/>
+      <w:lvlText w:val="o"/>
+      <w:lvlJc w:val="left"/>
+      <w:pPr>
+        <w:ind w:left="1440" w:hanging="360"/>
+      </w:pPr>
+      <w:rPr>
+        <w:rFonts w:ascii="Courier New" w:hAnsi="Courier New" w:cs="Courier New" w:hint="default"/>
+      </w:rPr>
+    </w:lvl>
+    <w:lvl w:ilvl="2" w:tplc="04090005" w:tentative="1">
+      <w:start w:val="1"/>
+      <w:numFmt w:val="bullet"/>
+      <w:lvlText w:val=""/>
+      <w:lvlJc w:val="left"/>
+      <w:pPr>
+        <w:ind w:left="2160" w:hanging="360"/>
+      </w:pPr>
+      <w:rPr>
+        <w:rFonts w:ascii="Wingdings" w:hAnsi="Wingdings" w:hint="default"/>
+      </w:rPr>
+    </w:lvl>
+    <w:lvl w:ilvl="3" w:tplc="04090001" w:tentative="1">
+      <w:start w:val="1"/>
+      <w:numFmt w:val="bullet"/>
+      <w:lvlText w:val=""/>
+      <w:lvlJc w:val="left"/>
+      <w:pPr>
+        <w:ind w:left="2880" w:hanging="360"/>
+      </w:pPr>
+      <w:rPr>
+        <w:rFonts w:ascii="Symbol" w:hAnsi="Symbol" w:hint="default"/>
+      </w:rPr>
+    </w:lvl>
+    <w:lvl w:ilvl="4" w:tplc="04090003" w:tentative="1">
+      <w:start w:val="1"/>
+      <w:numFmt w:val="bullet"/>
+      <w:lvlText w:val="o"/>
+      <w:lvlJc w:val="left"/>
+      <w:pPr>
+        <w:ind w:left="3600" w:hanging="360"/>
+      </w:pPr>
+      <w:rPr>
+        <w:rFonts w:ascii="Courier New" w:hAnsi="Courier New" w:cs="Courier New" w:hint="default"/>
+      </w:rPr>
+    </w:lvl>
+    <w:lvl w:ilvl="5" w:tplc="04090005" w:tentative="1">
+      <w:start w:val="1"/>
+      <w:numFmt w:val="bullet"/>
+      <w:lvlText w:val=""/>
+      <w:lvlJc w:val="left"/>
+      <w:pPr>
+        <w:ind w:left="4320" w:hanging="360"/>
+      </w:pPr>
+      <w:rPr>
+        <w:rFonts w:ascii="Wingdings" w:hAnsi="Wingdings" w:hint="default"/>
+      </w:rPr>
+    </w:lvl>
+    <w:lvl w:ilvl="6" w:tplc="04090001" w:tentative="1">
+      <w:start w:val="1"/>
+      <w:numFmt w:val="bullet"/>
+      <w:lvlText w:val=""/>
+      <w:lvlJc w:val="left"/>
+      <w:pPr>
+        <w:ind w:left="5040" w:hanging="360"/>
+      </w:pPr>
+      <w:rPr>
+        <w:rFonts w:ascii="Symbol" w:hAnsi="Symbol" w:hint="default"/>
+      </w:rPr>
+    </w:lvl>
+    <w:lvl w:ilvl="7" w:tplc="04090003" w:tentative="1">
+      <w:start w:val="1"/>
+      <w:numFmt w:val="bullet"/>
+      <w:lvlText w:val="o"/>
+      <w:lvlJc w:val="left"/>
+      <w:pPr>
+        <w:ind w:left="5760" w:hanging="360"/>
+      </w:pPr>
+      <w:rPr>
+        <w:rFonts w:ascii="Courier New" w:hAnsi="Courier New" w:cs="Courier New" w:hint="default"/>
+      </w:rPr>
+    </w:lvl>
+    <w:lvl w:ilvl="8" w:tplc="04090005" w:tentative="1">
+      <w:start w:val="1"/>
+      <w:numFmt w:val="bullet"/>
+      <w:lvlText w:val=""/>
+      <w:lvlJc w:val="left"/>
+      <w:pPr>
+        <w:ind w:left="6480" w:hanging="360"/>
+      </w:pPr>
+      <w:rPr>
+        <w:rFonts w:ascii="Wingdings" w:hAnsi="Wingdings" w:hint="default"/>
+      </w:rPr>
+    </w:lvl>
+  </w:abstractNum>
+  <w:abstractNum w:abstractNumId="21" w15:restartNumberingAfterBreak="0">
     <w:nsid w:val="5FCE34E9"/>
     <w:multiLevelType w:val="hybridMultilevel"/>
     <w:tmpl w:val="049C1906"/>
@@ -12042,7 +13893,7 @@
       </w:pPr>
     </w:lvl>
   </w:abstractNum>
-  <w:abstractNum w:abstractNumId="20" w15:restartNumberingAfterBreak="0">
+  <w:abstractNum w:abstractNumId="22" w15:restartNumberingAfterBreak="0">
     <w:nsid w:val="628B45D1"/>
     <w:multiLevelType w:val="hybridMultilevel"/>
     <w:tmpl w:val="EDEE4BC4"/>
@@ -12131,7 +13982,7 @@
       </w:pPr>
     </w:lvl>
   </w:abstractNum>
-  <w:abstractNum w:abstractNumId="21" w15:restartNumberingAfterBreak="0">
+  <w:abstractNum w:abstractNumId="23" w15:restartNumberingAfterBreak="0">
     <w:nsid w:val="6634199D"/>
     <w:multiLevelType w:val="hybridMultilevel"/>
     <w:tmpl w:val="D602CA36"/>
@@ -12220,7 +14071,7 @@
       </w:pPr>
     </w:lvl>
   </w:abstractNum>
-  <w:abstractNum w:abstractNumId="22" w15:restartNumberingAfterBreak="0">
+  <w:abstractNum w:abstractNumId="24" w15:restartNumberingAfterBreak="0">
     <w:nsid w:val="66505083"/>
     <w:multiLevelType w:val="hybridMultilevel"/>
     <w:tmpl w:val="CA14D722"/>
@@ -12333,7 +14184,7 @@
       </w:rPr>
     </w:lvl>
   </w:abstractNum>
-  <w:abstractNum w:abstractNumId="23" w15:restartNumberingAfterBreak="0">
+  <w:abstractNum w:abstractNumId="25" w15:restartNumberingAfterBreak="0">
     <w:nsid w:val="6664574A"/>
     <w:multiLevelType w:val="hybridMultilevel"/>
     <w:tmpl w:val="83909E78"/>
@@ -12446,7 +14297,7 @@
       </w:rPr>
     </w:lvl>
   </w:abstractNum>
-  <w:abstractNum w:abstractNumId="24" w15:restartNumberingAfterBreak="0">
+  <w:abstractNum w:abstractNumId="26" w15:restartNumberingAfterBreak="0">
     <w:nsid w:val="6E115D3F"/>
     <w:multiLevelType w:val="hybridMultilevel"/>
     <w:tmpl w:val="14322474"/>
@@ -12536,7 +14387,7 @@
       </w:pPr>
     </w:lvl>
   </w:abstractNum>
-  <w:abstractNum w:abstractNumId="25" w15:restartNumberingAfterBreak="0">
+  <w:abstractNum w:abstractNumId="27" w15:restartNumberingAfterBreak="0">
     <w:nsid w:val="6F36291D"/>
     <w:multiLevelType w:val="hybridMultilevel"/>
     <w:tmpl w:val="2E6EC0C8"/>
@@ -12625,7 +14476,96 @@
       </w:pPr>
     </w:lvl>
   </w:abstractNum>
-  <w:abstractNum w:abstractNumId="26" w15:restartNumberingAfterBreak="0">
+  <w:abstractNum w:abstractNumId="28" w15:restartNumberingAfterBreak="0">
+    <w:nsid w:val="6FA13DA2"/>
+    <w:multiLevelType w:val="hybridMultilevel"/>
+    <w:tmpl w:val="B85AC27A"/>
+    <w:lvl w:ilvl="0" w:tplc="04090017">
+      <w:start w:val="1"/>
+      <w:numFmt w:val="lowerLetter"/>
+      <w:lvlText w:val="%1)"/>
+      <w:lvlJc w:val="left"/>
+      <w:pPr>
+        <w:ind w:left="720" w:hanging="360"/>
+      </w:pPr>
+      <w:rPr>
+        <w:rFonts w:hint="default"/>
+      </w:rPr>
+    </w:lvl>
+    <w:lvl w:ilvl="1" w:tplc="04090019" w:tentative="1">
+      <w:start w:val="1"/>
+      <w:numFmt w:val="lowerLetter"/>
+      <w:lvlText w:val="%2."/>
+      <w:lvlJc w:val="left"/>
+      <w:pPr>
+        <w:ind w:left="1440" w:hanging="360"/>
+      </w:pPr>
+    </w:lvl>
+    <w:lvl w:ilvl="2" w:tplc="0409001B" w:tentative="1">
+      <w:start w:val="1"/>
+      <w:numFmt w:val="lowerRoman"/>
+      <w:lvlText w:val="%3."/>
+      <w:lvlJc w:val="right"/>
+      <w:pPr>
+        <w:ind w:left="2160" w:hanging="180"/>
+      </w:pPr>
+    </w:lvl>
+    <w:lvl w:ilvl="3" w:tplc="0409000F" w:tentative="1">
+      <w:start w:val="1"/>
+      <w:numFmt w:val="decimal"/>
+      <w:lvlText w:val="%4."/>
+      <w:lvlJc w:val="left"/>
+      <w:pPr>
+        <w:ind w:left="2880" w:hanging="360"/>
+      </w:pPr>
+    </w:lvl>
+    <w:lvl w:ilvl="4" w:tplc="04090019" w:tentative="1">
+      <w:start w:val="1"/>
+      <w:numFmt w:val="lowerLetter"/>
+      <w:lvlText w:val="%5."/>
+      <w:lvlJc w:val="left"/>
+      <w:pPr>
+        <w:ind w:left="3600" w:hanging="360"/>
+      </w:pPr>
+    </w:lvl>
+    <w:lvl w:ilvl="5" w:tplc="0409001B" w:tentative="1">
+      <w:start w:val="1"/>
+      <w:numFmt w:val="lowerRoman"/>
+      <w:lvlText w:val="%6."/>
+      <w:lvlJc w:val="right"/>
+      <w:pPr>
+        <w:ind w:left="4320" w:hanging="180"/>
+      </w:pPr>
+    </w:lvl>
+    <w:lvl w:ilvl="6" w:tplc="0409000F" w:tentative="1">
+      <w:start w:val="1"/>
+      <w:numFmt w:val="decimal"/>
+      <w:lvlText w:val="%7."/>
+      <w:lvlJc w:val="left"/>
+      <w:pPr>
+        <w:ind w:left="5040" w:hanging="360"/>
+      </w:pPr>
+    </w:lvl>
+    <w:lvl w:ilvl="7" w:tplc="04090019" w:tentative="1">
+      <w:start w:val="1"/>
+      <w:numFmt w:val="lowerLetter"/>
+      <w:lvlText w:val="%8."/>
+      <w:lvlJc w:val="left"/>
+      <w:pPr>
+        <w:ind w:left="5760" w:hanging="360"/>
+      </w:pPr>
+    </w:lvl>
+    <w:lvl w:ilvl="8" w:tplc="0409001B" w:tentative="1">
+      <w:start w:val="1"/>
+      <w:numFmt w:val="lowerRoman"/>
+      <w:lvlText w:val="%9."/>
+      <w:lvlJc w:val="right"/>
+      <w:pPr>
+        <w:ind w:left="6480" w:hanging="180"/>
+      </w:pPr>
+    </w:lvl>
+  </w:abstractNum>
+  <w:abstractNum w:abstractNumId="29" w15:restartNumberingAfterBreak="0">
     <w:nsid w:val="75CE1ECE"/>
     <w:multiLevelType w:val="hybridMultilevel"/>
     <w:tmpl w:val="96B662AE"/>
@@ -12715,7 +14655,7 @@
       </w:pPr>
     </w:lvl>
   </w:abstractNum>
-  <w:abstractNum w:abstractNumId="27" w15:restartNumberingAfterBreak="0">
+  <w:abstractNum w:abstractNumId="30" w15:restartNumberingAfterBreak="0">
     <w:nsid w:val="7F7F01B9"/>
     <w:multiLevelType w:val="hybridMultilevel"/>
     <w:tmpl w:val="2BAE419C"/>
@@ -12814,22 +14754,22 @@
     <w:abstractNumId w:val="3"/>
   </w:num>
   <w:num w:numId="4" w16cid:durableId="172839585">
-    <w:abstractNumId w:val="26"/>
+    <w:abstractNumId w:val="29"/>
   </w:num>
   <w:num w:numId="5" w16cid:durableId="1597247222">
-    <w:abstractNumId w:val="14"/>
+    <w:abstractNumId w:val="15"/>
   </w:num>
   <w:num w:numId="6" w16cid:durableId="916599355">
-    <w:abstractNumId w:val="17"/>
+    <w:abstractNumId w:val="18"/>
   </w:num>
   <w:num w:numId="7" w16cid:durableId="522673411">
-    <w:abstractNumId w:val="20"/>
+    <w:abstractNumId w:val="22"/>
   </w:num>
   <w:num w:numId="8" w16cid:durableId="2086564900">
     <w:abstractNumId w:val="7"/>
   </w:num>
   <w:num w:numId="9" w16cid:durableId="927227999">
-    <w:abstractNumId w:val="24"/>
+    <w:abstractNumId w:val="26"/>
   </w:num>
   <w:num w:numId="10" w16cid:durableId="2136942267">
     <w:abstractNumId w:val="10"/>
@@ -12844,49 +14784,58 @@
     <w:abstractNumId w:val="12"/>
   </w:num>
   <w:num w:numId="14" w16cid:durableId="100802674">
-    <w:abstractNumId w:val="19"/>
+    <w:abstractNumId w:val="21"/>
   </w:num>
   <w:num w:numId="15" w16cid:durableId="868032529">
     <w:abstractNumId w:val="0"/>
   </w:num>
   <w:num w:numId="16" w16cid:durableId="1662466892">
-    <w:abstractNumId w:val="16"/>
+    <w:abstractNumId w:val="17"/>
   </w:num>
   <w:num w:numId="17" w16cid:durableId="1495104439">
-    <w:abstractNumId w:val="21"/>
+    <w:abstractNumId w:val="23"/>
   </w:num>
   <w:num w:numId="18" w16cid:durableId="1651402552">
     <w:abstractNumId w:val="8"/>
   </w:num>
   <w:num w:numId="19" w16cid:durableId="796528992">
-    <w:abstractNumId w:val="23"/>
+    <w:abstractNumId w:val="25"/>
   </w:num>
   <w:num w:numId="20" w16cid:durableId="780497310">
     <w:abstractNumId w:val="4"/>
   </w:num>
   <w:num w:numId="21" w16cid:durableId="1215890220">
-    <w:abstractNumId w:val="18"/>
+    <w:abstractNumId w:val="19"/>
   </w:num>
   <w:num w:numId="22" w16cid:durableId="746848990">
-    <w:abstractNumId w:val="13"/>
+    <w:abstractNumId w:val="14"/>
   </w:num>
   <w:num w:numId="23" w16cid:durableId="1222520291">
-    <w:abstractNumId w:val="15"/>
+    <w:abstractNumId w:val="16"/>
   </w:num>
   <w:num w:numId="24" w16cid:durableId="1774939577">
-    <w:abstractNumId w:val="27"/>
+    <w:abstractNumId w:val="30"/>
   </w:num>
   <w:num w:numId="25" w16cid:durableId="488253558">
-    <w:abstractNumId w:val="22"/>
+    <w:abstractNumId w:val="24"/>
   </w:num>
   <w:num w:numId="26" w16cid:durableId="962687944">
     <w:abstractNumId w:val="11"/>
   </w:num>
   <w:num w:numId="27" w16cid:durableId="438765313">
-    <w:abstractNumId w:val="25"/>
+    <w:abstractNumId w:val="27"/>
   </w:num>
   <w:num w:numId="28" w16cid:durableId="1207328661">
     <w:abstractNumId w:val="5"/>
+  </w:num>
+  <w:num w:numId="29" w16cid:durableId="712195446">
+    <w:abstractNumId w:val="20"/>
+  </w:num>
+  <w:num w:numId="30" w16cid:durableId="587346705">
+    <w:abstractNumId w:val="28"/>
+  </w:num>
+  <w:num w:numId="31" w16cid:durableId="724766738">
+    <w:abstractNumId w:val="13"/>
   </w:num>
 </w:numbering>
 </file>

</xml_diff>

<commit_message>
remove NEWSPILL, add uProc interrupt and fix PREFETCH logic
See "commands_for_ROC_FW_timingconstrained.docx" for detailed about the firmware changes
</commit_message>
<xml_diff>
--- a/commands_for_ROC_FW_timingconstrained.docx
+++ b/commands_for_ROC_FW_timingconstrained.docx
@@ -66,10 +66,10 @@
     </w:p>
     <w:p>
       <w:r>
-        <w:t>This document reports on features of the ROC Firmware released on 0</w:t>
-      </w:r>
-      <w:r>
-        <w:t>6</w:t>
+        <w:t xml:space="preserve">This document reports on features of the ROC Firmware released on </w:t>
+      </w:r>
+      <w:r>
+        <w:t>11</w:t>
       </w:r>
       <w:r>
         <w:t>/</w:t>
@@ -78,7 +78,7 @@
         <w:t>0</w:t>
       </w:r>
       <w:r>
-        <w:t>7</w:t>
+        <w:t>4</w:t>
       </w:r>
       <w:r>
         <w:t>/2025 to “</w:t>
@@ -115,7 +115,13 @@
         <w:t xml:space="preserve">. </w:t>
       </w:r>
       <w:r>
-        <w:t>It is divided in three part:</w:t>
+        <w:t>It is divided in three part</w:t>
+      </w:r>
+      <w:r>
+        <w:t>s, each documenting</w:t>
+      </w:r>
+      <w:r>
+        <w:t>:</w:t>
       </w:r>
     </w:p>
     <w:p/>
@@ -135,37 +141,7 @@
           <w:rPr>
             <w:rStyle w:val="Hyperlink"/>
           </w:rPr>
-          <w:t>ne</w:t>
-        </w:r>
-        <w:r>
-          <w:rPr>
-            <w:rStyle w:val="Hyperlink"/>
-          </w:rPr>
-          <w:t>w</w:t>
-        </w:r>
-        <w:r>
-          <w:rPr>
-            <w:rStyle w:val="Hyperlink"/>
-          </w:rPr>
-          <w:t xml:space="preserve"> </w:t>
-        </w:r>
-        <w:r>
-          <w:rPr>
-            <w:rStyle w:val="Hyperlink"/>
-          </w:rPr>
-          <w:t>f</w:t>
-        </w:r>
-        <w:r>
-          <w:rPr>
-            <w:rStyle w:val="Hyperlink"/>
-          </w:rPr>
-          <w:t>e</w:t>
-        </w:r>
-        <w:r>
-          <w:rPr>
-            <w:rStyle w:val="Hyperlink"/>
-          </w:rPr>
-          <w:t>ature</w:t>
+          <w:t>new feature</w:t>
         </w:r>
         <w:r>
           <w:rPr>
@@ -192,12 +168,46 @@
           <w:numId w:val="23"/>
         </w:numPr>
       </w:pPr>
-      <w:hyperlink w:anchor="status_bit" w:history="1">
+      <w:hyperlink w:anchor="digi_remote" w:history="1">
         <w:r>
           <w:rPr>
             <w:rStyle w:val="Hyperlink"/>
           </w:rPr>
-          <w:t>STATUS</w:t>
+          <w:t>DIGI remote programmability functions</w:t>
+        </w:r>
+      </w:hyperlink>
+    </w:p>
+    <w:p>
+      <w:pPr>
+        <w:pStyle w:val="ListParagraph"/>
+        <w:numPr>
+          <w:ilvl w:val="1"/>
+          <w:numId w:val="23"/>
+        </w:numPr>
+      </w:pPr>
+      <w:hyperlink w:anchor="IRQ" w:history="1">
+        <w:r>
+          <w:rPr>
+            <w:rStyle w:val="Hyperlink"/>
+          </w:rPr>
+          <w:t>Microprocessor INTERRUPT via fiber</w:t>
+        </w:r>
+      </w:hyperlink>
+    </w:p>
+    <w:p>
+      <w:pPr>
+        <w:pStyle w:val="ListParagraph"/>
+        <w:numPr>
+          <w:ilvl w:val="1"/>
+          <w:numId w:val="23"/>
+        </w:numPr>
+      </w:pPr>
+      <w:hyperlink w:anchor="prefetch" w:history="1">
+        <w:r>
+          <w:rPr>
+            <w:rStyle w:val="Hyperlink"/>
+          </w:rPr>
+          <w:t>PREFETCH packet</w:t>
         </w:r>
         <w:r>
           <w:rPr>
@@ -209,54 +219,73 @@
           <w:rPr>
             <w:rStyle w:val="Hyperlink"/>
           </w:rPr>
-          <w:t>bits in data p</w:t>
+          <w:t>handling</w:t>
+        </w:r>
+      </w:hyperlink>
+      <w:r>
+        <w:t xml:space="preserve"> </w:t>
+      </w:r>
+    </w:p>
+    <w:p>
+      <w:pPr>
+        <w:pStyle w:val="ListParagraph"/>
+        <w:numPr>
+          <w:ilvl w:val="1"/>
+          <w:numId w:val="23"/>
+        </w:numPr>
+      </w:pPr>
+      <w:hyperlink w:anchor="new_DREQ_timeout" w:history="1">
+        <w:r>
+          <w:rPr>
+            <w:rStyle w:val="Hyperlink"/>
+          </w:rPr>
+          <w:t>Remove NEWSPILL and HALTRUN_EN, change DREQ timeout</w:t>
+        </w:r>
+      </w:hyperlink>
+    </w:p>
+    <w:p>
+      <w:pPr>
+        <w:pStyle w:val="ListParagraph"/>
+        <w:numPr>
+          <w:ilvl w:val="1"/>
+          <w:numId w:val="23"/>
+        </w:numPr>
+      </w:pPr>
+      <w:hyperlink w:anchor="status_bit" w:history="1">
+        <w:r>
+          <w:rPr>
+            <w:rStyle w:val="Hyperlink"/>
+          </w:rPr>
+          <w:t>STATUS bits in data packet header</w:t>
+        </w:r>
+      </w:hyperlink>
+    </w:p>
+    <w:p>
+      <w:pPr>
+        <w:pStyle w:val="ListParagraph"/>
+        <w:numPr>
+          <w:ilvl w:val="1"/>
+          <w:numId w:val="23"/>
+        </w:numPr>
+      </w:pPr>
+      <w:hyperlink w:anchor="remote_prog" w:history="1">
+        <w:r>
+          <w:rPr>
+            <w:rStyle w:val="Hyperlink"/>
+          </w:rPr>
+          <w:t>R</w:t>
         </w:r>
         <w:r>
           <w:rPr>
             <w:rStyle w:val="Hyperlink"/>
           </w:rPr>
-          <w:t>a</w:t>
+          <w:t>OC r</w:t>
         </w:r>
         <w:r>
           <w:rPr>
             <w:rStyle w:val="Hyperlink"/>
           </w:rPr>
-          <w:t>cket header</w:t>
-        </w:r>
-      </w:hyperlink>
-    </w:p>
-    <w:p>
-      <w:pPr>
-        <w:pStyle w:val="ListParagraph"/>
-        <w:numPr>
-          <w:ilvl w:val="1"/>
-          <w:numId w:val="23"/>
-        </w:numPr>
-      </w:pPr>
-      <w:hyperlink w:anchor="remote_prog" w:history="1">
-        <w:r>
-          <w:rPr>
-            <w:rStyle w:val="Hyperlink"/>
-          </w:rPr>
-          <w:t>Re</w:t>
-        </w:r>
-        <w:r>
-          <w:rPr>
-            <w:rStyle w:val="Hyperlink"/>
-          </w:rPr>
-          <w:t>m</w:t>
-        </w:r>
-        <w:r>
-          <w:rPr>
-            <w:rStyle w:val="Hyperlink"/>
-          </w:rPr>
-          <w:t>o</w:t>
-        </w:r>
-        <w:r>
-          <w:rPr>
-            <w:rStyle w:val="Hyperlink"/>
-          </w:rPr>
-          <w:t>te programmability functions</w:t>
+          <w:t>emote programmability functions</w:t>
         </w:r>
       </w:hyperlink>
     </w:p>
@@ -627,7 +656,52 @@
           <w:b/>
           <w:bCs/>
         </w:rPr>
-        <w:t>New Featu</w:t>
+        <w:t>New Features</w:t>
+      </w:r>
+      <w:r>
+        <w:rPr>
+          <w:b/>
+          <w:bCs/>
+        </w:rPr>
+        <w:fldChar w:fldCharType="end"/>
+      </w:r>
+    </w:p>
+    <w:p>
+      <w:pPr>
+        <w:rPr>
+          <w:b/>
+          <w:bCs/>
+        </w:rPr>
+      </w:pPr>
+    </w:p>
+    <w:bookmarkStart w:id="2" w:name="digi_remote"/>
+    <w:p>
+      <w:r>
+        <w:rPr>
+          <w:b/>
+          <w:bCs/>
+        </w:rPr>
+        <w:fldChar w:fldCharType="begin"/>
+      </w:r>
+      <w:r>
+        <w:rPr>
+          <w:b/>
+          <w:bCs/>
+        </w:rPr>
+        <w:instrText>HYPERLINK  \l "_top"</w:instrText>
+      </w:r>
+      <w:r>
+        <w:rPr>
+          <w:b/>
+          <w:bCs/>
+        </w:rPr>
+      </w:r>
+      <w:r>
+        <w:rPr>
+          <w:b/>
+          <w:bCs/>
+        </w:rPr>
+        <w:fldChar w:fldCharType="separate"/>
       </w:r>
       <w:r>
         <w:rPr>
@@ -635,7 +709,94 @@
           <w:b/>
           <w:bCs/>
         </w:rPr>
-        <w:t>r</w:t>
+        <w:t>DIGI remote programmability functions</w:t>
+      </w:r>
+      <w:bookmarkEnd w:id="2"/>
+      <w:r>
+        <w:rPr>
+          <w:b/>
+          <w:bCs/>
+        </w:rPr>
+        <w:fldChar w:fldCharType="end"/>
+      </w:r>
+      <w:r>
+        <w:t xml:space="preserve">: this functionality is implemented in </w:t>
+      </w:r>
+      <w:r>
+        <w:t xml:space="preserve">then </w:t>
+      </w:r>
+      <w:proofErr w:type="spellStart"/>
+      <w:r>
+        <w:t>SoftConsole</w:t>
+      </w:r>
+      <w:proofErr w:type="spellEnd"/>
+      <w:r>
+        <w:t xml:space="preserve"> code and did not require any change to the firmware. </w:t>
+      </w:r>
+      <w:r>
+        <w:t xml:space="preserve">Is it executed via commands to registers 385, 386 and 387. </w:t>
+      </w:r>
+      <w:r>
+        <w:t xml:space="preserve">See </w:t>
+      </w:r>
+      <w:r>
+        <w:t>the “</w:t>
+      </w:r>
+      <w:proofErr w:type="spellStart"/>
+      <w:r>
+        <w:t>ROC_DIGI_remote_programmability_registers</w:t>
+      </w:r>
+      <w:proofErr w:type="spellEnd"/>
+      <w:r>
+        <w:t>” document for details.</w:t>
+      </w:r>
+    </w:p>
+    <w:p>
+      <w:pPr>
+        <w:rPr>
+          <w:b/>
+          <w:bCs/>
+        </w:rPr>
+      </w:pPr>
+    </w:p>
+    <w:bookmarkEnd w:id="1"/>
+    <w:p>
+      <w:pPr>
+        <w:rPr>
+          <w:b/>
+          <w:bCs/>
+        </w:rPr>
+      </w:pPr>
+    </w:p>
+    <w:bookmarkStart w:id="3" w:name="IRQ"/>
+    <w:bookmarkStart w:id="4" w:name="status_bit"/>
+    <w:p>
+      <w:r>
+        <w:rPr>
+          <w:b/>
+          <w:bCs/>
+        </w:rPr>
+        <w:fldChar w:fldCharType="begin"/>
+      </w:r>
+      <w:r>
+        <w:rPr>
+          <w:b/>
+          <w:bCs/>
+        </w:rPr>
+        <w:instrText>HYPERLINK  \l "_top"</w:instrText>
+      </w:r>
+      <w:r>
+        <w:rPr>
+          <w:b/>
+          <w:bCs/>
+        </w:rPr>
+      </w:r>
+      <w:r>
+        <w:rPr>
+          <w:b/>
+          <w:bCs/>
+        </w:rPr>
+        <w:fldChar w:fldCharType="separate"/>
       </w:r>
       <w:r>
         <w:rPr>
@@ -643,8 +804,9 @@
           <w:b/>
           <w:bCs/>
         </w:rPr>
-        <w:t>es</w:t>
-      </w:r>
+        <w:t>Microprocessor INTERRUPT via fiber</w:t>
+      </w:r>
+      <w:bookmarkEnd w:id="3"/>
       <w:r>
         <w:rPr>
           <w:b/>
@@ -652,17 +814,73 @@
         </w:rPr>
         <w:fldChar w:fldCharType="end"/>
       </w:r>
-    </w:p>
-    <w:bookmarkEnd w:id="1"/>
-    <w:p>
-      <w:pPr>
-        <w:rPr>
-          <w:b/>
-          <w:bCs/>
-        </w:rPr>
-      </w:pPr>
-    </w:p>
-    <w:bookmarkStart w:id="2" w:name="status_bit"/>
+      <w:r>
+        <w:rPr>
+          <w:b/>
+          <w:bCs/>
+        </w:rPr>
+        <w:t xml:space="preserve">: </w:t>
+      </w:r>
+      <w:r>
+        <w:t xml:space="preserve">a DCS Write of value 1 to register 15 generates a self-clearing interrupt request, EXT_IRQ, of the MIV_RV32IMC microprocessor. Remember to </w:t>
+      </w:r>
+      <w:r>
+        <w:t>set it back to 0</w:t>
+      </w:r>
+      <w:r>
+        <w:t xml:space="preserve"> before issuing the next interrupt</w:t>
+      </w:r>
+      <w:r>
+        <w:t>!</w:t>
+      </w:r>
+      <w:r>
+        <w:t xml:space="preserve">  The interrupts is handled by </w:t>
+      </w:r>
+      <w:proofErr w:type="spellStart"/>
+      <w:r>
+        <w:rPr>
+          <w:i/>
+          <w:iCs/>
+        </w:rPr>
+        <w:t>latch_and_clear</w:t>
+      </w:r>
+      <w:proofErr w:type="spellEnd"/>
+      <w:r>
+        <w:rPr>
+          <w:i/>
+          <w:iCs/>
+        </w:rPr>
+        <w:t xml:space="preserve"> </w:t>
+      </w:r>
+      <w:r>
+        <w:t>module which receive the asynchronous interrupt gate generated by the fiber (</w:t>
+      </w:r>
+      <w:r>
+        <w:rPr>
+          <w:i/>
+          <w:iCs/>
+        </w:rPr>
+        <w:t>TOPSERDES/DCS_EXT_SYS_IRQ</w:t>
+      </w:r>
+      <w:r>
+        <w:t xml:space="preserve"> output), latches the rising edge on the CPU_CLK, and clears via a single cycle strobe generated by microprocessor itself (</w:t>
+      </w:r>
+      <w:r>
+        <w:rPr>
+          <w:i/>
+          <w:iCs/>
+        </w:rPr>
+        <w:t>SLOWCONTROLS/IRQ_CLR</w:t>
+      </w:r>
+      <w:r>
+        <w:t xml:space="preserve"> output</w:t>
+      </w:r>
+      <w:r>
+        <w:t>).</w:t>
+      </w:r>
+    </w:p>
+    <w:p/>
+    <w:bookmarkStart w:id="5" w:name="prefetch"/>
     <w:p>
       <w:r>
         <w:rPr>
@@ -697,7 +915,69 @@
           <w:b/>
           <w:bCs/>
         </w:rPr>
-        <w:t xml:space="preserve">STATUS bit </w:t>
+        <w:t>PREFETCH packet handling</w:t>
+      </w:r>
+      <w:bookmarkEnd w:id="5"/>
+      <w:r>
+        <w:rPr>
+          <w:b/>
+          <w:bCs/>
+        </w:rPr>
+        <w:fldChar w:fldCharType="end"/>
+      </w:r>
+      <w:r>
+        <w:t xml:space="preserve">: handling of PREFETCH packet, which is issued for the event window tag following the one for which DATAREQ has been issued, is achieved via the </w:t>
+      </w:r>
+      <w:proofErr w:type="spellStart"/>
+      <w:r>
+        <w:rPr>
+          <w:color w:val="EE0000"/>
+        </w:rPr>
+        <w:t>has_prefetch</w:t>
+      </w:r>
+      <w:proofErr w:type="spellEnd"/>
+      <w:r>
+        <w:t xml:space="preserve"> flag set inside the TOPSERDES/</w:t>
+      </w:r>
+      <w:proofErr w:type="spellStart"/>
+      <w:r>
+        <w:t>DREQProcessor</w:t>
+      </w:r>
+      <w:proofErr w:type="spellEnd"/>
+      <w:r>
+        <w:t xml:space="preserve"> CHECKCRC machine state.</w:t>
+      </w:r>
+    </w:p>
+    <w:p/>
+    <w:p/>
+    <w:bookmarkStart w:id="6" w:name="new_DREQ_timeout"/>
+    <w:p>
+      <w:r>
+        <w:rPr>
+          <w:b/>
+          <w:bCs/>
+        </w:rPr>
+        <w:fldChar w:fldCharType="begin"/>
+      </w:r>
+      <w:r>
+        <w:rPr>
+          <w:b/>
+          <w:bCs/>
+        </w:rPr>
+        <w:instrText>HYPERLINK  \l "_top"</w:instrText>
+      </w:r>
+      <w:r>
+        <w:rPr>
+          <w:b/>
+          <w:bCs/>
+        </w:rPr>
+      </w:r>
+      <w:r>
+        <w:rPr>
+          <w:b/>
+          <w:bCs/>
+        </w:rPr>
+        <w:fldChar w:fldCharType="separate"/>
       </w:r>
       <w:r>
         <w:rPr>
@@ -705,7 +985,7 @@
           <w:b/>
           <w:bCs/>
         </w:rPr>
-        <w:t>i</w:t>
+        <w:t>Remove NEWSPILL and HALTRUN_EN,</w:t>
       </w:r>
       <w:r>
         <w:rPr>
@@ -713,9 +993,17 @@
           <w:b/>
           <w:bCs/>
         </w:rPr>
-        <w:t>n data header packet</w:t>
-      </w:r>
-      <w:bookmarkEnd w:id="2"/>
+        <w:t xml:space="preserve"> </w:t>
+      </w:r>
+      <w:r>
+        <w:rPr>
+          <w:rStyle w:val="Hyperlink"/>
+          <w:b/>
+          <w:bCs/>
+        </w:rPr>
+        <w:t>change DREQ timeout</w:t>
+      </w:r>
+      <w:bookmarkEnd w:id="6"/>
       <w:r>
         <w:rPr>
           <w:b/>
@@ -724,12 +1012,162 @@
         <w:fldChar w:fldCharType="end"/>
       </w:r>
       <w:r>
-        <w:rPr>
-          <w:b/>
-          <w:bCs/>
-        </w:rPr>
         <w:t xml:space="preserve">: </w:t>
       </w:r>
+    </w:p>
+    <w:p>
+      <w:pPr>
+        <w:pStyle w:val="ListParagraph"/>
+        <w:numPr>
+          <w:ilvl w:val="0"/>
+          <w:numId w:val="32"/>
+        </w:numPr>
+      </w:pPr>
+      <w:r>
+        <w:t xml:space="preserve">Removed NEWSPILL gate at the first </w:t>
+      </w:r>
+      <w:proofErr w:type="spellStart"/>
+      <w:r>
+        <w:t>heartbit</w:t>
+      </w:r>
+      <w:proofErr w:type="spellEnd"/>
+      <w:r>
+        <w:t xml:space="preserve"> after a null HB, and all of the pulses derived on it rising edge (</w:t>
+      </w:r>
+      <w:proofErr w:type="spellStart"/>
+      <w:r>
+        <w:t>newspill_on_xcvrclk</w:t>
+      </w:r>
+      <w:proofErr w:type="spellEnd"/>
+      <w:r>
+        <w:t xml:space="preserve">, </w:t>
+      </w:r>
+      <w:proofErr w:type="spellStart"/>
+      <w:r>
+        <w:t>newspill_on_sysclk</w:t>
+      </w:r>
+      <w:proofErr w:type="spellEnd"/>
+      <w:r>
+        <w:t xml:space="preserve">, </w:t>
+      </w:r>
+      <w:proofErr w:type="spellStart"/>
+      <w:r>
+        <w:t>newspill_on_dreqclk</w:t>
+      </w:r>
+      <w:proofErr w:type="spellEnd"/>
+      <w:r>
+        <w:t xml:space="preserve">) used to automatically cleared logic and counters at the start of a new run. Now a firmware reset via register 14 is needed BEFORE a new spill. Keep only </w:t>
+      </w:r>
+      <w:proofErr w:type="spellStart"/>
+      <w:r>
+        <w:t>newspill_on_serdesclk</w:t>
+      </w:r>
+      <w:proofErr w:type="spellEnd"/>
+      <w:r>
+        <w:t xml:space="preserve"> in </w:t>
+      </w:r>
+      <w:proofErr w:type="spellStart"/>
+      <w:r>
+        <w:t>TOP_Serdes</w:t>
+      </w:r>
+      <w:proofErr w:type="spellEnd"/>
+      <w:r>
+        <w:t>/</w:t>
+      </w:r>
+      <w:proofErr w:type="spellStart"/>
+      <w:r>
+        <w:t>EW_FIFO_Controller</w:t>
+      </w:r>
+      <w:proofErr w:type="spellEnd"/>
+      <w:r>
+        <w:t xml:space="preserve"> but require the confirmation of </w:t>
+      </w:r>
+      <w:proofErr w:type="spellStart"/>
+      <w:r>
+        <w:t>ew_tag</w:t>
+      </w:r>
+      <w:proofErr w:type="spellEnd"/>
+      <w:r>
+        <w:t xml:space="preserve"> = 0 from the DIGI data</w:t>
+      </w:r>
+    </w:p>
+    <w:p>
+      <w:pPr>
+        <w:pStyle w:val="ListParagraph"/>
+        <w:numPr>
+          <w:ilvl w:val="0"/>
+          <w:numId w:val="32"/>
+        </w:numPr>
+      </w:pPr>
+      <w:r>
+        <w:t xml:space="preserve">Remove the use of HALTRUN_EN  (bit 13 of DRAC register 8) to simulate a run halt command, </w:t>
+      </w:r>
+      <w:proofErr w:type="spellStart"/>
+      <w:r>
+        <w:t>ie</w:t>
+      </w:r>
+      <w:proofErr w:type="spellEnd"/>
+      <w:r>
+        <w:t xml:space="preserve"> a </w:t>
+      </w:r>
+      <w:proofErr w:type="spellStart"/>
+      <w:r>
+        <w:t>newspill</w:t>
+      </w:r>
+      <w:proofErr w:type="spellEnd"/>
+      <w:r>
+        <w:t xml:space="preserve"> without a reset of the counters.</w:t>
+      </w:r>
+    </w:p>
+    <w:p>
+      <w:pPr>
+        <w:pStyle w:val="ListParagraph"/>
+        <w:numPr>
+          <w:ilvl w:val="0"/>
+          <w:numId w:val="32"/>
+        </w:numPr>
+      </w:pPr>
+      <w:r>
+        <w:t xml:space="preserve">Changed DREQ timeout logic inside </w:t>
+      </w:r>
+      <w:proofErr w:type="spellStart"/>
+      <w:r>
+        <w:t>TOP_Serdes</w:t>
+      </w:r>
+      <w:proofErr w:type="spellEnd"/>
+      <w:r>
+        <w:t>/</w:t>
+      </w:r>
+      <w:proofErr w:type="spellStart"/>
+      <w:r>
+        <w:t>DREQProcessor</w:t>
+      </w:r>
+      <w:proofErr w:type="spellEnd"/>
+      <w:r>
+        <w:t xml:space="preserve"> from simple timeout after EVENT_TIMEOUT[19:0] counts of DREQ clock (12.5 ns) to EVENT_TIMEOUT extended if ADC is still sending data for the event plus 0xA00 extra clocks to allow for the DDR write and DDR read of overflow event window data</w:t>
+      </w:r>
+    </w:p>
+    <w:p/>
+    <w:p/>
+    <w:p>
+      <w:hyperlink w:anchor="_top" w:history="1">
+        <w:r>
+          <w:rPr>
+            <w:rStyle w:val="Hyperlink"/>
+            <w:b/>
+            <w:bCs/>
+          </w:rPr>
+          <w:t>STATUS bit in data header packet</w:t>
+        </w:r>
+        <w:bookmarkEnd w:id="4"/>
+      </w:hyperlink>
+      <w:r>
+        <w:rPr>
+          <w:b/>
+          <w:bCs/>
+        </w:rPr>
+        <w:t xml:space="preserve">: </w:t>
+      </w:r>
       <w:r>
         <w:t xml:space="preserve">in response to a Data Request from the DTC , the ROC </w:t>
       </w:r>
@@ -800,65 +1238,198 @@
           <w:b/>
           <w:bCs/>
         </w:rPr>
-        <w:t>STATUS[</w:t>
-      </w:r>
-      <w:r>
-        <w:rPr>
-          <w:b/>
-          <w:bCs/>
-        </w:rPr>
-        <w:t>1</w:t>
-      </w:r>
-      <w:r>
-        <w:rPr>
-          <w:b/>
-          <w:bCs/>
-        </w:rPr>
-        <w:t>]:</w:t>
-      </w:r>
-      <w:r>
-        <w:t xml:space="preserve"> </w:t>
-      </w:r>
-      <w:r>
-        <w:t xml:space="preserve"> unused</w:t>
-      </w:r>
-      <w:r>
-        <w:t xml:space="preserve"> </w:t>
-      </w:r>
-    </w:p>
-    <w:p>
-      <w:pPr>
-        <w:rPr>
-          <w:b/>
-          <w:bCs/>
-        </w:rPr>
-      </w:pPr>
-      <w:r>
-        <w:rPr>
-          <w:b/>
-          <w:bCs/>
-        </w:rPr>
-        <w:t>STATUS[</w:t>
-      </w:r>
-      <w:r>
-        <w:rPr>
-          <w:b/>
-          <w:bCs/>
-        </w:rPr>
-        <w:t>2</w:t>
-      </w:r>
-      <w:r>
-        <w:rPr>
-          <w:b/>
-          <w:bCs/>
-        </w:rPr>
-        <w:t>]:</w:t>
+        <w:t>STATUS[1]:</w:t>
+      </w:r>
+      <w:r>
+        <w:t xml:space="preserve">  unused </w:t>
+      </w:r>
+    </w:p>
+    <w:p>
+      <w:pPr>
+        <w:rPr>
+          <w:b/>
+          <w:bCs/>
+        </w:rPr>
+      </w:pPr>
+      <w:r>
+        <w:rPr>
+          <w:b/>
+          <w:bCs/>
+        </w:rPr>
+        <w:t>STATUS[2]:</w:t>
+      </w:r>
+      <w:r>
+        <w:t xml:space="preserve">  if 1, event has some internal tag error, </w:t>
+      </w:r>
+      <w:proofErr w:type="spellStart"/>
+      <w:r>
+        <w:t>ie</w:t>
+      </w:r>
+      <w:proofErr w:type="spellEnd"/>
+      <w:r>
+        <w:t xml:space="preserve"> either one DIGI reported a TAG_SYNC error (TAG_SYNC is a signal</w:t>
+      </w:r>
+      <w:r>
+        <w:t xml:space="preserve"> sent from the ROC to the DIGI FPGA every 2*14=8192 tags</w:t>
+      </w:r>
+      <w:r>
+        <w:t>) or the ROC detected that the event tag reported by different DIGI SerDes lanes does not agree</w:t>
+      </w:r>
+    </w:p>
+    <w:p>
+      <w:r>
+        <w:rPr>
+          <w:b/>
+          <w:bCs/>
+        </w:rPr>
+        <w:lastRenderedPageBreak/>
+        <w:t>STATUS[3]:</w:t>
+      </w:r>
+      <w:r>
+        <w:t xml:space="preserve">  if 1, event has timed-out, meaning if could not reply to DTC Data Request within the time set by the “</w:t>
+      </w:r>
+      <w:proofErr w:type="spellStart"/>
+      <w:r>
+        <w:t>Event_Timeout</w:t>
+      </w:r>
+      <w:proofErr w:type="spellEnd"/>
+      <w:r>
+        <w:t xml:space="preserve">” registers 0x60 &amp; 0x61 (default 0xFFFF in </w:t>
+      </w:r>
+      <w:r>
+        <w:t>u</w:t>
+      </w:r>
+      <w:r>
+        <w:t>nits of 12.5 ns</w:t>
+      </w:r>
+      <w:r>
+        <w:t xml:space="preserve">, or 820 </w:t>
+      </w:r>
+      <w:r>
+        <w:rPr>
+          <w:rFonts w:ascii="Symbol" w:hAnsi="Symbol"/>
+        </w:rPr>
+        <w:t>m</w:t>
+      </w:r>
+      <w:r>
+        <w:t>s</w:t>
+      </w:r>
+      <w:r>
+        <w:t xml:space="preserve">) </w:t>
+      </w:r>
+    </w:p>
+    <w:p>
+      <w:pPr>
+        <w:rPr>
+          <w:b/>
+          <w:bCs/>
+        </w:rPr>
+      </w:pPr>
+      <w:r>
+        <w:rPr>
+          <w:b/>
+          <w:bCs/>
+        </w:rPr>
+        <w:t>STATUS[4]:</w:t>
+      </w:r>
+      <w:r>
+        <w:t xml:space="preserve">  if 1, event has an Overflow, </w:t>
+      </w:r>
+      <w:proofErr w:type="spellStart"/>
+      <w:r>
+        <w:t>ie</w:t>
+      </w:r>
+      <w:proofErr w:type="spellEnd"/>
+      <w:r>
+        <w:t xml:space="preserve"> it reports ONLY data from the </w:t>
+      </w:r>
+      <w:r>
+        <w:t xml:space="preserve">first 8kB sent by the DIGI for that event windows (corresponding to the </w:t>
+      </w:r>
+      <w:r>
+        <w:t xml:space="preserve">first 255 </w:t>
+      </w:r>
+      <w:r>
+        <w:t xml:space="preserve">hits </w:t>
+      </w:r>
+      <w:r>
+        <w:t>for a</w:t>
+      </w:r>
+      <w:r>
+        <w:t xml:space="preserve"> 256-bit</w:t>
+      </w:r>
+      <w:r>
+        <w:t xml:space="preserve"> bit</w:t>
+      </w:r>
+      <w:r>
+        <w:t>)</w:t>
+      </w:r>
+    </w:p>
+    <w:p>
+      <w:pPr>
+        <w:rPr>
+          <w:b/>
+          <w:bCs/>
+        </w:rPr>
+      </w:pPr>
+      <w:r>
+        <w:rPr>
+          <w:b/>
+          <w:bCs/>
+        </w:rPr>
+        <w:t>STATUS[5]:</w:t>
+      </w:r>
+      <w:r>
+        <w:t xml:space="preserve">  if 1, event has HB inconsistency error, </w:t>
+      </w:r>
+      <w:proofErr w:type="spellStart"/>
+      <w:r>
+        <w:t>ie</w:t>
+      </w:r>
+      <w:proofErr w:type="spellEnd"/>
+      <w:r>
+        <w:t xml:space="preserve"> the tag </w:t>
+      </w:r>
+      <w:r>
+        <w:t xml:space="preserve">contained in the DIGI data header does not agree with the tag passed </w:t>
+      </w:r>
+      <w:r>
+        <w:t xml:space="preserve">in the </w:t>
+      </w:r>
+      <w:proofErr w:type="spellStart"/>
+      <w:r>
+        <w:t>Heartbit</w:t>
+      </w:r>
+      <w:proofErr w:type="spellEnd"/>
+      <w:r>
+        <w:t xml:space="preserve"> packet </w:t>
+      </w:r>
+      <w:r>
+        <w:t>(and saved in the DDR header word)</w:t>
+      </w:r>
+    </w:p>
+    <w:p>
+      <w:pPr>
+        <w:rPr>
+          <w:b/>
+          <w:bCs/>
+        </w:rPr>
+      </w:pPr>
+      <w:r>
+        <w:rPr>
+          <w:b/>
+          <w:bCs/>
+        </w:rPr>
+        <w:t>STATUS[6]:</w:t>
       </w:r>
       <w:r>
         <w:t xml:space="preserve">  if 1, event has </w:t>
       </w:r>
       <w:r>
-        <w:t xml:space="preserve">some internal tag error, </w:t>
+        <w:t>DREQ</w:t>
+      </w:r>
+      <w:r>
+        <w:t xml:space="preserve"> inconsistency error, </w:t>
       </w:r>
       <w:proofErr w:type="spellStart"/>
       <w:r>
@@ -866,282 +1437,42 @@
       </w:r>
       <w:proofErr w:type="spellEnd"/>
       <w:r>
-        <w:t xml:space="preserve"> either one DIGI reported a TAG_SYNC error (TAG_SYNC is a signal</w:t>
-      </w:r>
-      <w:r>
-        <w:t xml:space="preserve"> sent from the ROC to the DIGI FPGA every 2*14=8192 tags</w:t>
-      </w:r>
-      <w:r>
-        <w:t>) or the ROC detected that the event tag reported by different DIGI SerDes lanes does not agree</w:t>
-      </w:r>
-    </w:p>
-    <w:p>
-      <w:r>
-        <w:rPr>
-          <w:b/>
-          <w:bCs/>
-        </w:rPr>
-        <w:t>STATUS[</w:t>
-      </w:r>
-      <w:r>
-        <w:rPr>
-          <w:b/>
-          <w:bCs/>
-        </w:rPr>
-        <w:t>3</w:t>
-      </w:r>
-      <w:r>
-        <w:rPr>
-          <w:b/>
-          <w:bCs/>
-        </w:rPr>
-        <w:t>]:</w:t>
-      </w:r>
-      <w:r>
-        <w:t xml:space="preserve">  if 1, event has </w:t>
-      </w:r>
-      <w:r>
-        <w:t>timed-out, meaning if could not reply to DTC Data Request within the time set by the “</w:t>
+        <w:t xml:space="preserve"> the tag passed in the </w:t>
+      </w:r>
+      <w:r>
+        <w:t>Data Request</w:t>
+      </w:r>
+      <w:r>
+        <w:t xml:space="preserve"> packet does not agree with the tag </w:t>
+      </w:r>
+      <w:r>
+        <w:t>saved for the event in the DDR header words</w:t>
+      </w:r>
+    </w:p>
+    <w:p>
+      <w:pPr>
+        <w:rPr>
+          <w:b/>
+          <w:bCs/>
+        </w:rPr>
+      </w:pPr>
+      <w:r>
+        <w:rPr>
+          <w:b/>
+          <w:bCs/>
+        </w:rPr>
+        <w:t>STATUS[7]:</w:t>
+      </w:r>
+      <w:r>
+        <w:t xml:space="preserve">  if 1, event has unexpected request type, </w:t>
       </w:r>
       <w:proofErr w:type="spellStart"/>
       <w:r>
-        <w:t>Event_Timeout</w:t>
+        <w:t>ie</w:t>
       </w:r>
       <w:proofErr w:type="spellEnd"/>
       <w:r>
-        <w:t xml:space="preserve">” registers 0x60 &amp; 0x61 (default 0xFFFF in </w:t>
-      </w:r>
-      <w:r>
-        <w:t>u</w:t>
-      </w:r>
-      <w:r>
-        <w:t>nits of 12.5 ns</w:t>
-      </w:r>
-      <w:r>
-        <w:t xml:space="preserve">, or 820 </w:t>
-      </w:r>
-      <w:r>
-        <w:rPr>
-          <w:rFonts w:ascii="Symbol" w:hAnsi="Symbol"/>
-        </w:rPr>
-        <w:t>m</w:t>
-      </w:r>
-      <w:r>
-        <w:t>s</w:t>
-      </w:r>
-      <w:r>
-        <w:t xml:space="preserve">) </w:t>
-      </w:r>
-    </w:p>
-    <w:p>
-      <w:pPr>
-        <w:rPr>
-          <w:b/>
-          <w:bCs/>
-        </w:rPr>
-      </w:pPr>
-      <w:r>
-        <w:rPr>
-          <w:b/>
-          <w:bCs/>
-        </w:rPr>
-        <w:t>STATUS[</w:t>
-      </w:r>
-      <w:r>
-        <w:rPr>
-          <w:b/>
-          <w:bCs/>
-        </w:rPr>
-        <w:t>4</w:t>
-      </w:r>
-      <w:r>
-        <w:rPr>
-          <w:b/>
-          <w:bCs/>
-        </w:rPr>
-        <w:t>]:</w:t>
-      </w:r>
-      <w:r>
-        <w:t xml:space="preserve">  if 1, event has </w:t>
-      </w:r>
-      <w:r>
-        <w:t xml:space="preserve">an Overflow, </w:t>
-      </w:r>
-      <w:proofErr w:type="spellStart"/>
-      <w:r>
-        <w:t>ie</w:t>
-      </w:r>
-      <w:proofErr w:type="spellEnd"/>
-      <w:r>
-        <w:t xml:space="preserve"> it reports ONLY data from the </w:t>
-      </w:r>
-      <w:r>
-        <w:t xml:space="preserve">first 8kB sent by the DIGI for that event windows (corresponding to the </w:t>
-      </w:r>
-      <w:r>
-        <w:t xml:space="preserve">first 255 </w:t>
-      </w:r>
-      <w:r>
-        <w:t xml:space="preserve">hits </w:t>
-      </w:r>
-      <w:r>
-        <w:t>for a</w:t>
-      </w:r>
-      <w:r>
-        <w:t xml:space="preserve"> 256-bit</w:t>
-      </w:r>
-      <w:r>
-        <w:t xml:space="preserve"> bit</w:t>
-      </w:r>
-      <w:r>
-        <w:t>)</w:t>
-      </w:r>
-    </w:p>
-    <w:p>
-      <w:pPr>
-        <w:rPr>
-          <w:b/>
-          <w:bCs/>
-        </w:rPr>
-      </w:pPr>
-      <w:r>
-        <w:rPr>
-          <w:b/>
-          <w:bCs/>
-        </w:rPr>
-        <w:t>STATUS[</w:t>
-      </w:r>
-      <w:r>
-        <w:rPr>
-          <w:b/>
-          <w:bCs/>
-        </w:rPr>
-        <w:t>5</w:t>
-      </w:r>
-      <w:r>
-        <w:rPr>
-          <w:b/>
-          <w:bCs/>
-        </w:rPr>
-        <w:t>]:</w:t>
-      </w:r>
-      <w:r>
-        <w:t xml:space="preserve">  if 1, event has </w:t>
-      </w:r>
-      <w:r>
-        <w:t xml:space="preserve">HB inconsistency error, </w:t>
-      </w:r>
-      <w:proofErr w:type="spellStart"/>
-      <w:r>
-        <w:t>ie</w:t>
-      </w:r>
-      <w:proofErr w:type="spellEnd"/>
-      <w:r>
-        <w:t xml:space="preserve"> the tag </w:t>
-      </w:r>
-      <w:r>
-        <w:t xml:space="preserve">contained in the DIGI data header does not agree with the tag passed </w:t>
-      </w:r>
-      <w:r>
-        <w:t xml:space="preserve">in the </w:t>
-      </w:r>
-      <w:proofErr w:type="spellStart"/>
-      <w:r>
-        <w:t>Heartbit</w:t>
-      </w:r>
-      <w:proofErr w:type="spellEnd"/>
-      <w:r>
-        <w:t xml:space="preserve"> packet </w:t>
-      </w:r>
-      <w:r>
-        <w:t>(and saved in the DDR header word)</w:t>
-      </w:r>
-    </w:p>
-    <w:p>
-      <w:pPr>
-        <w:rPr>
-          <w:b/>
-          <w:bCs/>
-        </w:rPr>
-      </w:pPr>
-      <w:r>
-        <w:rPr>
-          <w:b/>
-          <w:bCs/>
-        </w:rPr>
-        <w:t>STATUS[</w:t>
-      </w:r>
-      <w:r>
-        <w:rPr>
-          <w:b/>
-          <w:bCs/>
-        </w:rPr>
-        <w:t>6</w:t>
-      </w:r>
-      <w:r>
-        <w:rPr>
-          <w:b/>
-          <w:bCs/>
-        </w:rPr>
-        <w:t>]:</w:t>
-      </w:r>
-      <w:r>
-        <w:t xml:space="preserve">  if 1, event has </w:t>
-      </w:r>
-      <w:r>
-        <w:t>DREQ</w:t>
-      </w:r>
-      <w:r>
-        <w:t xml:space="preserve"> inconsistency error, </w:t>
-      </w:r>
-      <w:proofErr w:type="spellStart"/>
-      <w:r>
-        <w:t>ie</w:t>
-      </w:r>
-      <w:proofErr w:type="spellEnd"/>
-      <w:r>
-        <w:t xml:space="preserve"> the tag passed in the </w:t>
-      </w:r>
-      <w:r>
-        <w:t>Data Request</w:t>
-      </w:r>
-      <w:r>
-        <w:t xml:space="preserve"> packet does not agree with the tag </w:t>
-      </w:r>
-      <w:r>
-        <w:t>saved for the event in the DDR header words</w:t>
-      </w:r>
-    </w:p>
-    <w:p>
-      <w:pPr>
-        <w:rPr>
-          <w:b/>
-          <w:bCs/>
-        </w:rPr>
-      </w:pPr>
-      <w:r>
-        <w:rPr>
-          <w:b/>
-          <w:bCs/>
-        </w:rPr>
-        <w:t>STATUS[7]:</w:t>
-      </w:r>
-      <w:r>
-        <w:t xml:space="preserve">  if 1, event has </w:t>
-      </w:r>
-      <w:r>
-        <w:t xml:space="preserve">unexpected request type, </w:t>
-      </w:r>
-      <w:proofErr w:type="spellStart"/>
-      <w:r>
-        <w:t>ie</w:t>
-      </w:r>
-      <w:proofErr w:type="spellEnd"/>
-      <w:r>
-        <w:t xml:space="preserve"> neither 2 (Data Request) or 3 (Prefetch). This might indicate a fiber corruption.</w:t>
-      </w:r>
-      <w:r>
-        <w:t xml:space="preserve"> </w:t>
+        <w:t xml:space="preserve"> neither 2 (Data Request) or 3 (Prefetch). This might indicate a fiber corruption. </w:t>
       </w:r>
     </w:p>
     <w:p>
@@ -1161,7 +1492,7 @@
         </w:rPr>
       </w:pPr>
     </w:p>
-    <w:bookmarkStart w:id="3" w:name="remote_prog"/>
+    <w:bookmarkStart w:id="7" w:name="remote_prog"/>
     <w:p>
       <w:pPr>
         <w:rPr>
@@ -1201,7 +1532,7 @@
           <w:b/>
           <w:bCs/>
         </w:rPr>
-        <w:t>Remot</w:t>
+        <w:t>R</w:t>
       </w:r>
       <w:r>
         <w:rPr>
@@ -1209,7 +1540,7 @@
           <w:b/>
           <w:bCs/>
         </w:rPr>
-        <w:t>e</w:t>
+        <w:t>OC r</w:t>
       </w:r>
       <w:r>
         <w:rPr>
@@ -1217,25 +1548,9 @@
           <w:b/>
           <w:bCs/>
         </w:rPr>
-        <w:t xml:space="preserve"> progra</w:t>
-      </w:r>
-      <w:r>
-        <w:rPr>
-          <w:rStyle w:val="Hyperlink"/>
-          <w:b/>
-          <w:bCs/>
-        </w:rPr>
-        <w:t>m</w:t>
-      </w:r>
-      <w:r>
-        <w:rPr>
-          <w:rStyle w:val="Hyperlink"/>
-          <w:b/>
-          <w:bCs/>
-        </w:rPr>
-        <w:t>mability function</w:t>
-      </w:r>
-      <w:bookmarkEnd w:id="3"/>
+        <w:t>emote programmability function</w:t>
+      </w:r>
+      <w:bookmarkEnd w:id="7"/>
       <w:r>
         <w:rPr>
           <w:b/>
@@ -1647,7 +1962,6 @@
           <w:i/>
           <w:iCs/>
         </w:rPr>
-        <w:lastRenderedPageBreak/>
         <w:t>2</w:t>
       </w:r>
       <w:r>
@@ -1915,49 +2229,7 @@
         <w:rPr>
           <w:rFonts w:cstheme="minorHAnsi"/>
         </w:rPr>
-        <w:t xml:space="preserve">RETURN_STATUS </w:t>
-      </w:r>
-      <w:r>
-        <w:rPr>
-          <w:rFonts w:cstheme="minorHAnsi"/>
-        </w:rPr>
-        <w:t>= bit[15:0]</w:t>
-      </w:r>
-      <w:r>
-        <w:rPr>
-          <w:rFonts w:cstheme="minorHAnsi"/>
-        </w:rPr>
-        <w:t xml:space="preserve"> </w:t>
-      </w:r>
-      <w:r>
-        <w:rPr>
-          <w:rFonts w:cstheme="minorHAnsi"/>
-        </w:rPr>
-        <w:t xml:space="preserve">of </w:t>
-      </w:r>
-      <w:r>
-        <w:rPr>
-          <w:rFonts w:cstheme="minorHAnsi"/>
-        </w:rPr>
-        <w:t>register 132</w:t>
-      </w:r>
-      <w:r>
-        <w:rPr>
-          <w:rFonts w:cstheme="minorHAnsi"/>
-        </w:rPr>
-        <w:t xml:space="preserve">: </w:t>
-      </w:r>
-      <w:r>
-        <w:rPr>
-          <w:rFonts w:cstheme="minorHAnsi"/>
-        </w:rPr>
-        <w:t xml:space="preserve"> read status returned by programming function</w:t>
-      </w:r>
-      <w:r>
-        <w:rPr>
-          <w:rFonts w:cstheme="minorHAnsi"/>
-        </w:rPr>
-        <w:t xml:space="preserve">. </w:t>
+        <w:t xml:space="preserve">RETURN_STATUS = bit[15:0] of register 132:  read status returned by programming function. </w:t>
       </w:r>
       <w:r>
         <w:rPr>
@@ -2000,7 +2272,7 @@
         </w:rPr>
       </w:pPr>
     </w:p>
-    <w:bookmarkStart w:id="4" w:name="timeout"/>
+    <w:bookmarkStart w:id="8" w:name="timeout"/>
     <w:p>
       <w:r>
         <w:rPr>
@@ -2045,7 +2317,7 @@
         </w:rPr>
         <w:t>t</w:t>
       </w:r>
-      <w:bookmarkEnd w:id="4"/>
+      <w:bookmarkEnd w:id="8"/>
       <w:r>
         <w:rPr>
           <w:b/>
@@ -2096,7 +2368,11 @@
         <w:t xml:space="preserve"> the time from the DREQ being received</w:t>
       </w:r>
       <w:r>
-        <w:t xml:space="preserve"> and the data </w:t>
+        <w:t xml:space="preserve"> and </w:t>
+      </w:r>
+      <w:r>
+        <w:lastRenderedPageBreak/>
+        <w:t xml:space="preserve">the data </w:t>
       </w:r>
       <w:r>
         <w:t>being fully read from</w:t>
@@ -2229,7 +2505,7 @@
     </w:p>
     <w:p/>
     <w:p/>
-    <w:bookmarkStart w:id="5" w:name="ddr_dump"/>
+    <w:bookmarkStart w:id="9" w:name="ddr_dump"/>
     <w:p>
       <w:pPr>
         <w:rPr>
@@ -2272,7 +2548,7 @@
         </w:rPr>
         <w:t>DDR Dump</w:t>
       </w:r>
-      <w:bookmarkEnd w:id="5"/>
+      <w:bookmarkEnd w:id="9"/>
       <w:r>
         <w:rPr>
           <w:b/>
@@ -2531,7 +2807,6 @@
         </w:rPr>
       </w:pPr>
       <w:r>
-        <w:lastRenderedPageBreak/>
         <w:t xml:space="preserve">Set MEM_OFFSET </w:t>
       </w:r>
       <w:r>
@@ -2892,7 +3167,15 @@
           <w:b/>
           <w:bCs/>
         </w:rPr>
-        <w:t xml:space="preserve"> the first 1kB block MEM_OFFSET) of </w:t>
+        <w:t xml:space="preserve"> the first 1kB block </w:t>
+      </w:r>
+      <w:r>
+        <w:rPr>
+          <w:b/>
+          <w:bCs/>
+        </w:rPr>
+        <w:lastRenderedPageBreak/>
+        <w:t xml:space="preserve">MEM_OFFSET) of </w:t>
       </w:r>
       <w:r>
         <w:rPr>
@@ -3255,10 +3538,7 @@
         <w:t>error</w:t>
       </w:r>
       <w:r>
-        <w:t xml:space="preserve"> (set to 1 if </w:t>
-      </w:r>
-      <w:r>
-        <w:t xml:space="preserve">tag passed by the DTC in the </w:t>
+        <w:t xml:space="preserve"> (set to 1 if tag passed by the DTC in the </w:t>
       </w:r>
       <w:proofErr w:type="spellStart"/>
       <w:r>
@@ -3266,10 +3546,7 @@
       </w:r>
       <w:proofErr w:type="spellEnd"/>
       <w:r>
-        <w:t xml:space="preserve"> DOES NOT agree with the local tag  reported by the DIGI data)</w:t>
-      </w:r>
-      <w:r>
-        <w:t xml:space="preserve"> </w:t>
+        <w:t xml:space="preserve"> DOES NOT agree with the local tag  reported by the DIGI data) </w:t>
       </w:r>
     </w:p>
     <w:p>
@@ -4062,7 +4339,11 @@
         <w:t xml:space="preserve">. The event will </w:t>
       </w:r>
       <w:r>
-        <w:t xml:space="preserve">contain 96x4=384(0x180) 64-bit words and </w:t>
+        <w:t xml:space="preserve">contain </w:t>
+      </w:r>
+      <w:r>
+        <w:lastRenderedPageBreak/>
+        <w:t xml:space="preserve">96x4=384(0x180) 64-bit words and </w:t>
       </w:r>
       <w:r>
         <w:t xml:space="preserve">spread over four blocks. </w:t>
@@ -4377,7 +4658,7 @@
       </w:r>
     </w:p>
     <w:p/>
-    <w:bookmarkStart w:id="6" w:name="RS485"/>
+    <w:bookmarkStart w:id="10" w:name="RS485"/>
     <w:p>
       <w:pPr>
         <w:rPr>
@@ -4428,7 +4709,7 @@
         </w:rPr>
         <w:t>485 Interface</w:t>
       </w:r>
-      <w:bookmarkEnd w:id="6"/>
+      <w:bookmarkEnd w:id="10"/>
       <w:r>
         <w:rPr>
           <w:b/>
@@ -4467,340 +4748,334 @@
         <w:rPr>
           <w:rFonts w:cstheme="minorHAnsi"/>
         </w:rPr>
-        <w:t xml:space="preserve">It uses balanced differential pair data transmission lines to provide a robust and </w:t>
-      </w:r>
-      <w:r>
-        <w:rPr>
-          <w:rFonts w:cstheme="minorHAnsi"/>
+        <w:t xml:space="preserve">It uses balanced differential pair data transmission lines to provide a robust and noise-immune communication. It is meant to be the last-resort path between the DRAC and the outside world in case the fiber is not responding. </w:t>
+      </w:r>
+    </w:p>
+    <w:p>
+      <w:pPr>
+        <w:rPr>
+          <w:rFonts w:cstheme="minorHAnsi"/>
+        </w:rPr>
+      </w:pPr>
+    </w:p>
+    <w:p>
+      <w:pPr>
+        <w:rPr>
+          <w:rFonts w:cstheme="minorHAnsi"/>
+        </w:rPr>
+      </w:pPr>
+      <w:r>
+        <w:rPr>
+          <w:rFonts w:cstheme="minorHAnsi"/>
+        </w:rPr>
+        <w:t>In case of the Mu2e tracker readout, it</w:t>
+      </w:r>
+      <w:r>
+        <w:rPr>
+          <w:rFonts w:cstheme="minorHAnsi"/>
+        </w:rPr>
+        <w:t xml:space="preserve"> </w:t>
+      </w:r>
+      <w:r>
+        <w:rPr>
+          <w:rFonts w:cstheme="minorHAnsi"/>
+        </w:rPr>
+        <w:t xml:space="preserve">is </w:t>
+      </w:r>
+      <w:r>
+        <w:rPr>
+          <w:rFonts w:cstheme="minorHAnsi"/>
+        </w:rPr>
+        <w:t>implemented via a 8-wire flat ribbon cable</w:t>
+      </w:r>
+      <w:r>
+        <w:rPr>
+          <w:rFonts w:cstheme="minorHAnsi"/>
+        </w:rPr>
+        <w:t xml:space="preserve"> connecting a dedicated header on the key board for up to 12 DRAC modules</w:t>
+      </w:r>
+      <w:r>
+        <w:rPr>
+          <w:rFonts w:cstheme="minorHAnsi"/>
+        </w:rPr>
+        <w:t xml:space="preserve"> in a daisy-chain fashion</w:t>
+      </w:r>
+      <w:r>
+        <w:rPr>
+          <w:rFonts w:cstheme="minorHAnsi"/>
+        </w:rPr>
+        <w:t xml:space="preserve">. </w:t>
+      </w:r>
+      <w:r>
+        <w:rPr>
+          <w:rFonts w:cstheme="minorHAnsi"/>
+        </w:rPr>
+        <w:t xml:space="preserve">Each DRAC in the chain respond to a unique 9-bit address, which can be set via a dedicated serial register or read from the </w:t>
+      </w:r>
+      <w:proofErr w:type="spellStart"/>
+      <w:r>
+        <w:rPr>
+          <w:rFonts w:cstheme="minorHAnsi"/>
+        </w:rPr>
+        <w:t>sN</w:t>
+      </w:r>
+      <w:r>
+        <w:rPr>
+          <w:rFonts w:cstheme="minorHAnsi"/>
+        </w:rPr>
+        <w:t>VM</w:t>
+      </w:r>
+      <w:proofErr w:type="spellEnd"/>
+      <w:r>
+        <w:rPr>
+          <w:rFonts w:cstheme="minorHAnsi"/>
+        </w:rPr>
+        <w:t xml:space="preserve">. </w:t>
+      </w:r>
+      <w:r>
+        <w:rPr>
+          <w:rFonts w:cstheme="minorHAnsi"/>
+        </w:rPr>
+        <w:t xml:space="preserve">The last DRAC in the chain is connected to the computer via a serial cable. </w:t>
+      </w:r>
+    </w:p>
+    <w:p>
+      <w:pPr>
+        <w:pStyle w:val="HTMLPreformatted"/>
+        <w:rPr>
+          <w:rFonts w:asciiTheme="minorHAnsi" w:hAnsiTheme="minorHAnsi" w:cstheme="minorHAnsi"/>
+          <w:sz w:val="24"/>
+          <w:szCs w:val="24"/>
+        </w:rPr>
+      </w:pPr>
+    </w:p>
+    <w:p>
+      <w:pPr>
+        <w:pStyle w:val="HTMLPreformatted"/>
+        <w:rPr>
+          <w:rFonts w:asciiTheme="minorHAnsi" w:hAnsiTheme="minorHAnsi" w:cstheme="minorHAnsi"/>
+          <w:sz w:val="24"/>
+          <w:szCs w:val="24"/>
+        </w:rPr>
+      </w:pPr>
+      <w:r>
+        <w:rPr>
+          <w:rFonts w:asciiTheme="minorHAnsi" w:hAnsiTheme="minorHAnsi" w:cstheme="minorHAnsi"/>
+          <w:sz w:val="24"/>
+          <w:szCs w:val="24"/>
+        </w:rPr>
+        <w:t>T</w:t>
+      </w:r>
+      <w:r>
+        <w:rPr>
+          <w:rFonts w:asciiTheme="minorHAnsi" w:hAnsiTheme="minorHAnsi" w:cstheme="minorHAnsi"/>
+          <w:sz w:val="24"/>
+          <w:szCs w:val="24"/>
+        </w:rPr>
+        <w:t xml:space="preserve">he protocol </w:t>
+      </w:r>
+      <w:r>
+        <w:rPr>
+          <w:rFonts w:asciiTheme="minorHAnsi" w:hAnsiTheme="minorHAnsi" w:cstheme="minorHAnsi"/>
+          <w:sz w:val="24"/>
+          <w:szCs w:val="24"/>
+        </w:rPr>
+        <w:t>used</w:t>
+      </w:r>
+      <w:r>
+        <w:rPr>
+          <w:rFonts w:asciiTheme="minorHAnsi" w:hAnsiTheme="minorHAnsi" w:cstheme="minorHAnsi"/>
+          <w:sz w:val="24"/>
+          <w:szCs w:val="24"/>
+        </w:rPr>
+        <w:t xml:space="preserve"> for </w:t>
+      </w:r>
+      <w:r>
+        <w:rPr>
+          <w:rFonts w:asciiTheme="minorHAnsi" w:hAnsiTheme="minorHAnsi" w:cstheme="minorHAnsi"/>
+          <w:sz w:val="24"/>
+          <w:szCs w:val="24"/>
+        </w:rPr>
+        <w:t>the tracker-to-outside world communication expects</w:t>
+      </w:r>
+      <w:r>
+        <w:rPr>
+          <w:rFonts w:asciiTheme="minorHAnsi" w:hAnsiTheme="minorHAnsi" w:cstheme="minorHAnsi"/>
+          <w:sz w:val="24"/>
+          <w:szCs w:val="24"/>
+        </w:rPr>
+        <w:t xml:space="preserve"> the master </w:t>
+      </w:r>
+      <w:r>
+        <w:rPr>
+          <w:rFonts w:asciiTheme="minorHAnsi" w:hAnsiTheme="minorHAnsi" w:cstheme="minorHAnsi"/>
+          <w:sz w:val="24"/>
+          <w:szCs w:val="24"/>
+        </w:rPr>
+        <w:t>to</w:t>
+      </w:r>
+      <w:r>
+        <w:rPr>
+          <w:rFonts w:asciiTheme="minorHAnsi" w:hAnsiTheme="minorHAnsi" w:cstheme="minorHAnsi"/>
+          <w:sz w:val="24"/>
+          <w:szCs w:val="24"/>
+        </w:rPr>
+        <w:t xml:space="preserve"> send and receive </w:t>
+      </w:r>
+      <w:r>
+        <w:rPr>
+          <w:rFonts w:asciiTheme="minorHAnsi" w:hAnsiTheme="minorHAnsi" w:cstheme="minorHAnsi"/>
+          <w:sz w:val="24"/>
+          <w:szCs w:val="24"/>
+          <w:u w:val="single"/>
+        </w:rPr>
+        <w:t>3 bytes</w:t>
+      </w:r>
+      <w:r>
+        <w:rPr>
+          <w:rFonts w:asciiTheme="minorHAnsi" w:hAnsiTheme="minorHAnsi" w:cstheme="minorHAnsi"/>
+          <w:sz w:val="24"/>
+          <w:szCs w:val="24"/>
+        </w:rPr>
+        <w:t>. T</w:t>
+      </w:r>
+      <w:r>
+        <w:rPr>
+          <w:rFonts w:asciiTheme="minorHAnsi" w:hAnsiTheme="minorHAnsi" w:cstheme="minorHAnsi"/>
+          <w:sz w:val="24"/>
+          <w:szCs w:val="24"/>
+        </w:rPr>
+        <w:t>he ROC firmware (slave)</w:t>
+      </w:r>
+      <w:r>
+        <w:rPr>
+          <w:rFonts w:asciiTheme="minorHAnsi" w:hAnsiTheme="minorHAnsi" w:cstheme="minorHAnsi"/>
+          <w:sz w:val="24"/>
+          <w:szCs w:val="24"/>
+        </w:rPr>
+        <w:t xml:space="preserve"> receives and sends data via a  dedicated</w:t>
+      </w:r>
+      <w:r>
+        <w:rPr>
+          <w:rFonts w:asciiTheme="minorHAnsi" w:hAnsiTheme="minorHAnsi" w:cstheme="minorHAnsi"/>
+          <w:sz w:val="24"/>
+          <w:szCs w:val="24"/>
+        </w:rPr>
+        <w:t xml:space="preserve"> R</w:t>
+      </w:r>
+      <w:r>
+        <w:rPr>
+          <w:rFonts w:asciiTheme="minorHAnsi" w:hAnsiTheme="minorHAnsi" w:cstheme="minorHAnsi"/>
+          <w:sz w:val="24"/>
+          <w:szCs w:val="24"/>
+        </w:rPr>
+        <w:t xml:space="preserve">S485_RX </w:t>
+      </w:r>
+      <w:r>
+        <w:rPr>
+          <w:rFonts w:asciiTheme="minorHAnsi" w:hAnsiTheme="minorHAnsi" w:cstheme="minorHAnsi"/>
+          <w:sz w:val="24"/>
+          <w:szCs w:val="24"/>
+        </w:rPr>
+        <w:t xml:space="preserve">input </w:t>
+      </w:r>
+      <w:r>
+        <w:rPr>
+          <w:rFonts w:asciiTheme="minorHAnsi" w:hAnsiTheme="minorHAnsi" w:cstheme="minorHAnsi"/>
+          <w:sz w:val="24"/>
+          <w:szCs w:val="24"/>
+        </w:rPr>
+        <w:t xml:space="preserve">pin </w:t>
+      </w:r>
+      <w:r>
+        <w:rPr>
+          <w:rFonts w:asciiTheme="minorHAnsi" w:hAnsiTheme="minorHAnsi" w:cstheme="minorHAnsi"/>
+          <w:sz w:val="24"/>
+          <w:szCs w:val="24"/>
+        </w:rPr>
+        <w:t xml:space="preserve">and </w:t>
+      </w:r>
+      <w:r>
+        <w:rPr>
+          <w:rFonts w:asciiTheme="minorHAnsi" w:hAnsiTheme="minorHAnsi" w:cstheme="minorHAnsi"/>
+          <w:sz w:val="24"/>
+          <w:szCs w:val="24"/>
+        </w:rPr>
+        <w:t>RS485_</w:t>
+      </w:r>
+      <w:r>
+        <w:rPr>
+          <w:rFonts w:asciiTheme="minorHAnsi" w:hAnsiTheme="minorHAnsi" w:cstheme="minorHAnsi"/>
+          <w:sz w:val="24"/>
+          <w:szCs w:val="24"/>
+        </w:rPr>
+        <w:t>TX output</w:t>
+      </w:r>
+      <w:r>
+        <w:rPr>
+          <w:rFonts w:asciiTheme="minorHAnsi" w:hAnsiTheme="minorHAnsi" w:cstheme="minorHAnsi"/>
+          <w:sz w:val="24"/>
+          <w:szCs w:val="24"/>
+        </w:rPr>
+        <w:t xml:space="preserve"> pin</w:t>
+      </w:r>
+      <w:r>
+        <w:rPr>
+          <w:rFonts w:asciiTheme="minorHAnsi" w:hAnsiTheme="minorHAnsi" w:cstheme="minorHAnsi"/>
+          <w:sz w:val="24"/>
+          <w:szCs w:val="24"/>
+        </w:rPr>
+        <w:t xml:space="preserve">. </w:t>
+      </w:r>
+      <w:r>
+        <w:rPr>
+          <w:rFonts w:asciiTheme="minorHAnsi" w:hAnsiTheme="minorHAnsi" w:cstheme="minorHAnsi"/>
+          <w:sz w:val="24"/>
+          <w:szCs w:val="24"/>
+        </w:rPr>
+        <w:t>Th</w:t>
+      </w:r>
+      <w:r>
+        <w:rPr>
+          <w:rFonts w:asciiTheme="minorHAnsi" w:hAnsiTheme="minorHAnsi" w:cstheme="minorHAnsi"/>
+          <w:sz w:val="24"/>
+          <w:szCs w:val="24"/>
+        </w:rPr>
+        <w:t>ese</w:t>
+      </w:r>
+      <w:r>
+        <w:rPr>
+          <w:rFonts w:asciiTheme="minorHAnsi" w:hAnsiTheme="minorHAnsi" w:cstheme="minorHAnsi"/>
+          <w:sz w:val="24"/>
+          <w:szCs w:val="24"/>
+        </w:rPr>
+        <w:t xml:space="preserve"> signals are </w:t>
+      </w:r>
+      <w:r>
+        <w:rPr>
+          <w:rFonts w:asciiTheme="minorHAnsi" w:hAnsiTheme="minorHAnsi" w:cstheme="minorHAnsi"/>
+          <w:sz w:val="24"/>
+          <w:szCs w:val="24"/>
+        </w:rPr>
+        <w:t>handled by the RS485Register VHDL module instantiated inside the SLOWCONTROLS block, which interfaces</w:t>
+      </w:r>
+    </w:p>
+    <w:p>
+      <w:pPr>
+        <w:pStyle w:val="HTMLPreformatted"/>
+        <w:rPr>
+          <w:rFonts w:asciiTheme="minorHAnsi" w:hAnsiTheme="minorHAnsi" w:cstheme="minorHAnsi"/>
+          <w:sz w:val="24"/>
+          <w:szCs w:val="24"/>
+        </w:rPr>
+      </w:pPr>
+      <w:r>
+        <w:rPr>
+          <w:rFonts w:asciiTheme="minorHAnsi" w:hAnsiTheme="minorHAnsi" w:cstheme="minorHAnsi"/>
+          <w:sz w:val="24"/>
+          <w:szCs w:val="24"/>
         </w:rPr>
         <w:lastRenderedPageBreak/>
-        <w:t xml:space="preserve">noise-immune communication. It is meant to be the last-resort path between the DRAC and the outside world in case the fiber is not responding. </w:t>
-      </w:r>
-    </w:p>
-    <w:p>
-      <w:pPr>
-        <w:rPr>
-          <w:rFonts w:cstheme="minorHAnsi"/>
-        </w:rPr>
-      </w:pPr>
-    </w:p>
-    <w:p>
-      <w:pPr>
-        <w:rPr>
-          <w:rFonts w:cstheme="minorHAnsi"/>
-        </w:rPr>
-      </w:pPr>
-      <w:r>
-        <w:rPr>
-          <w:rFonts w:cstheme="minorHAnsi"/>
-        </w:rPr>
-        <w:t>In case of the Mu2e tracker readout, it</w:t>
-      </w:r>
-      <w:r>
-        <w:rPr>
-          <w:rFonts w:cstheme="minorHAnsi"/>
-        </w:rPr>
-        <w:t xml:space="preserve"> </w:t>
-      </w:r>
-      <w:r>
-        <w:rPr>
-          <w:rFonts w:cstheme="minorHAnsi"/>
-        </w:rPr>
-        <w:t xml:space="preserve">is </w:t>
-      </w:r>
-      <w:r>
-        <w:rPr>
-          <w:rFonts w:cstheme="minorHAnsi"/>
-        </w:rPr>
-        <w:t>implemented via a 8-wire flat ribbon cable</w:t>
-      </w:r>
-      <w:r>
-        <w:rPr>
-          <w:rFonts w:cstheme="minorHAnsi"/>
-        </w:rPr>
-        <w:t xml:space="preserve"> connecting a dedicated header on the key board for up to 12 DRAC modules</w:t>
-      </w:r>
-      <w:r>
-        <w:rPr>
-          <w:rFonts w:cstheme="minorHAnsi"/>
-        </w:rPr>
-        <w:t xml:space="preserve"> in a daisy-chain fashion</w:t>
-      </w:r>
-      <w:r>
-        <w:rPr>
-          <w:rFonts w:cstheme="minorHAnsi"/>
-        </w:rPr>
-        <w:t xml:space="preserve">. </w:t>
-      </w:r>
-      <w:r>
-        <w:rPr>
-          <w:rFonts w:cstheme="minorHAnsi"/>
-        </w:rPr>
-        <w:t xml:space="preserve">Each DRAC in the chain respond to a unique 9-bit address, which can be set via a dedicated serial register or read from the </w:t>
-      </w:r>
-      <w:proofErr w:type="spellStart"/>
-      <w:r>
-        <w:rPr>
-          <w:rFonts w:cstheme="minorHAnsi"/>
-        </w:rPr>
-        <w:t>sN</w:t>
-      </w:r>
-      <w:r>
-        <w:rPr>
-          <w:rFonts w:cstheme="minorHAnsi"/>
-        </w:rPr>
-        <w:t>VM</w:t>
-      </w:r>
-      <w:proofErr w:type="spellEnd"/>
-      <w:r>
-        <w:rPr>
-          <w:rFonts w:cstheme="minorHAnsi"/>
-        </w:rPr>
-        <w:t xml:space="preserve">. </w:t>
-      </w:r>
-      <w:r>
-        <w:rPr>
-          <w:rFonts w:cstheme="minorHAnsi"/>
-        </w:rPr>
-        <w:t xml:space="preserve">The last DRAC in the chain is connected to the computer via a serial cable. </w:t>
-      </w:r>
-    </w:p>
-    <w:p>
-      <w:pPr>
-        <w:pStyle w:val="HTMLPreformatted"/>
-        <w:rPr>
-          <w:rFonts w:asciiTheme="minorHAnsi" w:hAnsiTheme="minorHAnsi" w:cstheme="minorHAnsi"/>
-          <w:sz w:val="24"/>
-          <w:szCs w:val="24"/>
-        </w:rPr>
-      </w:pPr>
-    </w:p>
-    <w:p>
-      <w:pPr>
-        <w:pStyle w:val="HTMLPreformatted"/>
-        <w:rPr>
-          <w:rFonts w:asciiTheme="minorHAnsi" w:hAnsiTheme="minorHAnsi" w:cstheme="minorHAnsi"/>
-          <w:sz w:val="24"/>
-          <w:szCs w:val="24"/>
-        </w:rPr>
-      </w:pPr>
-      <w:r>
-        <w:rPr>
-          <w:rFonts w:asciiTheme="minorHAnsi" w:hAnsiTheme="minorHAnsi" w:cstheme="minorHAnsi"/>
-          <w:sz w:val="24"/>
-          <w:szCs w:val="24"/>
-        </w:rPr>
-        <w:t>T</w:t>
-      </w:r>
-      <w:r>
-        <w:rPr>
-          <w:rFonts w:asciiTheme="minorHAnsi" w:hAnsiTheme="minorHAnsi" w:cstheme="minorHAnsi"/>
-          <w:sz w:val="24"/>
-          <w:szCs w:val="24"/>
-        </w:rPr>
-        <w:t xml:space="preserve">he protocol </w:t>
-      </w:r>
-      <w:r>
-        <w:rPr>
-          <w:rFonts w:asciiTheme="minorHAnsi" w:hAnsiTheme="minorHAnsi" w:cstheme="minorHAnsi"/>
-          <w:sz w:val="24"/>
-          <w:szCs w:val="24"/>
-        </w:rPr>
-        <w:t>used</w:t>
-      </w:r>
-      <w:r>
-        <w:rPr>
-          <w:rFonts w:asciiTheme="minorHAnsi" w:hAnsiTheme="minorHAnsi" w:cstheme="minorHAnsi"/>
-          <w:sz w:val="24"/>
-          <w:szCs w:val="24"/>
-        </w:rPr>
-        <w:t xml:space="preserve"> for </w:t>
-      </w:r>
-      <w:r>
-        <w:rPr>
-          <w:rFonts w:asciiTheme="minorHAnsi" w:hAnsiTheme="minorHAnsi" w:cstheme="minorHAnsi"/>
-          <w:sz w:val="24"/>
-          <w:szCs w:val="24"/>
-        </w:rPr>
-        <w:t>the tracker-to-outside world communication expects</w:t>
-      </w:r>
-      <w:r>
-        <w:rPr>
-          <w:rFonts w:asciiTheme="minorHAnsi" w:hAnsiTheme="minorHAnsi" w:cstheme="minorHAnsi"/>
-          <w:sz w:val="24"/>
-          <w:szCs w:val="24"/>
-        </w:rPr>
-        <w:t xml:space="preserve"> the master </w:t>
-      </w:r>
-      <w:r>
-        <w:rPr>
-          <w:rFonts w:asciiTheme="minorHAnsi" w:hAnsiTheme="minorHAnsi" w:cstheme="minorHAnsi"/>
-          <w:sz w:val="24"/>
-          <w:szCs w:val="24"/>
-        </w:rPr>
-        <w:t>to</w:t>
-      </w:r>
-      <w:r>
-        <w:rPr>
-          <w:rFonts w:asciiTheme="minorHAnsi" w:hAnsiTheme="minorHAnsi" w:cstheme="minorHAnsi"/>
-          <w:sz w:val="24"/>
-          <w:szCs w:val="24"/>
-        </w:rPr>
-        <w:t xml:space="preserve"> send and receive </w:t>
-      </w:r>
-      <w:r>
-        <w:rPr>
-          <w:rFonts w:asciiTheme="minorHAnsi" w:hAnsiTheme="minorHAnsi" w:cstheme="minorHAnsi"/>
-          <w:sz w:val="24"/>
-          <w:szCs w:val="24"/>
-          <w:u w:val="single"/>
-        </w:rPr>
-        <w:t>3 bytes</w:t>
-      </w:r>
-      <w:r>
-        <w:rPr>
-          <w:rFonts w:asciiTheme="minorHAnsi" w:hAnsiTheme="minorHAnsi" w:cstheme="minorHAnsi"/>
-          <w:sz w:val="24"/>
-          <w:szCs w:val="24"/>
-        </w:rPr>
-        <w:t>. T</w:t>
-      </w:r>
-      <w:r>
-        <w:rPr>
-          <w:rFonts w:asciiTheme="minorHAnsi" w:hAnsiTheme="minorHAnsi" w:cstheme="minorHAnsi"/>
-          <w:sz w:val="24"/>
-          <w:szCs w:val="24"/>
-        </w:rPr>
-        <w:t>he ROC firmware (slave)</w:t>
-      </w:r>
-      <w:r>
-        <w:rPr>
-          <w:rFonts w:asciiTheme="minorHAnsi" w:hAnsiTheme="minorHAnsi" w:cstheme="minorHAnsi"/>
-          <w:sz w:val="24"/>
-          <w:szCs w:val="24"/>
-        </w:rPr>
-        <w:t xml:space="preserve"> receives and sends data via a  dedicated</w:t>
-      </w:r>
-      <w:r>
-        <w:rPr>
-          <w:rFonts w:asciiTheme="minorHAnsi" w:hAnsiTheme="minorHAnsi" w:cstheme="minorHAnsi"/>
-          <w:sz w:val="24"/>
-          <w:szCs w:val="24"/>
-        </w:rPr>
-        <w:t xml:space="preserve"> R</w:t>
-      </w:r>
-      <w:r>
-        <w:rPr>
-          <w:rFonts w:asciiTheme="minorHAnsi" w:hAnsiTheme="minorHAnsi" w:cstheme="minorHAnsi"/>
-          <w:sz w:val="24"/>
-          <w:szCs w:val="24"/>
-        </w:rPr>
-        <w:t xml:space="preserve">S485_RX </w:t>
-      </w:r>
-      <w:r>
-        <w:rPr>
-          <w:rFonts w:asciiTheme="minorHAnsi" w:hAnsiTheme="minorHAnsi" w:cstheme="minorHAnsi"/>
-          <w:sz w:val="24"/>
-          <w:szCs w:val="24"/>
-        </w:rPr>
-        <w:t xml:space="preserve">input </w:t>
-      </w:r>
-      <w:r>
-        <w:rPr>
-          <w:rFonts w:asciiTheme="minorHAnsi" w:hAnsiTheme="minorHAnsi" w:cstheme="minorHAnsi"/>
-          <w:sz w:val="24"/>
-          <w:szCs w:val="24"/>
-        </w:rPr>
-        <w:t xml:space="preserve">pin </w:t>
-      </w:r>
-      <w:r>
-        <w:rPr>
-          <w:rFonts w:asciiTheme="minorHAnsi" w:hAnsiTheme="minorHAnsi" w:cstheme="minorHAnsi"/>
-          <w:sz w:val="24"/>
-          <w:szCs w:val="24"/>
-        </w:rPr>
-        <w:t xml:space="preserve">and </w:t>
-      </w:r>
-      <w:r>
-        <w:rPr>
-          <w:rFonts w:asciiTheme="minorHAnsi" w:hAnsiTheme="minorHAnsi" w:cstheme="minorHAnsi"/>
-          <w:sz w:val="24"/>
-          <w:szCs w:val="24"/>
-        </w:rPr>
-        <w:t>RS485_</w:t>
-      </w:r>
-      <w:r>
-        <w:rPr>
-          <w:rFonts w:asciiTheme="minorHAnsi" w:hAnsiTheme="minorHAnsi" w:cstheme="minorHAnsi"/>
-          <w:sz w:val="24"/>
-          <w:szCs w:val="24"/>
-        </w:rPr>
-        <w:t>TX output</w:t>
-      </w:r>
-      <w:r>
-        <w:rPr>
-          <w:rFonts w:asciiTheme="minorHAnsi" w:hAnsiTheme="minorHAnsi" w:cstheme="minorHAnsi"/>
-          <w:sz w:val="24"/>
-          <w:szCs w:val="24"/>
-        </w:rPr>
-        <w:t xml:space="preserve"> pin</w:t>
-      </w:r>
-      <w:r>
-        <w:rPr>
-          <w:rFonts w:asciiTheme="minorHAnsi" w:hAnsiTheme="minorHAnsi" w:cstheme="minorHAnsi"/>
-          <w:sz w:val="24"/>
-          <w:szCs w:val="24"/>
-        </w:rPr>
-        <w:t xml:space="preserve">. </w:t>
-      </w:r>
-      <w:r>
-        <w:rPr>
-          <w:rFonts w:asciiTheme="minorHAnsi" w:hAnsiTheme="minorHAnsi" w:cstheme="minorHAnsi"/>
-          <w:sz w:val="24"/>
-          <w:szCs w:val="24"/>
-        </w:rPr>
-        <w:t>Th</w:t>
-      </w:r>
-      <w:r>
-        <w:rPr>
-          <w:rFonts w:asciiTheme="minorHAnsi" w:hAnsiTheme="minorHAnsi" w:cstheme="minorHAnsi"/>
-          <w:sz w:val="24"/>
-          <w:szCs w:val="24"/>
-        </w:rPr>
-        <w:t>ese</w:t>
-      </w:r>
-      <w:r>
-        <w:rPr>
-          <w:rFonts w:asciiTheme="minorHAnsi" w:hAnsiTheme="minorHAnsi" w:cstheme="minorHAnsi"/>
-          <w:sz w:val="24"/>
-          <w:szCs w:val="24"/>
-        </w:rPr>
-        <w:t xml:space="preserve"> signals are </w:t>
-      </w:r>
-      <w:r>
-        <w:rPr>
-          <w:rFonts w:asciiTheme="minorHAnsi" w:hAnsiTheme="minorHAnsi" w:cstheme="minorHAnsi"/>
-          <w:sz w:val="24"/>
-          <w:szCs w:val="24"/>
-        </w:rPr>
-        <w:t>handled by the RS485Register VHDL module instantiated inside the SLOWCONTROLS block, which interfaces</w:t>
-      </w:r>
-    </w:p>
-    <w:p>
-      <w:pPr>
-        <w:pStyle w:val="HTMLPreformatted"/>
-        <w:rPr>
-          <w:rFonts w:asciiTheme="minorHAnsi" w:hAnsiTheme="minorHAnsi" w:cstheme="minorHAnsi"/>
-          <w:sz w:val="24"/>
-          <w:szCs w:val="24"/>
-        </w:rPr>
-      </w:pPr>
-      <w:r>
-        <w:rPr>
-          <w:rFonts w:asciiTheme="minorHAnsi" w:hAnsiTheme="minorHAnsi" w:cstheme="minorHAnsi"/>
-          <w:sz w:val="24"/>
-          <w:szCs w:val="24"/>
-        </w:rPr>
         <w:t xml:space="preserve">the RS485 master to the </w:t>
       </w:r>
       <w:proofErr w:type="spellStart"/>
@@ -5857,7 +6132,7 @@
         </w:rPr>
       </w:pPr>
     </w:p>
-    <w:bookmarkStart w:id="7" w:name="fine_fiber"/>
+    <w:bookmarkStart w:id="11" w:name="fine_fiber"/>
     <w:p>
       <w:pPr>
         <w:pStyle w:val="HTMLPreformatted"/>
@@ -5907,7 +6182,7 @@
         </w:rPr>
         <w:t>Fine Fiber synchronization</w:t>
       </w:r>
-      <w:bookmarkEnd w:id="7"/>
+      <w:bookmarkEnd w:id="11"/>
       <w:r>
         <w:rPr>
           <w:rFonts w:asciiTheme="minorHAnsi" w:hAnsiTheme="minorHAnsi" w:cstheme="minorHAnsi"/>
@@ -5964,7 +6239,16 @@
           <w:sz w:val="24"/>
           <w:szCs w:val="24"/>
         </w:rPr>
-        <w:t xml:space="preserve"> level. It sets the 20-bit word encoding of the 0x3CBC character word used to lock the DTC fiber to one of its 20-possible values</w:t>
+        <w:t xml:space="preserve"> level. It sets the 20-bit word encoding of the 0x3CBC character word </w:t>
+      </w:r>
+      <w:r>
+        <w:rPr>
+          <w:rFonts w:asciiTheme="minorHAnsi" w:hAnsiTheme="minorHAnsi" w:cstheme="minorHAnsi"/>
+          <w:sz w:val="24"/>
+          <w:szCs w:val="24"/>
+        </w:rPr>
+        <w:lastRenderedPageBreak/>
+        <w:t>used to lock the DTC fiber to one of its 20-possible values</w:t>
       </w:r>
       <w:r>
         <w:rPr>
@@ -6258,7 +6542,7 @@
         <w:br w:type="page"/>
       </w:r>
     </w:p>
-    <w:bookmarkStart w:id="8" w:name="digi_rw"/>
+    <w:bookmarkStart w:id="12" w:name="digi_rw"/>
     <w:p>
       <w:r>
         <w:lastRenderedPageBreak/>
@@ -6279,7 +6563,7 @@
       <w:r>
         <w:fldChar w:fldCharType="end"/>
       </w:r>
-      <w:bookmarkEnd w:id="8"/>
+      <w:bookmarkEnd w:id="12"/>
       <w:r>
         <w:t xml:space="preserve">: this feature allows to send RD/WR commands </w:t>
       </w:r>
@@ -6519,7 +6803,7 @@
       <w:r>
         <w:t xml:space="preserve">: </w:t>
       </w:r>
-      <w:bookmarkStart w:id="9" w:name="rd_tag"/>
+      <w:bookmarkStart w:id="13" w:name="rd_tag"/>
       <w:r>
         <w:rPr>
           <w:b/>
@@ -6559,7 +6843,7 @@
         </w:rPr>
         <w:t>READ OF EVENT TAG in DIGI</w:t>
       </w:r>
-      <w:bookmarkEnd w:id="9"/>
+      <w:bookmarkEnd w:id="13"/>
       <w:r>
         <w:rPr>
           <w:b/>
@@ -7378,7 +7662,7 @@
         </w:rPr>
         <w:t xml:space="preserve"> commands, disable TWI by writing data = 0 to  reg = 6 </w:t>
       </w:r>
-      <w:bookmarkStart w:id="10" w:name="disables"/>
+      <w:bookmarkStart w:id="14" w:name="disables"/>
     </w:p>
     <w:p>
       <w:pPr>
@@ -8093,7 +8377,7 @@
           </w:rPr>
           <w:t>Disabled features:</w:t>
         </w:r>
-        <w:bookmarkEnd w:id="10"/>
+        <w:bookmarkEnd w:id="14"/>
       </w:hyperlink>
     </w:p>
     <w:p>
@@ -8103,7 +8387,7 @@
         </w:rPr>
       </w:pPr>
     </w:p>
-    <w:bookmarkStart w:id="11" w:name="error_counter"/>
+    <w:bookmarkStart w:id="15" w:name="error_counter"/>
     <w:p>
       <w:pPr>
         <w:pStyle w:val="ListParagraph"/>
@@ -8174,7 +8458,7 @@
         </w:rPr>
         <w:t>Error counters read</w:t>
       </w:r>
-      <w:bookmarkEnd w:id="11"/>
+      <w:bookmarkEnd w:id="15"/>
       <w:r>
         <w:rPr>
           <w:b/>
@@ -8565,7 +8849,7 @@
         </w:rPr>
       </w:pPr>
     </w:p>
-    <w:bookmarkStart w:id="12" w:name="DIGI_sim"/>
+    <w:bookmarkStart w:id="16" w:name="DIGI_sim"/>
     <w:p>
       <w:pPr>
         <w:pStyle w:val="ListParagraph"/>
@@ -8648,7 +8932,7 @@
         <w:fldChar w:fldCharType="end"/>
       </w:r>
     </w:p>
-    <w:bookmarkEnd w:id="12"/>
+    <w:bookmarkEnd w:id="16"/>
     <w:p>
       <w:pPr>
         <w:rPr>
@@ -8827,8 +9111,8 @@
         <w:br w:type="page"/>
       </w:r>
     </w:p>
-    <w:bookmarkStart w:id="13" w:name="old"/>
-    <w:bookmarkStart w:id="14" w:name="newrun"/>
+    <w:bookmarkStart w:id="17" w:name="old"/>
+    <w:bookmarkStart w:id="18" w:name="newrun"/>
     <w:p>
       <w:pPr>
         <w:rPr>
@@ -8889,7 +9173,7 @@
         <w:fldChar w:fldCharType="end"/>
       </w:r>
     </w:p>
-    <w:bookmarkEnd w:id="13"/>
+    <w:bookmarkEnd w:id="17"/>
     <w:p>
       <w:pPr>
         <w:rPr>
@@ -8916,7 +9200,7 @@
           </w:rPr>
           <w:t>concept and HALTRUN_EN option</w:t>
         </w:r>
-        <w:bookmarkEnd w:id="14"/>
+        <w:bookmarkEnd w:id="18"/>
       </w:hyperlink>
       <w:r>
         <w:rPr>
@@ -9206,7 +9490,7 @@
         </w:rPr>
       </w:pPr>
     </w:p>
-    <w:bookmarkStart w:id="15" w:name="loopback"/>
+    <w:bookmarkStart w:id="19" w:name="loopback"/>
     <w:p>
       <w:r>
         <w:rPr>
@@ -9255,7 +9539,7 @@
         </w:rPr>
         <w:t>logic</w:t>
       </w:r>
-      <w:bookmarkEnd w:id="15"/>
+      <w:bookmarkEnd w:id="19"/>
       <w:r>
         <w:rPr>
           <w:b/>
@@ -9300,7 +9584,7 @@
       </w:r>
     </w:p>
     <w:p/>
-    <w:bookmarkStart w:id="16" w:name="enables"/>
+    <w:bookmarkStart w:id="20" w:name="enables"/>
     <w:p>
       <w:r>
         <w:lastRenderedPageBreak/>
@@ -9318,7 +9602,7 @@
         </w:rPr>
         <w:t>Clock and Event Window controls via serial vs fiber</w:t>
       </w:r>
-      <w:bookmarkEnd w:id="16"/>
+      <w:bookmarkEnd w:id="20"/>
       <w:r>
         <w:fldChar w:fldCharType="end"/>
       </w:r>
@@ -9406,7 +9690,7 @@
                     <pic:cNvPicPr/>
                   </pic:nvPicPr>
                   <pic:blipFill>
-                    <a:blip r:embed="rId5"/>
+                    <a:blip r:embed="rId6"/>
                     <a:stretch>
                       <a:fillRect/>
                     </a:stretch>
@@ -9437,7 +9721,7 @@
       </w:pPr>
     </w:p>
     <w:p>
-      <w:bookmarkStart w:id="17" w:name="appendixA"/>
+      <w:bookmarkStart w:id="21" w:name="appendixA"/>
       <w:r>
         <w:t>At power up, by default</w:t>
       </w:r>
@@ -9618,7 +9902,7 @@
         </w:r>
       </w:hyperlink>
     </w:p>
-    <w:bookmarkEnd w:id="17"/>
+    <w:bookmarkEnd w:id="21"/>
     <w:p>
       <w:pPr>
         <w:rPr>
@@ -12488,6 +12772,95 @@
     </w:lvl>
   </w:abstractNum>
   <w:abstractNum w:abstractNumId="8" w15:restartNumberingAfterBreak="0">
+    <w:nsid w:val="14B63D6E"/>
+    <w:multiLevelType w:val="hybridMultilevel"/>
+    <w:tmpl w:val="673ABAC6"/>
+    <w:lvl w:ilvl="0" w:tplc="04090011">
+      <w:start w:val="1"/>
+      <w:numFmt w:val="decimal"/>
+      <w:lvlText w:val="%1)"/>
+      <w:lvlJc w:val="left"/>
+      <w:pPr>
+        <w:ind w:left="720" w:hanging="360"/>
+      </w:pPr>
+      <w:rPr>
+        <w:rFonts w:hint="default"/>
+      </w:rPr>
+    </w:lvl>
+    <w:lvl w:ilvl="1" w:tplc="04090019" w:tentative="1">
+      <w:start w:val="1"/>
+      <w:numFmt w:val="lowerLetter"/>
+      <w:lvlText w:val="%2."/>
+      <w:lvlJc w:val="left"/>
+      <w:pPr>
+        <w:ind w:left="1440" w:hanging="360"/>
+      </w:pPr>
+    </w:lvl>
+    <w:lvl w:ilvl="2" w:tplc="0409001B" w:tentative="1">
+      <w:start w:val="1"/>
+      <w:numFmt w:val="lowerRoman"/>
+      <w:lvlText w:val="%3."/>
+      <w:lvlJc w:val="right"/>
+      <w:pPr>
+        <w:ind w:left="2160" w:hanging="180"/>
+      </w:pPr>
+    </w:lvl>
+    <w:lvl w:ilvl="3" w:tplc="0409000F" w:tentative="1">
+      <w:start w:val="1"/>
+      <w:numFmt w:val="decimal"/>
+      <w:lvlText w:val="%4."/>
+      <w:lvlJc w:val="left"/>
+      <w:pPr>
+        <w:ind w:left="2880" w:hanging="360"/>
+      </w:pPr>
+    </w:lvl>
+    <w:lvl w:ilvl="4" w:tplc="04090019" w:tentative="1">
+      <w:start w:val="1"/>
+      <w:numFmt w:val="lowerLetter"/>
+      <w:lvlText w:val="%5."/>
+      <w:lvlJc w:val="left"/>
+      <w:pPr>
+        <w:ind w:left="3600" w:hanging="360"/>
+      </w:pPr>
+    </w:lvl>
+    <w:lvl w:ilvl="5" w:tplc="0409001B" w:tentative="1">
+      <w:start w:val="1"/>
+      <w:numFmt w:val="lowerRoman"/>
+      <w:lvlText w:val="%6."/>
+      <w:lvlJc w:val="right"/>
+      <w:pPr>
+        <w:ind w:left="4320" w:hanging="180"/>
+      </w:pPr>
+    </w:lvl>
+    <w:lvl w:ilvl="6" w:tplc="0409000F" w:tentative="1">
+      <w:start w:val="1"/>
+      <w:numFmt w:val="decimal"/>
+      <w:lvlText w:val="%7."/>
+      <w:lvlJc w:val="left"/>
+      <w:pPr>
+        <w:ind w:left="5040" w:hanging="360"/>
+      </w:pPr>
+    </w:lvl>
+    <w:lvl w:ilvl="7" w:tplc="04090019" w:tentative="1">
+      <w:start w:val="1"/>
+      <w:numFmt w:val="lowerLetter"/>
+      <w:lvlText w:val="%8."/>
+      <w:lvlJc w:val="left"/>
+      <w:pPr>
+        <w:ind w:left="5760" w:hanging="360"/>
+      </w:pPr>
+    </w:lvl>
+    <w:lvl w:ilvl="8" w:tplc="0409001B" w:tentative="1">
+      <w:start w:val="1"/>
+      <w:numFmt w:val="lowerRoman"/>
+      <w:lvlText w:val="%9."/>
+      <w:lvlJc w:val="right"/>
+      <w:pPr>
+        <w:ind w:left="6480" w:hanging="180"/>
+      </w:pPr>
+    </w:lvl>
+  </w:abstractNum>
+  <w:abstractNum w:abstractNumId="9" w15:restartNumberingAfterBreak="0">
     <w:nsid w:val="1ADA4396"/>
     <w:multiLevelType w:val="hybridMultilevel"/>
     <w:tmpl w:val="396A2468"/>
@@ -12573,7 +12946,7 @@
       </w:pPr>
     </w:lvl>
   </w:abstractNum>
-  <w:abstractNum w:abstractNumId="9" w15:restartNumberingAfterBreak="0">
+  <w:abstractNum w:abstractNumId="10" w15:restartNumberingAfterBreak="0">
     <w:nsid w:val="27594DC3"/>
     <w:multiLevelType w:val="hybridMultilevel"/>
     <w:tmpl w:val="C6203F34"/>
@@ -12685,7 +13058,7 @@
       </w:rPr>
     </w:lvl>
   </w:abstractNum>
-  <w:abstractNum w:abstractNumId="10" w15:restartNumberingAfterBreak="0">
+  <w:abstractNum w:abstractNumId="11" w15:restartNumberingAfterBreak="0">
     <w:nsid w:val="293D5496"/>
     <w:multiLevelType w:val="hybridMultilevel"/>
     <w:tmpl w:val="26B65B06"/>
@@ -12774,7 +13147,7 @@
       </w:pPr>
     </w:lvl>
   </w:abstractNum>
-  <w:abstractNum w:abstractNumId="11" w15:restartNumberingAfterBreak="0">
+  <w:abstractNum w:abstractNumId="12" w15:restartNumberingAfterBreak="0">
     <w:nsid w:val="29EB6799"/>
     <w:multiLevelType w:val="hybridMultilevel"/>
     <w:tmpl w:val="7130A69E"/>
@@ -12862,7 +13235,7 @@
       </w:pPr>
     </w:lvl>
   </w:abstractNum>
-  <w:abstractNum w:abstractNumId="12" w15:restartNumberingAfterBreak="0">
+  <w:abstractNum w:abstractNumId="13" w15:restartNumberingAfterBreak="0">
     <w:nsid w:val="2CE51BD0"/>
     <w:multiLevelType w:val="hybridMultilevel"/>
     <w:tmpl w:val="339E8986"/>
@@ -12950,7 +13323,7 @@
       </w:pPr>
     </w:lvl>
   </w:abstractNum>
-  <w:abstractNum w:abstractNumId="13" w15:restartNumberingAfterBreak="0">
+  <w:abstractNum w:abstractNumId="14" w15:restartNumberingAfterBreak="0">
     <w:nsid w:val="2DA425C3"/>
     <w:multiLevelType w:val="hybridMultilevel"/>
     <w:tmpl w:val="E196EAB2"/>
@@ -13062,7 +13435,7 @@
       </w:rPr>
     </w:lvl>
   </w:abstractNum>
-  <w:abstractNum w:abstractNumId="14" w15:restartNumberingAfterBreak="0">
+  <w:abstractNum w:abstractNumId="15" w15:restartNumberingAfterBreak="0">
     <w:nsid w:val="367C64E3"/>
     <w:multiLevelType w:val="hybridMultilevel"/>
     <w:tmpl w:val="817E4AA6"/>
@@ -13150,7 +13523,7 @@
       </w:pPr>
     </w:lvl>
   </w:abstractNum>
-  <w:abstractNum w:abstractNumId="15" w15:restartNumberingAfterBreak="0">
+  <w:abstractNum w:abstractNumId="16" w15:restartNumberingAfterBreak="0">
     <w:nsid w:val="36CE2FB0"/>
     <w:multiLevelType w:val="hybridMultilevel"/>
     <w:tmpl w:val="C83415FA"/>
@@ -13263,7 +13636,7 @@
       </w:rPr>
     </w:lvl>
   </w:abstractNum>
-  <w:abstractNum w:abstractNumId="16" w15:restartNumberingAfterBreak="0">
+  <w:abstractNum w:abstractNumId="17" w15:restartNumberingAfterBreak="0">
     <w:nsid w:val="3AB565AE"/>
     <w:multiLevelType w:val="hybridMultilevel"/>
     <w:tmpl w:val="2F5A10C2"/>
@@ -13376,7 +13749,7 @@
       </w:rPr>
     </w:lvl>
   </w:abstractNum>
-  <w:abstractNum w:abstractNumId="17" w15:restartNumberingAfterBreak="0">
+  <w:abstractNum w:abstractNumId="18" w15:restartNumberingAfterBreak="0">
     <w:nsid w:val="4A9D219B"/>
     <w:multiLevelType w:val="hybridMultilevel"/>
     <w:tmpl w:val="C240A326"/>
@@ -13464,7 +13837,7 @@
       </w:pPr>
     </w:lvl>
   </w:abstractNum>
-  <w:abstractNum w:abstractNumId="18" w15:restartNumberingAfterBreak="0">
+  <w:abstractNum w:abstractNumId="19" w15:restartNumberingAfterBreak="0">
     <w:nsid w:val="4B5A77E8"/>
     <w:multiLevelType w:val="hybridMultilevel"/>
     <w:tmpl w:val="A3F8CD94"/>
@@ -13577,7 +13950,7 @@
       </w:rPr>
     </w:lvl>
   </w:abstractNum>
-  <w:abstractNum w:abstractNumId="19" w15:restartNumberingAfterBreak="0">
+  <w:abstractNum w:abstractNumId="20" w15:restartNumberingAfterBreak="0">
     <w:nsid w:val="4C4F2F4D"/>
     <w:multiLevelType w:val="hybridMultilevel"/>
     <w:tmpl w:val="A5AC478A"/>
@@ -13690,7 +14063,7 @@
       </w:rPr>
     </w:lvl>
   </w:abstractNum>
-  <w:abstractNum w:abstractNumId="20" w15:restartNumberingAfterBreak="0">
+  <w:abstractNum w:abstractNumId="21" w15:restartNumberingAfterBreak="0">
     <w:nsid w:val="540C25C7"/>
     <w:multiLevelType w:val="hybridMultilevel"/>
     <w:tmpl w:val="A3F095F0"/>
@@ -13804,7 +14177,7 @@
       </w:rPr>
     </w:lvl>
   </w:abstractNum>
-  <w:abstractNum w:abstractNumId="21" w15:restartNumberingAfterBreak="0">
+  <w:abstractNum w:abstractNumId="22" w15:restartNumberingAfterBreak="0">
     <w:nsid w:val="5FCE34E9"/>
     <w:multiLevelType w:val="hybridMultilevel"/>
     <w:tmpl w:val="049C1906"/>
@@ -13893,7 +14266,7 @@
       </w:pPr>
     </w:lvl>
   </w:abstractNum>
-  <w:abstractNum w:abstractNumId="22" w15:restartNumberingAfterBreak="0">
+  <w:abstractNum w:abstractNumId="23" w15:restartNumberingAfterBreak="0">
     <w:nsid w:val="628B45D1"/>
     <w:multiLevelType w:val="hybridMultilevel"/>
     <w:tmpl w:val="EDEE4BC4"/>
@@ -13982,7 +14355,7 @@
       </w:pPr>
     </w:lvl>
   </w:abstractNum>
-  <w:abstractNum w:abstractNumId="23" w15:restartNumberingAfterBreak="0">
+  <w:abstractNum w:abstractNumId="24" w15:restartNumberingAfterBreak="0">
     <w:nsid w:val="6634199D"/>
     <w:multiLevelType w:val="hybridMultilevel"/>
     <w:tmpl w:val="D602CA36"/>
@@ -14071,7 +14444,7 @@
       </w:pPr>
     </w:lvl>
   </w:abstractNum>
-  <w:abstractNum w:abstractNumId="24" w15:restartNumberingAfterBreak="0">
+  <w:abstractNum w:abstractNumId="25" w15:restartNumberingAfterBreak="0">
     <w:nsid w:val="66505083"/>
     <w:multiLevelType w:val="hybridMultilevel"/>
     <w:tmpl w:val="CA14D722"/>
@@ -14184,7 +14557,7 @@
       </w:rPr>
     </w:lvl>
   </w:abstractNum>
-  <w:abstractNum w:abstractNumId="25" w15:restartNumberingAfterBreak="0">
+  <w:abstractNum w:abstractNumId="26" w15:restartNumberingAfterBreak="0">
     <w:nsid w:val="6664574A"/>
     <w:multiLevelType w:val="hybridMultilevel"/>
     <w:tmpl w:val="83909E78"/>
@@ -14297,7 +14670,7 @@
       </w:rPr>
     </w:lvl>
   </w:abstractNum>
-  <w:abstractNum w:abstractNumId="26" w15:restartNumberingAfterBreak="0">
+  <w:abstractNum w:abstractNumId="27" w15:restartNumberingAfterBreak="0">
     <w:nsid w:val="6E115D3F"/>
     <w:multiLevelType w:val="hybridMultilevel"/>
     <w:tmpl w:val="14322474"/>
@@ -14387,7 +14760,7 @@
       </w:pPr>
     </w:lvl>
   </w:abstractNum>
-  <w:abstractNum w:abstractNumId="27" w15:restartNumberingAfterBreak="0">
+  <w:abstractNum w:abstractNumId="28" w15:restartNumberingAfterBreak="0">
     <w:nsid w:val="6F36291D"/>
     <w:multiLevelType w:val="hybridMultilevel"/>
     <w:tmpl w:val="2E6EC0C8"/>
@@ -14476,7 +14849,7 @@
       </w:pPr>
     </w:lvl>
   </w:abstractNum>
-  <w:abstractNum w:abstractNumId="28" w15:restartNumberingAfterBreak="0">
+  <w:abstractNum w:abstractNumId="29" w15:restartNumberingAfterBreak="0">
     <w:nsid w:val="6FA13DA2"/>
     <w:multiLevelType w:val="hybridMultilevel"/>
     <w:tmpl w:val="B85AC27A"/>
@@ -14565,7 +14938,7 @@
       </w:pPr>
     </w:lvl>
   </w:abstractNum>
-  <w:abstractNum w:abstractNumId="29" w15:restartNumberingAfterBreak="0">
+  <w:abstractNum w:abstractNumId="30" w15:restartNumberingAfterBreak="0">
     <w:nsid w:val="75CE1ECE"/>
     <w:multiLevelType w:val="hybridMultilevel"/>
     <w:tmpl w:val="96B662AE"/>
@@ -14655,7 +15028,7 @@
       </w:pPr>
     </w:lvl>
   </w:abstractNum>
-  <w:abstractNum w:abstractNumId="30" w15:restartNumberingAfterBreak="0">
+  <w:abstractNum w:abstractNumId="31" w15:restartNumberingAfterBreak="0">
     <w:nsid w:val="7F7F01B9"/>
     <w:multiLevelType w:val="hybridMultilevel"/>
     <w:tmpl w:val="2BAE419C"/>
@@ -14748,31 +15121,31 @@
     <w:abstractNumId w:val="2"/>
   </w:num>
   <w:num w:numId="2" w16cid:durableId="784275437">
-    <w:abstractNumId w:val="9"/>
+    <w:abstractNumId w:val="10"/>
   </w:num>
   <w:num w:numId="3" w16cid:durableId="1427968202">
     <w:abstractNumId w:val="3"/>
   </w:num>
   <w:num w:numId="4" w16cid:durableId="172839585">
-    <w:abstractNumId w:val="29"/>
+    <w:abstractNumId w:val="30"/>
   </w:num>
   <w:num w:numId="5" w16cid:durableId="1597247222">
-    <w:abstractNumId w:val="15"/>
+    <w:abstractNumId w:val="16"/>
   </w:num>
   <w:num w:numId="6" w16cid:durableId="916599355">
-    <w:abstractNumId w:val="18"/>
+    <w:abstractNumId w:val="19"/>
   </w:num>
   <w:num w:numId="7" w16cid:durableId="522673411">
-    <w:abstractNumId w:val="22"/>
+    <w:abstractNumId w:val="23"/>
   </w:num>
   <w:num w:numId="8" w16cid:durableId="2086564900">
     <w:abstractNumId w:val="7"/>
   </w:num>
   <w:num w:numId="9" w16cid:durableId="927227999">
-    <w:abstractNumId w:val="26"/>
+    <w:abstractNumId w:val="27"/>
   </w:num>
   <w:num w:numId="10" w16cid:durableId="2136942267">
-    <w:abstractNumId w:val="10"/>
+    <w:abstractNumId w:val="11"/>
   </w:num>
   <w:num w:numId="11" w16cid:durableId="611059956">
     <w:abstractNumId w:val="6"/>
@@ -14781,61 +15154,64 @@
     <w:abstractNumId w:val="1"/>
   </w:num>
   <w:num w:numId="13" w16cid:durableId="1258246046">
-    <w:abstractNumId w:val="12"/>
+    <w:abstractNumId w:val="13"/>
   </w:num>
   <w:num w:numId="14" w16cid:durableId="100802674">
-    <w:abstractNumId w:val="21"/>
+    <w:abstractNumId w:val="22"/>
   </w:num>
   <w:num w:numId="15" w16cid:durableId="868032529">
     <w:abstractNumId w:val="0"/>
   </w:num>
   <w:num w:numId="16" w16cid:durableId="1662466892">
-    <w:abstractNumId w:val="17"/>
+    <w:abstractNumId w:val="18"/>
   </w:num>
   <w:num w:numId="17" w16cid:durableId="1495104439">
-    <w:abstractNumId w:val="23"/>
+    <w:abstractNumId w:val="24"/>
   </w:num>
   <w:num w:numId="18" w16cid:durableId="1651402552">
-    <w:abstractNumId w:val="8"/>
+    <w:abstractNumId w:val="9"/>
   </w:num>
   <w:num w:numId="19" w16cid:durableId="796528992">
-    <w:abstractNumId w:val="25"/>
+    <w:abstractNumId w:val="26"/>
   </w:num>
   <w:num w:numId="20" w16cid:durableId="780497310">
     <w:abstractNumId w:val="4"/>
   </w:num>
   <w:num w:numId="21" w16cid:durableId="1215890220">
-    <w:abstractNumId w:val="19"/>
+    <w:abstractNumId w:val="20"/>
   </w:num>
   <w:num w:numId="22" w16cid:durableId="746848990">
-    <w:abstractNumId w:val="14"/>
+    <w:abstractNumId w:val="15"/>
   </w:num>
   <w:num w:numId="23" w16cid:durableId="1222520291">
-    <w:abstractNumId w:val="16"/>
+    <w:abstractNumId w:val="17"/>
   </w:num>
   <w:num w:numId="24" w16cid:durableId="1774939577">
-    <w:abstractNumId w:val="30"/>
+    <w:abstractNumId w:val="31"/>
   </w:num>
   <w:num w:numId="25" w16cid:durableId="488253558">
-    <w:abstractNumId w:val="24"/>
+    <w:abstractNumId w:val="25"/>
   </w:num>
   <w:num w:numId="26" w16cid:durableId="962687944">
-    <w:abstractNumId w:val="11"/>
+    <w:abstractNumId w:val="12"/>
   </w:num>
   <w:num w:numId="27" w16cid:durableId="438765313">
-    <w:abstractNumId w:val="27"/>
+    <w:abstractNumId w:val="28"/>
   </w:num>
   <w:num w:numId="28" w16cid:durableId="1207328661">
     <w:abstractNumId w:val="5"/>
   </w:num>
   <w:num w:numId="29" w16cid:durableId="712195446">
-    <w:abstractNumId w:val="20"/>
+    <w:abstractNumId w:val="21"/>
   </w:num>
   <w:num w:numId="30" w16cid:durableId="587346705">
-    <w:abstractNumId w:val="28"/>
+    <w:abstractNumId w:val="29"/>
   </w:num>
   <w:num w:numId="31" w16cid:durableId="724766738">
-    <w:abstractNumId w:val="13"/>
+    <w:abstractNumId w:val="14"/>
+  </w:num>
+  <w:num w:numId="32" w16cid:durableId="669873037">
+    <w:abstractNumId w:val="8"/>
   </w:num>
 </w:numbering>
 </file>
@@ -15662,4 +16038,16 @@
     </a:ext>
   </a:extLst>
 </a:theme>
+</file>
+
+<file path=customXml/item1.xml><?xml version="1.0" encoding="utf-8"?>
+<b:Sources xmlns:b="http://schemas.openxmlformats.org/officeDocument/2006/bibliography" xmlns="http://schemas.openxmlformats.org/officeDocument/2006/bibliography" SelectedStyle="/APASixthEditionOfficeOnline.xsl" StyleName="APA" Version="6"/>
+</file>
+
+<file path=customXml/itemProps1.xml><?xml version="1.0" encoding="utf-8"?>
+<ds:datastoreItem xmlns:ds="http://schemas.openxmlformats.org/officeDocument/2006/customXml" ds:itemID="{2CCB8268-035B-774E-B31B-FF3F233E91C3}">
+  <ds:schemaRefs>
+    <ds:schemaRef ds:uri="http://schemas.openxmlformats.org/officeDocument/2006/bibliography"/>
+  </ds:schemaRefs>
+</ds:datastoreItem>
 </file>
</xml_diff>